<commit_message>
dodana poglavlja bilinear i najbliyi susjed u rad
</commit_message>
<xml_diff>
--- a/diplomski.docx
+++ b/diplomski.docx
@@ -1932,7 +1932,7 @@
           <w:r>
             <w:fldChar w:fldCharType="separate"/>
           </w:r>
-          <w:hyperlink w:anchor="_Toc83045199" w:history="1">
+          <w:hyperlink w:anchor="_Toc84603839" w:history="1">
             <w:r>
               <w:rPr>
                 <w:rStyle w:val="Hyperlink"/>
@@ -1960,7 +1960,7 @@
                 <w:noProof/>
                 <w:webHidden/>
               </w:rPr>
-              <w:instrText xml:space="preserve"> PAGEREF _Toc83045199 \h </w:instrText>
+              <w:instrText xml:space="preserve"> PAGEREF _Toc84603839 \h </w:instrText>
             </w:r>
             <w:r>
               <w:rPr>
@@ -2004,7 +2004,7 @@
               <w:lang w:val="en-GB" w:eastAsia="en-GB"/>
             </w:rPr>
           </w:pPr>
-          <w:hyperlink w:anchor="_Toc83045200" w:history="1">
+          <w:hyperlink w:anchor="_Toc84603840" w:history="1">
             <w:r>
               <w:rPr>
                 <w:rStyle w:val="Hyperlink"/>
@@ -2032,7 +2032,7 @@
                 <w:noProof/>
                 <w:webHidden/>
               </w:rPr>
-              <w:instrText xml:space="preserve"> PAGEREF _Toc83045200 \h </w:instrText>
+              <w:instrText xml:space="preserve"> PAGEREF _Toc84603840 \h </w:instrText>
             </w:r>
             <w:r>
               <w:rPr>
@@ -2076,7 +2076,7 @@
               <w:lang w:val="en-GB" w:eastAsia="en-GB"/>
             </w:rPr>
           </w:pPr>
-          <w:hyperlink w:anchor="_Toc83045201" w:history="1">
+          <w:hyperlink w:anchor="_Toc84603841" w:history="1">
             <w:r>
               <w:rPr>
                 <w:rStyle w:val="Hyperlink"/>
@@ -2104,7 +2104,7 @@
                 <w:noProof/>
                 <w:webHidden/>
               </w:rPr>
-              <w:instrText xml:space="preserve"> PAGEREF _Toc83045201 \h </w:instrText>
+              <w:instrText xml:space="preserve"> PAGEREF _Toc84603841 \h </w:instrText>
             </w:r>
             <w:r>
               <w:rPr>
@@ -2149,7 +2149,7 @@
               <w:lang w:val="en-GB" w:eastAsia="en-GB"/>
             </w:rPr>
           </w:pPr>
-          <w:hyperlink w:anchor="_Toc83045202" w:history="1">
+          <w:hyperlink w:anchor="_Toc84603842" w:history="1">
             <w:r>
               <w:rPr>
                 <w:rStyle w:val="Hyperlink"/>
@@ -2194,7 +2194,7 @@
                 <w:noProof/>
                 <w:webHidden/>
               </w:rPr>
-              <w:instrText xml:space="preserve"> PAGEREF _Toc83045202 \h </w:instrText>
+              <w:instrText xml:space="preserve"> PAGEREF _Toc84603842 \h </w:instrText>
             </w:r>
             <w:r>
               <w:rPr>
@@ -2239,7 +2239,7 @@
               <w:lang w:val="en-GB" w:eastAsia="en-GB"/>
             </w:rPr>
           </w:pPr>
-          <w:hyperlink w:anchor="_Toc83045203" w:history="1">
+          <w:hyperlink w:anchor="_Toc84603843" w:history="1">
             <w:r>
               <w:rPr>
                 <w:rStyle w:val="Hyperlink"/>
@@ -2284,7 +2284,7 @@
                 <w:noProof/>
                 <w:webHidden/>
               </w:rPr>
-              <w:instrText xml:space="preserve"> PAGEREF _Toc83045203 \h </w:instrText>
+              <w:instrText xml:space="preserve"> PAGEREF _Toc84603843 \h </w:instrText>
             </w:r>
             <w:r>
               <w:rPr>
@@ -2329,7 +2329,7 @@
               <w:lang w:val="en-GB" w:eastAsia="en-GB"/>
             </w:rPr>
           </w:pPr>
-          <w:hyperlink w:anchor="_Toc83045204" w:history="1">
+          <w:hyperlink w:anchor="_Toc84603844" w:history="1">
             <w:r>
               <w:rPr>
                 <w:rStyle w:val="Hyperlink"/>
@@ -2353,7 +2353,7 @@
                 <w:noProof/>
                 <w:lang w:val="sr-Cyrl-RS"/>
               </w:rPr>
-              <w:t>СКАЛИРАЊЕ СЛИКЕ</w:t>
+              <w:t>СКАЛИРАЊЕ</w:t>
             </w:r>
             <w:r>
               <w:rPr>
@@ -2374,7 +2374,7 @@
                 <w:noProof/>
                 <w:webHidden/>
               </w:rPr>
-              <w:instrText xml:space="preserve"> PAGEREF _Toc83045204 \h </w:instrText>
+              <w:instrText xml:space="preserve"> PAGEREF _Toc84603844 \h </w:instrText>
             </w:r>
             <w:r>
               <w:rPr>
@@ -2395,6 +2395,375 @@
                 <w:webHidden/>
               </w:rPr>
               <w:t>8</w:t>
+            </w:r>
+            <w:r>
+              <w:rPr>
+                <w:noProof/>
+                <w:webHidden/>
+              </w:rPr>
+              <w:fldChar w:fldCharType="end"/>
+            </w:r>
+          </w:hyperlink>
+        </w:p>
+        <w:p>
+          <w:pPr>
+            <w:pStyle w:val="TOC2"/>
+            <w:tabs>
+              <w:tab w:val="left" w:pos="880"/>
+              <w:tab w:val="right" w:leader="dot" w:pos="8656"/>
+            </w:tabs>
+            <w:rPr>
+              <w:rFonts w:asciiTheme="minorHAnsi" w:eastAsiaTheme="minorEastAsia" w:hAnsiTheme="minorHAnsi"/>
+              <w:noProof/>
+              <w:sz w:val="22"/>
+              <w:lang w:val="en-GB" w:eastAsia="en-GB"/>
+            </w:rPr>
+          </w:pPr>
+          <w:hyperlink w:anchor="_Toc84603845" w:history="1">
+            <w:r>
+              <w:rPr>
+                <w:rStyle w:val="Hyperlink"/>
+                <w:noProof/>
+                <w:lang w:val="sr-Cyrl-RS"/>
+              </w:rPr>
+              <w:t>3.1</w:t>
+            </w:r>
+            <w:r>
+              <w:rPr>
+                <w:rFonts w:asciiTheme="minorHAnsi" w:eastAsiaTheme="minorEastAsia" w:hAnsiTheme="minorHAnsi"/>
+                <w:noProof/>
+                <w:sz w:val="22"/>
+                <w:lang w:val="en-GB" w:eastAsia="en-GB"/>
+              </w:rPr>
+              <w:tab/>
+            </w:r>
+            <w:r>
+              <w:rPr>
+                <w:rStyle w:val="Hyperlink"/>
+                <w:noProof/>
+                <w:lang w:val="sr-Cyrl-RS"/>
+              </w:rPr>
+              <w:t>Преглед метода за скалирање слике</w:t>
+            </w:r>
+            <w:r>
+              <w:rPr>
+                <w:noProof/>
+                <w:webHidden/>
+              </w:rPr>
+              <w:tab/>
+            </w:r>
+            <w:r>
+              <w:rPr>
+                <w:noProof/>
+                <w:webHidden/>
+              </w:rPr>
+              <w:fldChar w:fldCharType="begin"/>
+            </w:r>
+            <w:r>
+              <w:rPr>
+                <w:noProof/>
+                <w:webHidden/>
+              </w:rPr>
+              <w:instrText xml:space="preserve"> PAGEREF _Toc84603845 \h </w:instrText>
+            </w:r>
+            <w:r>
+              <w:rPr>
+                <w:noProof/>
+                <w:webHidden/>
+              </w:rPr>
+            </w:r>
+            <w:r>
+              <w:rPr>
+                <w:noProof/>
+                <w:webHidden/>
+              </w:rPr>
+              <w:fldChar w:fldCharType="separate"/>
+            </w:r>
+            <w:r>
+              <w:rPr>
+                <w:noProof/>
+                <w:webHidden/>
+              </w:rPr>
+              <w:t>10</w:t>
+            </w:r>
+            <w:r>
+              <w:rPr>
+                <w:noProof/>
+                <w:webHidden/>
+              </w:rPr>
+              <w:fldChar w:fldCharType="end"/>
+            </w:r>
+          </w:hyperlink>
+        </w:p>
+        <w:p>
+          <w:pPr>
+            <w:pStyle w:val="TOC3"/>
+            <w:tabs>
+              <w:tab w:val="left" w:pos="1320"/>
+              <w:tab w:val="right" w:leader="dot" w:pos="8656"/>
+            </w:tabs>
+            <w:rPr>
+              <w:rFonts w:asciiTheme="minorHAnsi" w:eastAsiaTheme="minorEastAsia" w:hAnsiTheme="minorHAnsi"/>
+              <w:noProof/>
+              <w:sz w:val="22"/>
+              <w:lang w:val="en-GB" w:eastAsia="en-GB"/>
+            </w:rPr>
+          </w:pPr>
+          <w:hyperlink w:anchor="_Toc84603846" w:history="1">
+            <w:r>
+              <w:rPr>
+                <w:rStyle w:val="Hyperlink"/>
+                <w:noProof/>
+              </w:rPr>
+              <w:t>3.1.1</w:t>
+            </w:r>
+            <w:r>
+              <w:rPr>
+                <w:rFonts w:asciiTheme="minorHAnsi" w:eastAsiaTheme="minorEastAsia" w:hAnsiTheme="minorHAnsi"/>
+                <w:noProof/>
+                <w:sz w:val="22"/>
+                <w:lang w:val="en-GB" w:eastAsia="en-GB"/>
+              </w:rPr>
+              <w:tab/>
+            </w:r>
+            <w:r>
+              <w:rPr>
+                <w:rStyle w:val="Hyperlink"/>
+                <w:noProof/>
+              </w:rPr>
+              <w:t>особине</w:t>
+            </w:r>
+            <w:r>
+              <w:rPr>
+                <w:noProof/>
+                <w:webHidden/>
+              </w:rPr>
+              <w:tab/>
+            </w:r>
+            <w:r>
+              <w:rPr>
+                <w:noProof/>
+                <w:webHidden/>
+              </w:rPr>
+              <w:fldChar w:fldCharType="begin"/>
+            </w:r>
+            <w:r>
+              <w:rPr>
+                <w:noProof/>
+                <w:webHidden/>
+              </w:rPr>
+              <w:instrText xml:space="preserve"> PAGEREF _Toc84603846 \h </w:instrText>
+            </w:r>
+            <w:r>
+              <w:rPr>
+                <w:noProof/>
+                <w:webHidden/>
+              </w:rPr>
+            </w:r>
+            <w:r>
+              <w:rPr>
+                <w:noProof/>
+                <w:webHidden/>
+              </w:rPr>
+              <w:fldChar w:fldCharType="separate"/>
+            </w:r>
+            <w:r>
+              <w:rPr>
+                <w:noProof/>
+                <w:webHidden/>
+              </w:rPr>
+              <w:t>10</w:t>
+            </w:r>
+            <w:r>
+              <w:rPr>
+                <w:noProof/>
+                <w:webHidden/>
+              </w:rPr>
+              <w:fldChar w:fldCharType="end"/>
+            </w:r>
+          </w:hyperlink>
+        </w:p>
+        <w:p>
+          <w:pPr>
+            <w:pStyle w:val="TOC3"/>
+            <w:tabs>
+              <w:tab w:val="left" w:pos="1320"/>
+              <w:tab w:val="right" w:leader="dot" w:pos="8656"/>
+            </w:tabs>
+            <w:rPr>
+              <w:rFonts w:asciiTheme="minorHAnsi" w:eastAsiaTheme="minorEastAsia" w:hAnsiTheme="minorHAnsi"/>
+              <w:noProof/>
+              <w:sz w:val="22"/>
+              <w:lang w:val="en-GB" w:eastAsia="en-GB"/>
+            </w:rPr>
+          </w:pPr>
+          <w:hyperlink w:anchor="_Toc84603847" w:history="1">
+            <w:r>
+              <w:rPr>
+                <w:rStyle w:val="Hyperlink"/>
+                <w:noProof/>
+              </w:rPr>
+              <w:t>3.1.2</w:t>
+            </w:r>
+            <w:r>
+              <w:rPr>
+                <w:rFonts w:asciiTheme="minorHAnsi" w:eastAsiaTheme="minorEastAsia" w:hAnsiTheme="minorHAnsi"/>
+                <w:noProof/>
+                <w:sz w:val="22"/>
+                <w:lang w:val="en-GB" w:eastAsia="en-GB"/>
+              </w:rPr>
+              <w:tab/>
+            </w:r>
+            <w:r>
+              <w:rPr>
+                <w:rStyle w:val="Hyperlink"/>
+                <w:noProof/>
+              </w:rPr>
+              <w:t xml:space="preserve">најближи сусјед (енг. </w:t>
+            </w:r>
+            <w:r>
+              <w:rPr>
+                <w:rStyle w:val="Hyperlink"/>
+                <w:noProof/>
+                <w:lang w:val="en-GB"/>
+              </w:rPr>
+              <w:t>Nearest Neighbour</w:t>
+            </w:r>
+            <w:r>
+              <w:rPr>
+                <w:rStyle w:val="Hyperlink"/>
+                <w:noProof/>
+              </w:rPr>
+              <w:t>)</w:t>
+            </w:r>
+            <w:r>
+              <w:rPr>
+                <w:noProof/>
+                <w:webHidden/>
+              </w:rPr>
+              <w:tab/>
+            </w:r>
+            <w:r>
+              <w:rPr>
+                <w:noProof/>
+                <w:webHidden/>
+              </w:rPr>
+              <w:fldChar w:fldCharType="begin"/>
+            </w:r>
+            <w:r>
+              <w:rPr>
+                <w:noProof/>
+                <w:webHidden/>
+              </w:rPr>
+              <w:instrText xml:space="preserve"> PAGEREF _Toc84603847 \h </w:instrText>
+            </w:r>
+            <w:r>
+              <w:rPr>
+                <w:noProof/>
+                <w:webHidden/>
+              </w:rPr>
+            </w:r>
+            <w:r>
+              <w:rPr>
+                <w:noProof/>
+                <w:webHidden/>
+              </w:rPr>
+              <w:fldChar w:fldCharType="separate"/>
+            </w:r>
+            <w:r>
+              <w:rPr>
+                <w:noProof/>
+                <w:webHidden/>
+              </w:rPr>
+              <w:t>10</w:t>
+            </w:r>
+            <w:r>
+              <w:rPr>
+                <w:noProof/>
+                <w:webHidden/>
+              </w:rPr>
+              <w:fldChar w:fldCharType="end"/>
+            </w:r>
+          </w:hyperlink>
+        </w:p>
+        <w:p>
+          <w:pPr>
+            <w:pStyle w:val="TOC3"/>
+            <w:tabs>
+              <w:tab w:val="left" w:pos="1320"/>
+              <w:tab w:val="right" w:leader="dot" w:pos="8656"/>
+            </w:tabs>
+            <w:rPr>
+              <w:rFonts w:asciiTheme="minorHAnsi" w:eastAsiaTheme="minorEastAsia" w:hAnsiTheme="minorHAnsi"/>
+              <w:noProof/>
+              <w:sz w:val="22"/>
+              <w:lang w:val="en-GB" w:eastAsia="en-GB"/>
+            </w:rPr>
+          </w:pPr>
+          <w:hyperlink w:anchor="_Toc84603848" w:history="1">
+            <w:r>
+              <w:rPr>
+                <w:rStyle w:val="Hyperlink"/>
+                <w:noProof/>
+              </w:rPr>
+              <w:t>3.1.3</w:t>
+            </w:r>
+            <w:r>
+              <w:rPr>
+                <w:rFonts w:asciiTheme="minorHAnsi" w:eastAsiaTheme="minorEastAsia" w:hAnsiTheme="minorHAnsi"/>
+                <w:noProof/>
+                <w:sz w:val="22"/>
+                <w:lang w:val="en-GB" w:eastAsia="en-GB"/>
+              </w:rPr>
+              <w:tab/>
+            </w:r>
+            <w:r>
+              <w:rPr>
+                <w:rStyle w:val="Hyperlink"/>
+                <w:noProof/>
+              </w:rPr>
+              <w:t>билинеарна интерполација</w:t>
+            </w:r>
+            <w:r>
+              <w:rPr>
+                <w:noProof/>
+                <w:webHidden/>
+              </w:rPr>
+              <w:tab/>
+            </w:r>
+            <w:r>
+              <w:rPr>
+                <w:noProof/>
+                <w:webHidden/>
+              </w:rPr>
+              <w:fldChar w:fldCharType="begin"/>
+            </w:r>
+            <w:r>
+              <w:rPr>
+                <w:noProof/>
+                <w:webHidden/>
+              </w:rPr>
+              <w:instrText xml:space="preserve"> PAGEREF _Toc84603848 \h </w:instrText>
+            </w:r>
+            <w:r>
+              <w:rPr>
+                <w:noProof/>
+                <w:webHidden/>
+              </w:rPr>
+            </w:r>
+            <w:r>
+              <w:rPr>
+                <w:noProof/>
+                <w:webHidden/>
+              </w:rPr>
+              <w:fldChar w:fldCharType="separate"/>
+            </w:r>
+            <w:r>
+              <w:rPr>
+                <w:noProof/>
+                <w:webHidden/>
+              </w:rPr>
+              <w:t>12</w:t>
             </w:r>
             <w:r>
               <w:rPr>
@@ -2419,7 +2788,7 @@
               <w:lang w:val="en-GB" w:eastAsia="en-GB"/>
             </w:rPr>
           </w:pPr>
-          <w:hyperlink w:anchor="_Toc83045205" w:history="1">
+          <w:hyperlink w:anchor="_Toc84603849" w:history="1">
             <w:r>
               <w:rPr>
                 <w:rStyle w:val="Hyperlink"/>
@@ -2464,7 +2833,7 @@
                 <w:noProof/>
                 <w:webHidden/>
               </w:rPr>
-              <w:instrText xml:space="preserve"> PAGEREF _Toc83045205 \h </w:instrText>
+              <w:instrText xml:space="preserve"> PAGEREF _Toc84603849 \h </w:instrText>
             </w:r>
             <w:r>
               <w:rPr>
@@ -2484,7 +2853,7 @@
                 <w:noProof/>
                 <w:webHidden/>
               </w:rPr>
-              <w:t>9</w:t>
+              <w:t>13</w:t>
             </w:r>
             <w:r>
               <w:rPr>
@@ -2509,7 +2878,7 @@
               <w:lang w:val="en-GB" w:eastAsia="en-GB"/>
             </w:rPr>
           </w:pPr>
-          <w:hyperlink w:anchor="_Toc83045206" w:history="1">
+          <w:hyperlink w:anchor="_Toc84603850" w:history="1">
             <w:r>
               <w:rPr>
                 <w:rStyle w:val="Hyperlink"/>
@@ -2584,7 +2953,7 @@
                 <w:noProof/>
                 <w:webHidden/>
               </w:rPr>
-              <w:instrText xml:space="preserve"> PAGEREF _Toc83045206 \h </w:instrText>
+              <w:instrText xml:space="preserve"> PAGEREF _Toc84603850 \h </w:instrText>
             </w:r>
             <w:r>
               <w:rPr>
@@ -2604,7 +2973,7 @@
                 <w:noProof/>
                 <w:webHidden/>
               </w:rPr>
-              <w:t>10</w:t>
+              <w:t>14</w:t>
             </w:r>
             <w:r>
               <w:rPr>
@@ -2629,7 +2998,7 @@
               <w:lang w:val="en-GB" w:eastAsia="en-GB"/>
             </w:rPr>
           </w:pPr>
-          <w:hyperlink w:anchor="_Toc83045207" w:history="1">
+          <w:hyperlink w:anchor="_Toc84603851" w:history="1">
             <w:r>
               <w:rPr>
                 <w:rStyle w:val="Hyperlink"/>
@@ -2674,7 +3043,7 @@
                 <w:noProof/>
                 <w:webHidden/>
               </w:rPr>
-              <w:instrText xml:space="preserve"> PAGEREF _Toc83045207 \h </w:instrText>
+              <w:instrText xml:space="preserve"> PAGEREF _Toc84603851 \h </w:instrText>
             </w:r>
             <w:r>
               <w:rPr>
@@ -2694,7 +3063,7 @@
                 <w:noProof/>
                 <w:webHidden/>
               </w:rPr>
-              <w:t>11</w:t>
+              <w:t>15</w:t>
             </w:r>
             <w:r>
               <w:rPr>
@@ -2719,7 +3088,7 @@
               <w:lang w:val="en-GB" w:eastAsia="en-GB"/>
             </w:rPr>
           </w:pPr>
-          <w:hyperlink w:anchor="_Toc83045208" w:history="1">
+          <w:hyperlink w:anchor="_Toc84603852" w:history="1">
             <w:r>
               <w:rPr>
                 <w:rStyle w:val="Hyperlink"/>
@@ -2764,7 +3133,7 @@
                 <w:noProof/>
                 <w:webHidden/>
               </w:rPr>
-              <w:instrText xml:space="preserve"> PAGEREF _Toc83045208 \h </w:instrText>
+              <w:instrText xml:space="preserve"> PAGEREF _Toc84603852 \h </w:instrText>
             </w:r>
             <w:r>
               <w:rPr>
@@ -2784,7 +3153,7 @@
                 <w:noProof/>
                 <w:webHidden/>
               </w:rPr>
-              <w:t>12</w:t>
+              <w:t>16</w:t>
             </w:r>
             <w:r>
               <w:rPr>
@@ -2809,7 +3178,7 @@
               <w:lang w:val="en-GB" w:eastAsia="en-GB"/>
             </w:rPr>
           </w:pPr>
-          <w:hyperlink w:anchor="_Toc83045209" w:history="1">
+          <w:hyperlink w:anchor="_Toc84603853" w:history="1">
             <w:r>
               <w:rPr>
                 <w:rStyle w:val="Hyperlink"/>
@@ -2854,7 +3223,7 @@
                 <w:noProof/>
                 <w:webHidden/>
               </w:rPr>
-              <w:instrText xml:space="preserve"> PAGEREF _Toc83045209 \h </w:instrText>
+              <w:instrText xml:space="preserve"> PAGEREF _Toc84603853 \h </w:instrText>
             </w:r>
             <w:r>
               <w:rPr>
@@ -2874,7 +3243,7 @@
                 <w:noProof/>
                 <w:webHidden/>
               </w:rPr>
-              <w:t>13</w:t>
+              <w:t>17</w:t>
             </w:r>
             <w:r>
               <w:rPr>
@@ -2967,7 +3336,7 @@
           <w:lang w:val="sr-Cyrl-RS"/>
         </w:rPr>
       </w:pPr>
-      <w:bookmarkStart w:id="24" w:name="_Toc83045199"/>
+      <w:bookmarkStart w:id="24" w:name="_Toc84603839"/>
       <w:r>
         <w:rPr>
           <w:lang w:val="sr-Cyrl-RS"/>
@@ -3288,7 +3657,7 @@
           <w:lang w:val="sr-Cyrl-RS"/>
         </w:rPr>
       </w:pPr>
-      <w:bookmarkStart w:id="25" w:name="_Toc83045200"/>
+      <w:bookmarkStart w:id="25" w:name="_Toc84603840"/>
       <w:r>
         <w:rPr>
           <w:lang w:val="sr-Cyrl-RS"/>
@@ -3332,7 +3701,7 @@
         </w:rPr>
         <w:fldChar w:fldCharType="separate"/>
       </w:r>
-      <w:hyperlink w:anchor="_Toc84527193" w:history="1">
+      <w:hyperlink w:anchor="_Toc84603859" w:history="1">
         <w:r>
           <w:rPr>
             <w:rStyle w:val="Hyperlink"/>
@@ -3359,7 +3728,7 @@
             <w:noProof/>
             <w:webHidden/>
           </w:rPr>
-          <w:instrText xml:space="preserve"> PAGEREF _Toc84527193 \h </w:instrText>
+          <w:instrText xml:space="preserve"> PAGEREF _Toc84603859 \h </w:instrText>
         </w:r>
         <w:r>
           <w:rPr>
@@ -3403,7 +3772,7 @@
           <w:lang w:val="en-GB" w:eastAsia="en-GB"/>
         </w:rPr>
       </w:pPr>
-      <w:hyperlink w:anchor="_Toc84527194" w:history="1">
+      <w:hyperlink w:anchor="_Toc84603860" w:history="1">
         <w:r>
           <w:rPr>
             <w:rStyle w:val="Hyperlink"/>
@@ -3430,7 +3799,7 @@
             <w:noProof/>
             <w:webHidden/>
           </w:rPr>
-          <w:instrText xml:space="preserve"> PAGEREF _Toc84527194 \h </w:instrText>
+          <w:instrText xml:space="preserve"> PAGEREF _Toc84603860 \h </w:instrText>
         </w:r>
         <w:r>
           <w:rPr>
@@ -3474,7 +3843,7 @@
           <w:lang w:val="en-GB" w:eastAsia="en-GB"/>
         </w:rPr>
       </w:pPr>
-      <w:hyperlink w:anchor="_Toc84527195" w:history="1">
+      <w:hyperlink w:anchor="_Toc84603861" w:history="1">
         <w:r>
           <w:rPr>
             <w:rStyle w:val="Hyperlink"/>
@@ -3554,7 +3923,7 @@
             <w:noProof/>
             <w:webHidden/>
           </w:rPr>
-          <w:instrText xml:space="preserve"> PAGEREF _Toc84527195 \h </w:instrText>
+          <w:instrText xml:space="preserve"> PAGEREF _Toc84603861 \h </w:instrText>
         </w:r>
         <w:r>
           <w:rPr>
@@ -3598,7 +3967,7 @@
           <w:lang w:val="en-GB" w:eastAsia="en-GB"/>
         </w:rPr>
       </w:pPr>
-      <w:hyperlink w:anchor="_Toc84527196" w:history="1">
+      <w:hyperlink w:anchor="_Toc84603862" w:history="1">
         <w:r>
           <w:rPr>
             <w:rStyle w:val="Hyperlink"/>
@@ -3633,7 +4002,7 @@
             <w:noProof/>
             <w:webHidden/>
           </w:rPr>
-          <w:instrText xml:space="preserve"> PAGEREF _Toc84527196 \h </w:instrText>
+          <w:instrText xml:space="preserve"> PAGEREF _Toc84603862 \h </w:instrText>
         </w:r>
         <w:r>
           <w:rPr>
@@ -3677,13 +4046,13 @@
           <w:lang w:val="en-GB" w:eastAsia="en-GB"/>
         </w:rPr>
       </w:pPr>
-      <w:hyperlink w:anchor="_Toc84527197" w:history="1">
+      <w:hyperlink w:anchor="_Toc84603863" w:history="1">
         <w:r>
           <w:rPr>
             <w:rStyle w:val="Hyperlink"/>
             <w:noProof/>
           </w:rPr>
-          <w:t>Слика 5</w:t>
+          <w:t>Слика 3.1</w:t>
         </w:r>
         <w:r>
           <w:rPr>
@@ -3691,27 +4060,32 @@
             <w:noProof/>
             <w:lang w:val="sr-Cyrl-RS"/>
           </w:rPr>
-          <w:t xml:space="preserve">: Дигиталне репрезентација сиве слике, преузето са </w:t>
+          <w:t>: Дигиталне репрезентација сиве слике</w:t>
         </w:r>
         <w:r>
           <w:rPr>
             <w:rStyle w:val="Hyperlink"/>
             <w:noProof/>
+            <w:vertAlign w:val="superscript"/>
+            <w:lang w:val="sr-Cyrl-RS"/>
           </w:rPr>
-          <w:t>[</w:t>
+          <w:t xml:space="preserve"> [</w:t>
         </w:r>
         <w:r>
           <w:rPr>
             <w:rStyle w:val="Hyperlink"/>
             <w:noProof/>
-            <w:lang w:val="sr-Cyrl-RS"/>
+            <w:vertAlign w:val="superscript"/>
+            <w:lang w:val="en-GB"/>
           </w:rPr>
-          <w:t>3</w:t>
+          <w:t>4</w:t>
         </w:r>
         <w:r>
           <w:rPr>
             <w:rStyle w:val="Hyperlink"/>
             <w:noProof/>
+            <w:vertAlign w:val="superscript"/>
+            <w:lang w:val="sr-Cyrl-RS"/>
           </w:rPr>
           <w:t>]</w:t>
         </w:r>
@@ -3734,7 +4108,7 @@
             <w:noProof/>
             <w:webHidden/>
           </w:rPr>
-          <w:instrText xml:space="preserve"> PAGEREF _Toc84527197 \h </w:instrText>
+          <w:instrText xml:space="preserve"> PAGEREF _Toc84603863 \h </w:instrText>
         </w:r>
         <w:r>
           <w:rPr>
@@ -3778,13 +4152,13 @@
           <w:lang w:val="en-GB" w:eastAsia="en-GB"/>
         </w:rPr>
       </w:pPr>
-      <w:hyperlink w:anchor="_Toc84527198" w:history="1">
+      <w:hyperlink w:anchor="_Toc84603864" w:history="1">
         <w:r>
           <w:rPr>
             <w:rStyle w:val="Hyperlink"/>
             <w:noProof/>
           </w:rPr>
-          <w:t xml:space="preserve">Слика 6: </w:t>
+          <w:t xml:space="preserve">Слика 3.2: </w:t>
         </w:r>
         <w:r>
           <w:rPr>
@@ -3813,7 +4187,7 @@
             <w:noProof/>
             <w:webHidden/>
           </w:rPr>
-          <w:instrText xml:space="preserve"> PAGEREF _Toc84527198 \h </w:instrText>
+          <w:instrText xml:space="preserve"> PAGEREF _Toc84603864 \h </w:instrText>
         </w:r>
         <w:r>
           <w:rPr>
@@ -3857,13 +4231,13 @@
           <w:lang w:val="en-GB" w:eastAsia="en-GB"/>
         </w:rPr>
       </w:pPr>
-      <w:hyperlink w:anchor="_Toc84527199" w:history="1">
+      <w:hyperlink w:anchor="_Toc84603865" w:history="1">
         <w:r>
           <w:rPr>
             <w:rStyle w:val="Hyperlink"/>
             <w:noProof/>
           </w:rPr>
-          <w:t>Слика 7</w:t>
+          <w:t>Слика 3.3</w:t>
         </w:r>
         <w:r>
           <w:rPr>
@@ -3892,7 +4266,7 @@
             <w:noProof/>
             <w:webHidden/>
           </w:rPr>
-          <w:instrText xml:space="preserve"> PAGEREF _Toc84527199 \h </w:instrText>
+          <w:instrText xml:space="preserve"> PAGEREF _Toc84603865 \h </w:instrText>
         </w:r>
         <w:r>
           <w:rPr>
@@ -3925,6 +4299,252 @@
     </w:p>
     <w:p>
       <w:pPr>
+        <w:pStyle w:val="TableofFigures"/>
+        <w:tabs>
+          <w:tab w:val="right" w:leader="dot" w:pos="8656"/>
+        </w:tabs>
+        <w:rPr>
+          <w:rFonts w:asciiTheme="minorHAnsi" w:eastAsiaTheme="minorEastAsia" w:hAnsiTheme="minorHAnsi"/>
+          <w:noProof/>
+          <w:sz w:val="22"/>
+          <w:lang w:val="en-GB" w:eastAsia="en-GB"/>
+        </w:rPr>
+      </w:pPr>
+      <w:hyperlink w:anchor="_Toc84603866" w:history="1">
+        <w:r>
+          <w:rPr>
+            <w:rStyle w:val="Hyperlink"/>
+            <w:noProof/>
+            <w:lang w:val="sr-Cyrl-RS"/>
+          </w:rPr>
+          <w:t>Примјеном ове методе, тачки чију вриједност интерполирамо додјељује се вриједност најближе познате сусједне тачке. На дијаграмима испод приказана је апроксимација функције једне промјенљиве кориштењем ове методе (</w:t>
+        </w:r>
+        <w:r>
+          <w:rPr>
+            <w:rStyle w:val="Hyperlink"/>
+            <w:i/>
+            <w:noProof/>
+          </w:rPr>
+          <w:t>Слика 3.4</w:t>
+        </w:r>
+        <w:r>
+          <w:rPr>
+            <w:rStyle w:val="Hyperlink"/>
+            <w:noProof/>
+            <w:lang w:val="sr-Cyrl-RS"/>
+          </w:rPr>
+          <w:t>) и област у којој је свака од познатих тачака најближи сусјед за дводимензионалне сигнале.</w:t>
+        </w:r>
+        <w:r>
+          <w:rPr>
+            <w:noProof/>
+            <w:webHidden/>
+          </w:rPr>
+          <w:tab/>
+        </w:r>
+        <w:r>
+          <w:rPr>
+            <w:noProof/>
+            <w:webHidden/>
+          </w:rPr>
+          <w:fldChar w:fldCharType="begin"/>
+        </w:r>
+        <w:r>
+          <w:rPr>
+            <w:noProof/>
+            <w:webHidden/>
+          </w:rPr>
+          <w:instrText xml:space="preserve"> PAGEREF _Toc84603866 \h </w:instrText>
+        </w:r>
+        <w:r>
+          <w:rPr>
+            <w:noProof/>
+            <w:webHidden/>
+          </w:rPr>
+        </w:r>
+        <w:r>
+          <w:rPr>
+            <w:noProof/>
+            <w:webHidden/>
+          </w:rPr>
+          <w:fldChar w:fldCharType="separate"/>
+        </w:r>
+        <w:r>
+          <w:rPr>
+            <w:noProof/>
+            <w:webHidden/>
+          </w:rPr>
+          <w:t>10</w:t>
+        </w:r>
+        <w:r>
+          <w:rPr>
+            <w:noProof/>
+            <w:webHidden/>
+          </w:rPr>
+          <w:fldChar w:fldCharType="end"/>
+        </w:r>
+      </w:hyperlink>
+    </w:p>
+    <w:p>
+      <w:pPr>
+        <w:pStyle w:val="TableofFigures"/>
+        <w:tabs>
+          <w:tab w:val="right" w:leader="dot" w:pos="8656"/>
+        </w:tabs>
+        <w:rPr>
+          <w:rFonts w:asciiTheme="minorHAnsi" w:eastAsiaTheme="minorEastAsia" w:hAnsiTheme="minorHAnsi"/>
+          <w:noProof/>
+          <w:sz w:val="22"/>
+          <w:lang w:val="en-GB" w:eastAsia="en-GB"/>
+        </w:rPr>
+      </w:pPr>
+      <w:hyperlink w:anchor="_Toc84603867" w:history="1">
+        <w:r>
+          <w:rPr>
+            <w:rStyle w:val="Hyperlink"/>
+            <w:noProof/>
+          </w:rPr>
+          <w:t xml:space="preserve">Слика 3.4: </w:t>
+        </w:r>
+        <w:r>
+          <w:rPr>
+            <w:rStyle w:val="Hyperlink"/>
+            <w:noProof/>
+            <w:lang w:val="sr-Cyrl-RS"/>
+          </w:rPr>
+          <w:t>Апроксимација функције једне промјенљиве методом најближи сусјед</w:t>
+        </w:r>
+        <w:r>
+          <w:rPr>
+            <w:noProof/>
+            <w:webHidden/>
+          </w:rPr>
+          <w:tab/>
+        </w:r>
+        <w:r>
+          <w:rPr>
+            <w:noProof/>
+            <w:webHidden/>
+          </w:rPr>
+          <w:fldChar w:fldCharType="begin"/>
+        </w:r>
+        <w:r>
+          <w:rPr>
+            <w:noProof/>
+            <w:webHidden/>
+          </w:rPr>
+          <w:instrText xml:space="preserve"> PAGEREF _Toc84603867 \h </w:instrText>
+        </w:r>
+        <w:r>
+          <w:rPr>
+            <w:noProof/>
+            <w:webHidden/>
+          </w:rPr>
+        </w:r>
+        <w:r>
+          <w:rPr>
+            <w:noProof/>
+            <w:webHidden/>
+          </w:rPr>
+          <w:fldChar w:fldCharType="separate"/>
+        </w:r>
+        <w:r>
+          <w:rPr>
+            <w:noProof/>
+            <w:webHidden/>
+          </w:rPr>
+          <w:t>11</w:t>
+        </w:r>
+        <w:r>
+          <w:rPr>
+            <w:noProof/>
+            <w:webHidden/>
+          </w:rPr>
+          <w:fldChar w:fldCharType="end"/>
+        </w:r>
+      </w:hyperlink>
+    </w:p>
+    <w:p>
+      <w:pPr>
+        <w:pStyle w:val="TableofFigures"/>
+        <w:tabs>
+          <w:tab w:val="right" w:leader="dot" w:pos="8656"/>
+        </w:tabs>
+        <w:rPr>
+          <w:rFonts w:asciiTheme="minorHAnsi" w:eastAsiaTheme="minorEastAsia" w:hAnsiTheme="minorHAnsi"/>
+          <w:noProof/>
+          <w:sz w:val="22"/>
+          <w:lang w:val="en-GB" w:eastAsia="en-GB"/>
+        </w:rPr>
+      </w:pPr>
+      <w:hyperlink w:anchor="_Toc84603868" w:history="1">
+        <w:r>
+          <w:rPr>
+            <w:rStyle w:val="Hyperlink"/>
+            <w:noProof/>
+          </w:rPr>
+          <w:t>Слика 3.5</w:t>
+        </w:r>
+        <w:r>
+          <w:rPr>
+            <w:rStyle w:val="Hyperlink"/>
+            <w:noProof/>
+            <w:lang w:val="sr-Cyrl-RS"/>
+          </w:rPr>
+          <w:t>:  Интерполација дводимензионалне функције методом најближи сусјед</w:t>
+        </w:r>
+        <w:r>
+          <w:rPr>
+            <w:noProof/>
+            <w:webHidden/>
+          </w:rPr>
+          <w:tab/>
+        </w:r>
+        <w:r>
+          <w:rPr>
+            <w:noProof/>
+            <w:webHidden/>
+          </w:rPr>
+          <w:fldChar w:fldCharType="begin"/>
+        </w:r>
+        <w:r>
+          <w:rPr>
+            <w:noProof/>
+            <w:webHidden/>
+          </w:rPr>
+          <w:instrText xml:space="preserve"> PAGEREF _Toc84603868 \h </w:instrText>
+        </w:r>
+        <w:r>
+          <w:rPr>
+            <w:noProof/>
+            <w:webHidden/>
+          </w:rPr>
+        </w:r>
+        <w:r>
+          <w:rPr>
+            <w:noProof/>
+            <w:webHidden/>
+          </w:rPr>
+          <w:fldChar w:fldCharType="separate"/>
+        </w:r>
+        <w:r>
+          <w:rPr>
+            <w:noProof/>
+            <w:webHidden/>
+          </w:rPr>
+          <w:t>11</w:t>
+        </w:r>
+        <w:r>
+          <w:rPr>
+            <w:noProof/>
+            <w:webHidden/>
+          </w:rPr>
+          <w:fldChar w:fldCharType="end"/>
+        </w:r>
+      </w:hyperlink>
+    </w:p>
+    <w:p>
+      <w:pPr>
         <w:jc w:val="left"/>
         <w:rPr>
           <w:sz w:val="28"/>
@@ -3956,7 +4576,7 @@
           <w:lang w:val="sr-Latn-RS"/>
         </w:rPr>
       </w:pPr>
-      <w:bookmarkStart w:id="26" w:name="_Toc83045201"/>
+      <w:bookmarkStart w:id="26" w:name="_Toc84603841"/>
       <w:r>
         <w:rPr>
           <w:lang w:val="sr-Latn-RS"/>
@@ -4052,7 +4672,7 @@
           <w:lang w:val="sr-Cyrl-RS"/>
         </w:rPr>
       </w:pPr>
-      <w:bookmarkStart w:id="27" w:name="_Toc83045202"/>
+      <w:bookmarkStart w:id="27" w:name="_Toc84603842"/>
       <w:r>
         <w:rPr>
           <w:lang w:val="sr-Cyrl-RS"/>
@@ -4279,7 +4899,7 @@
           <w:lang w:val="sr-Cyrl-RS"/>
         </w:rPr>
       </w:pPr>
-      <w:bookmarkStart w:id="28" w:name="_Toc83045203"/>
+      <w:bookmarkStart w:id="28" w:name="_Toc84603843"/>
       <w:r>
         <w:rPr>
           <w:lang w:val="sr-Cyrl-RS"/>
@@ -4617,6 +5237,9 @@
         <w:t xml:space="preserve">“ </w:t>
       </w:r>
       <w:r>
+        <w:rPr>
+          <w:vertAlign w:val="superscript"/>
+        </w:rPr>
         <w:t>[1]</w:t>
       </w:r>
       <w:r>
@@ -4778,7 +5401,7 @@
         </w:rPr>
         <w:lastRenderedPageBreak/>
         <w:drawing>
-          <wp:inline distT="0" distB="0" distL="0" distR="0" wp14:anchorId="3FC3FBE7" wp14:editId="5CA3B3DE">
+          <wp:inline distT="0" distB="0" distL="0" distR="0" wp14:anchorId="2F544EB8" wp14:editId="505CC335">
             <wp:extent cx="4943475" cy="2895600"/>
             <wp:effectExtent l="0" t="0" r="9525" b="0"/>
             <wp:docPr id="5" name="Picture 5"/>
@@ -4829,7 +5452,7 @@
           <w:sz w:val="24"/>
         </w:rPr>
       </w:pPr>
-      <w:bookmarkStart w:id="30" w:name="_Toc84527193"/>
+      <w:bookmarkStart w:id="30" w:name="_Toc84603859"/>
       <w:proofErr w:type="spellStart"/>
       <w:r>
         <w:rPr>
@@ -5117,7 +5740,7 @@
           <w:lang w:val="en-GB" w:eastAsia="en-GB"/>
         </w:rPr>
         <w:drawing>
-          <wp:inline distT="0" distB="0" distL="0" distR="0" wp14:anchorId="0F383B85" wp14:editId="7B50180F">
+          <wp:inline distT="0" distB="0" distL="0" distR="0" wp14:anchorId="11B9A458" wp14:editId="19E28083">
             <wp:extent cx="5737225" cy="1524000"/>
             <wp:effectExtent l="0" t="0" r="0" b="0"/>
             <wp:docPr id="6" name="Picture 6"/>
@@ -5174,7 +5797,7 @@
           <w:sz w:val="24"/>
         </w:rPr>
       </w:pPr>
-      <w:bookmarkStart w:id="31" w:name="_Toc84527194"/>
+      <w:bookmarkStart w:id="31" w:name="_Toc84603860"/>
       <w:proofErr w:type="spellStart"/>
       <w:r>
         <w:rPr>
@@ -5569,7 +6192,7 @@
           <w:lang w:val="en-GB" w:eastAsia="en-GB"/>
         </w:rPr>
         <w:drawing>
-          <wp:inline distT="0" distB="0" distL="0" distR="0" wp14:anchorId="4AB7E0DF" wp14:editId="0B3ABABC">
+          <wp:inline distT="0" distB="0" distL="0" distR="0" wp14:anchorId="2168F271" wp14:editId="52298C27">
             <wp:extent cx="5729110" cy="1343025"/>
             <wp:effectExtent l="0" t="0" r="0" b="0"/>
             <wp:docPr id="7" name="Picture 7" descr="E:\video_scaler_repo\video_scaler\scaler_v2\doc\stream\user_and_last_is_eof.png"/>
@@ -5628,7 +6251,7 @@
           <w:lang w:val="sr-Cyrl-RS"/>
         </w:rPr>
       </w:pPr>
-      <w:bookmarkStart w:id="32" w:name="_Toc84527195"/>
+      <w:bookmarkStart w:id="32" w:name="_Toc84603861"/>
       <w:proofErr w:type="spellStart"/>
       <w:r>
         <w:rPr>
@@ -6224,7 +6847,7 @@
           <w:lang w:val="en-GB" w:eastAsia="en-GB"/>
         </w:rPr>
         <w:drawing>
-          <wp:inline distT="0" distB="0" distL="0" distR="0" wp14:anchorId="2F892427" wp14:editId="3B3CC136">
+          <wp:inline distT="0" distB="0" distL="0" distR="0" wp14:anchorId="1EF2895D" wp14:editId="598C7C6A">
             <wp:extent cx="4593590" cy="3000375"/>
             <wp:effectExtent l="0" t="0" r="0" b="9525"/>
             <wp:docPr id="8" name="Picture 8"/>
@@ -6269,7 +6892,7 @@
           <w:sz w:val="24"/>
         </w:rPr>
       </w:pPr>
-      <w:bookmarkStart w:id="34" w:name="_Toc84527196"/>
+      <w:bookmarkStart w:id="34" w:name="_Toc84603862"/>
       <w:proofErr w:type="spellStart"/>
       <w:r>
         <w:rPr>
@@ -6482,7 +7105,7 @@
           <w:lang w:val="sr-Cyrl-RS"/>
         </w:rPr>
       </w:pPr>
-      <w:bookmarkStart w:id="35" w:name="_Toc83045204"/>
+      <w:bookmarkStart w:id="35" w:name="_Toc84603844"/>
       <w:r>
         <w:rPr>
           <w:lang w:val="sr-Cyrl-RS"/>
@@ -6534,24 +7157,15 @@
     <w:p>
       <w:pPr>
         <w:ind w:firstLine="432"/>
-      </w:pPr>
-      <w:r>
-        <w:rPr>
-          <w:lang w:val="sr-Cyrl-RS"/>
-        </w:rPr>
-        <w:t>П</w:t>
-      </w:r>
-      <w:r>
-        <w:rPr>
-          <w:lang w:val="sr-Cyrl-RS"/>
-        </w:rPr>
-        <w:t>о природи</w:t>
-      </w:r>
-      <w:r>
-        <w:rPr>
-          <w:lang w:val="sr-Cyrl-RS"/>
-        </w:rPr>
-        <w:t xml:space="preserve">, слика је </w:t>
+        <w:rPr>
+          <w:lang w:val="sr-Cyrl-RS"/>
+        </w:rPr>
+      </w:pPr>
+      <w:r>
+        <w:rPr>
+          <w:lang w:val="sr-Cyrl-RS"/>
+        </w:rPr>
+        <w:t xml:space="preserve">По природи, слика је </w:t>
       </w:r>
       <w:r>
         <w:rPr>
@@ -6569,13 +7183,19 @@
         <w:rPr>
           <w:lang w:val="sr-Cyrl-RS"/>
         </w:rPr>
-        <w:t xml:space="preserve"> и за употребу у д</w:t>
-      </w:r>
-      <w:r>
-        <w:rPr>
-          <w:lang w:val="sr-Cyrl-RS"/>
-        </w:rPr>
-        <w:t xml:space="preserve">игиталним системима потребно је направити </w:t>
+        <w:t xml:space="preserve">, па је </w:t>
+      </w:r>
+      <w:r>
+        <w:rPr>
+          <w:lang w:val="sr-Cyrl-RS"/>
+        </w:rPr>
+        <w:t>за употребу у д</w:t>
+      </w:r>
+      <w:r>
+        <w:rPr>
+          <w:lang w:val="sr-Cyrl-RS"/>
+        </w:rPr>
+        <w:t xml:space="preserve">игиталним системима потребно направити </w:t>
       </w:r>
       <w:r>
         <w:rPr>
@@ -6605,13 +7225,7 @@
         <w:rPr>
           <w:lang w:val="sr-Cyrl-RS"/>
         </w:rPr>
-        <w:t xml:space="preserve">се састоји из коначног броја дигиталних вриједности, </w:t>
-      </w:r>
-      <w:r>
-        <w:rPr>
-          <w:lang w:val="sr-Cyrl-RS"/>
-        </w:rPr>
-        <w:t>тачака</w:t>
+        <w:t>се састоји из коначног броја дигиталних вриједности, тачака</w:t>
       </w:r>
       <w:r>
         <w:rPr>
@@ -6650,7 +7264,7 @@
         <w:rPr>
           <w:lang w:val="sr-Cyrl-RS"/>
         </w:rPr>
-        <w:t>С</w:t>
+        <w:t>У дигиталном домену с</w:t>
       </w:r>
       <w:r>
         <w:rPr>
@@ -6668,19 +7282,7 @@
         <w:rPr>
           <w:lang w:val="sr-Cyrl-RS"/>
         </w:rPr>
-        <w:t xml:space="preserve"> </w:t>
-      </w:r>
-      <w:r>
-        <w:rPr>
-          <w:lang w:val="sr-Cyrl-RS"/>
-        </w:rPr>
-        <w:t xml:space="preserve">у дигиталном домену </w:t>
-      </w:r>
-      <w:r>
-        <w:rPr>
-          <w:lang w:val="sr-Cyrl-RS"/>
-        </w:rPr>
-        <w:t xml:space="preserve">ће бити посматрана као функција двије реалне промјенљиве, </w:t>
+        <w:t xml:space="preserve"> ће бити посматрана као функција двије реалне промјенљиве, </w:t>
       </w:r>
       <w:r>
         <w:rPr>
@@ -6778,7 +7380,7 @@
           <w:lang w:val="en-GB" w:eastAsia="en-GB"/>
         </w:rPr>
         <w:drawing>
-          <wp:inline distT="0" distB="0" distL="0" distR="0" wp14:anchorId="49FFB8D2" wp14:editId="72622661">
+          <wp:inline distT="0" distB="0" distL="0" distR="0" wp14:anchorId="7D8DE138" wp14:editId="47062511">
             <wp:extent cx="5048401" cy="2533650"/>
             <wp:effectExtent l="0" t="0" r="0" b="0"/>
             <wp:docPr id="4" name="Picture 4"/>
@@ -6826,8 +7428,10 @@
         <w:jc w:val="center"/>
         <w:rPr>
           <w:sz w:val="24"/>
-        </w:rPr>
-      </w:pPr>
+          <w:vertAlign w:val="superscript"/>
+        </w:rPr>
+      </w:pPr>
+      <w:bookmarkStart w:id="36" w:name="_Toc84603863"/>
       <w:proofErr w:type="spellStart"/>
       <w:r>
         <w:rPr>
@@ -6915,8 +7519,33 @@
           <w:sz w:val="24"/>
           <w:lang w:val="sr-Cyrl-RS"/>
         </w:rPr>
-        <w:t>: Дигиталне репрезентација сиве слике, преузето са [3]</w:t>
-      </w:r>
+        <w:t>: Дигиталне репрезентација сиве слике</w:t>
+      </w:r>
+      <w:r>
+        <w:rPr>
+          <w:sz w:val="24"/>
+          <w:vertAlign w:val="superscript"/>
+          <w:lang w:val="sr-Cyrl-RS"/>
+        </w:rPr>
+        <w:t xml:space="preserve"> [</w:t>
+      </w:r>
+      <w:r>
+        <w:rPr>
+          <w:sz w:val="24"/>
+          <w:vertAlign w:val="superscript"/>
+          <w:lang w:val="en-GB"/>
+        </w:rPr>
+        <w:t>4</w:t>
+      </w:r>
+      <w:r>
+        <w:rPr>
+          <w:sz w:val="24"/>
+          <w:vertAlign w:val="superscript"/>
+          <w:lang w:val="sr-Cyrl-RS"/>
+        </w:rPr>
+        <w:t>]</w:t>
+      </w:r>
+      <w:bookmarkEnd w:id="36"/>
     </w:p>
     <w:p>
       <w:pPr>
@@ -6939,8 +7568,78 @@
           <w:lang w:val="sr-Cyrl-RS"/>
         </w:rPr>
       </w:pPr>
-      <w:bookmarkStart w:id="36" w:name="_GoBack"/>
-      <w:bookmarkEnd w:id="36"/>
+      <w:r>
+        <w:rPr>
+          <w:lang w:val="sr-Cyrl-RS"/>
+        </w:rPr>
+        <w:t>Дигитална обрада слике огледа се у</w:t>
+      </w:r>
+      <w:r>
+        <w:rPr>
+          <w:lang w:val="sr-Cyrl-RS"/>
+        </w:rPr>
+        <w:t>:</w:t>
+      </w:r>
+    </w:p>
+    <w:p>
+      <w:pPr>
+        <w:pStyle w:val="ListParagraph"/>
+        <w:numPr>
+          <w:ilvl w:val="0"/>
+          <w:numId w:val="10"/>
+        </w:numPr>
+        <w:rPr>
+          <w:lang w:val="sr-Cyrl-RS"/>
+        </w:rPr>
+      </w:pPr>
+      <w:r>
+        <w:rPr>
+          <w:lang w:val="sr-Cyrl-RS"/>
+        </w:rPr>
+        <w:t>мијењању вриједности интензитета тачака слике</w:t>
+      </w:r>
+      <w:r>
+        <w:rPr>
+          <w:lang w:val="sr-Cyrl-RS"/>
+        </w:rPr>
+        <w:t xml:space="preserve"> </w:t>
+      </w:r>
+      <w:r>
+        <w:rPr>
+          <w:lang w:val="sr-Cyrl-RS"/>
+        </w:rPr>
+        <w:t xml:space="preserve">и </w:t>
+      </w:r>
+    </w:p>
+    <w:p>
+      <w:pPr>
+        <w:pStyle w:val="ListParagraph"/>
+        <w:numPr>
+          <w:ilvl w:val="0"/>
+          <w:numId w:val="10"/>
+        </w:numPr>
+        <w:rPr>
+          <w:lang w:val="sr-Cyrl-RS"/>
+        </w:rPr>
+      </w:pPr>
+      <w:r>
+        <w:rPr>
+          <w:lang w:val="sr-Cyrl-RS"/>
+        </w:rPr>
+        <w:t>мијењању просторних односа тачака</w:t>
+      </w:r>
+      <w:r>
+        <w:rPr>
+          <w:lang w:val="sr-Cyrl-RS"/>
+        </w:rPr>
+        <w:t xml:space="preserve"> на слици</w:t>
+      </w:r>
+      <w:r>
+        <w:rPr>
+          <w:lang w:val="sr-Cyrl-RS"/>
+        </w:rPr>
+        <w:t>.</w:t>
+      </w:r>
     </w:p>
     <w:p>
       <w:pPr>
@@ -6953,35 +7652,121 @@
         <w:rPr>
           <w:lang w:val="sr-Cyrl-RS"/>
         </w:rPr>
-        <w:t>Дигитална обрада слике огледа се у мијењању вриједности интензитета тачака слике и мијењању просторних односа тачака.</w:t>
-      </w:r>
-    </w:p>
-    <w:p>
-      <w:pPr>
-        <w:ind w:firstLine="720"/>
-        <w:rPr>
-          <w:lang w:val="sr-Cyrl-RS"/>
-        </w:rPr>
-      </w:pPr>
-      <w:r>
-        <w:rPr>
-          <w:lang w:val="sr-Cyrl-RS"/>
-        </w:rPr>
-        <w:t xml:space="preserve">Скалирање слике потпада под геометријске трансфорамације слике, засноване на промјени просторних односа тачака слике. Резултат скалирања јесте увећана или умањена слика, или у специјалном случају слика истих димензија као и улазна слика на којој се изводи операција скалирања. Скалирање припада групи афиних трансформација које чувају паралелност линија на слици, те се овом операцијом мијењају дужине линија, али се чувају углови измечу њих. </w:t>
-      </w:r>
-    </w:p>
-    <w:p>
-      <w:pPr>
-        <w:ind w:firstLine="720"/>
-        <w:rPr>
-          <w:lang w:val="sr-Cyrl-RS"/>
-        </w:rPr>
-      </w:pPr>
-      <w:r>
-        <w:rPr>
-          <w:lang w:val="sr-Cyrl-RS"/>
-        </w:rPr>
-        <w:t>Геометријске трансформације слике се састоје из двије операције:</w:t>
+        <w:t>Трансформације засноване на промјени просторних односа тачака слике називају се  г</w:t>
+      </w:r>
+      <w:r>
+        <w:rPr>
+          <w:lang w:val="sr-Cyrl-RS"/>
+        </w:rPr>
+        <w:t>еометријск</w:t>
+      </w:r>
+      <w:r>
+        <w:rPr>
+          <w:lang w:val="sr-Cyrl-RS"/>
+        </w:rPr>
+        <w:t>им</w:t>
+      </w:r>
+      <w:r>
+        <w:rPr>
+          <w:lang w:val="sr-Cyrl-RS"/>
+        </w:rPr>
+        <w:t xml:space="preserve"> трансфорамациј</w:t>
+      </w:r>
+      <w:r>
+        <w:rPr>
+          <w:lang w:val="sr-Cyrl-RS"/>
+        </w:rPr>
+        <w:t>ама</w:t>
+      </w:r>
+      <w:r>
+        <w:rPr>
+          <w:lang w:val="sr-Cyrl-RS"/>
+        </w:rPr>
+        <w:t xml:space="preserve">. </w:t>
+      </w:r>
+      <w:r>
+        <w:rPr>
+          <w:lang w:val="sr-Cyrl-RS"/>
+        </w:rPr>
+        <w:t>Овакве трансформације могу се свести на</w:t>
+      </w:r>
+      <w:r>
+        <w:rPr>
+          <w:lang w:val="sr-Cyrl-RS"/>
+        </w:rPr>
+        <w:t xml:space="preserve"> двије </w:t>
+      </w:r>
+      <w:r>
+        <w:rPr>
+          <w:lang w:val="sr-Cyrl-RS"/>
+        </w:rPr>
+        <w:t xml:space="preserve">основне </w:t>
+      </w:r>
+      <w:r>
+        <w:rPr>
+          <w:lang w:val="sr-Cyrl-RS"/>
+        </w:rPr>
+        <w:t>операције:</w:t>
+      </w:r>
+    </w:p>
+    <w:p>
+      <w:pPr>
+        <w:pStyle w:val="ListParagraph"/>
+        <w:numPr>
+          <w:ilvl w:val="0"/>
+          <w:numId w:val="11"/>
+        </w:numPr>
+        <w:rPr>
+          <w:lang w:val="sr-Cyrl-RS"/>
+        </w:rPr>
+      </w:pPr>
+      <w:r>
+        <w:rPr>
+          <w:lang w:val="sr-Cyrl-RS"/>
+        </w:rPr>
+        <w:t>Дводимензионалн</w:t>
+      </w:r>
+      <w:r>
+        <w:rPr>
+          <w:lang w:val="sr-Cyrl-RS"/>
+        </w:rPr>
+        <w:t>у</w:t>
+      </w:r>
+      <w:r>
+        <w:rPr>
+          <w:lang w:val="sr-Cyrl-RS"/>
+        </w:rPr>
+        <w:t xml:space="preserve"> просторн</w:t>
+      </w:r>
+      <w:r>
+        <w:rPr>
+          <w:lang w:val="sr-Cyrl-RS"/>
+        </w:rPr>
+        <w:t>у</w:t>
+      </w:r>
+      <w:r>
+        <w:rPr>
+          <w:lang w:val="sr-Cyrl-RS"/>
+        </w:rPr>
+        <w:t xml:space="preserve"> трансформациј</w:t>
+      </w:r>
+      <w:r>
+        <w:rPr>
+          <w:lang w:val="sr-Cyrl-RS"/>
+        </w:rPr>
+        <w:t>у</w:t>
+      </w:r>
+      <w:r>
+        <w:rPr>
+          <w:lang w:val="sr-Cyrl-RS"/>
+        </w:rPr>
+        <w:t>, која одређује како се тачке помјерају при формирању резултујуће слике</w:t>
+      </w:r>
+      <w:r>
+        <w:rPr>
+          <w:lang w:val="sr-Cyrl-RS"/>
+        </w:rPr>
+        <w:t xml:space="preserve"> и</w:t>
       </w:r>
     </w:p>
     <w:p>
@@ -6999,34 +7784,138 @@
         <w:rPr>
           <w:lang w:val="sr-Cyrl-RS"/>
         </w:rPr>
+        <w:t>Процјен</w:t>
+      </w:r>
+      <w:r>
+        <w:rPr>
+          <w:lang w:val="sr-Cyrl-RS"/>
+        </w:rPr>
+        <w:t>у</w:t>
+      </w:r>
+      <w:r>
+        <w:rPr>
+          <w:lang w:val="sr-Cyrl-RS"/>
+        </w:rPr>
+        <w:t xml:space="preserve"> вриједности свјетлина тачака на резултујућој слици, тзв. интерполациј</w:t>
+      </w:r>
+      <w:r>
+        <w:rPr>
+          <w:lang w:val="sr-Cyrl-RS"/>
+        </w:rPr>
+        <w:t>у</w:t>
+      </w:r>
+      <w:r>
+        <w:rPr>
+          <w:lang w:val="sr-Cyrl-RS"/>
+        </w:rPr>
+        <w:t>.</w:t>
+      </w:r>
+    </w:p>
+    <w:p>
+      <w:pPr>
+        <w:rPr>
+          <w:lang w:val="sr-Cyrl-RS"/>
+        </w:rPr>
+      </w:pPr>
+    </w:p>
+    <w:p>
+      <w:pPr>
+        <w:ind w:firstLine="360"/>
+        <w:rPr>
+          <w:lang w:val="en-GB"/>
+        </w:rPr>
+      </w:pPr>
+      <w:r>
+        <w:rPr>
+          <w:lang w:val="sr-Cyrl-RS"/>
+        </w:rPr>
         <w:lastRenderedPageBreak/>
-        <w:t>Дводимензионалне просторне трансформације, која одређује како се тачке помјерају при формирању резултујуће слике</w:t>
-      </w:r>
-    </w:p>
-    <w:p>
-      <w:pPr>
-        <w:pStyle w:val="ListParagraph"/>
-        <w:numPr>
-          <w:ilvl w:val="0"/>
-          <w:numId w:val="9"/>
-        </w:numPr>
-        <w:rPr>
-          <w:lang w:val="sr-Cyrl-RS"/>
-        </w:rPr>
-      </w:pPr>
-      <w:r>
-        <w:rPr>
-          <w:lang w:val="sr-Cyrl-RS"/>
-        </w:rPr>
-        <w:t>Процјене вриједности свјетлина тачака на резултујућој слици, тзв. интерполације.</w:t>
-      </w:r>
-    </w:p>
-    <w:p>
-      <w:pPr>
-        <w:rPr>
-          <w:lang w:val="sr-Cyrl-RS"/>
-        </w:rPr>
-      </w:pPr>
+        <w:t>Скалирање слике потпада под геометријске трансформације</w:t>
+      </w:r>
+      <w:r>
+        <w:rPr>
+          <w:lang w:val="sr-Cyrl-RS"/>
+        </w:rPr>
+        <w:t>.</w:t>
+      </w:r>
+      <w:r>
+        <w:rPr>
+          <w:lang w:val="sr-Cyrl-RS"/>
+        </w:rPr>
+        <w:t xml:space="preserve"> </w:t>
+      </w:r>
+      <w:r>
+        <w:rPr>
+          <w:lang w:val="sr-Cyrl-RS"/>
+        </w:rPr>
+        <w:t>Р</w:t>
+      </w:r>
+      <w:r>
+        <w:rPr>
+          <w:lang w:val="sr-Cyrl-RS"/>
+        </w:rPr>
+        <w:t xml:space="preserve">езултат </w:t>
+      </w:r>
+      <w:r>
+        <w:rPr>
+          <w:lang w:val="sr-Cyrl-RS"/>
+        </w:rPr>
+        <w:t xml:space="preserve">операције </w:t>
+      </w:r>
+      <w:r>
+        <w:rPr>
+          <w:lang w:val="sr-Cyrl-RS"/>
+        </w:rPr>
+        <w:t>скалирања јесте увећана или умањена слика, или у специјалном случају слика истих димензија као и улазна.</w:t>
+      </w:r>
+      <w:r>
+        <w:rPr>
+          <w:lang w:val="sr-Cyrl-RS"/>
+        </w:rPr>
+        <w:t xml:space="preserve"> Примјеном </w:t>
+      </w:r>
+      <w:r>
+        <w:rPr>
+          <w:lang w:val="sr-Cyrl-RS"/>
+        </w:rPr>
+        <w:t xml:space="preserve">операције </w:t>
+      </w:r>
+      <w:r>
+        <w:rPr>
+          <w:lang w:val="sr-Cyrl-RS"/>
+        </w:rPr>
+        <w:t>скалирања на слику мијењају се дужине линија на слици, али се чува</w:t>
+      </w:r>
+      <w:r>
+        <w:rPr>
+          <w:lang w:val="sr-Cyrl-RS"/>
+        </w:rPr>
+        <w:t xml:space="preserve"> њихова</w:t>
+      </w:r>
+      <w:r>
+        <w:rPr>
+          <w:lang w:val="sr-Cyrl-RS"/>
+        </w:rPr>
+        <w:t xml:space="preserve"> паралелност и углови између њих</w:t>
+      </w:r>
+      <w:r>
+        <w:rPr>
+          <w:lang w:val="sr-Cyrl-RS"/>
+        </w:rPr>
+        <w:t xml:space="preserve">. Због ове особине скалирање спада у специјалну групу геометријских трансформација, </w:t>
+      </w:r>
+      <w:r>
+        <w:rPr>
+          <w:lang w:val="sr-Cyrl-RS"/>
+        </w:rPr>
+        <w:t xml:space="preserve">тзв. </w:t>
+      </w:r>
+      <w:r>
+        <w:rPr>
+          <w:lang w:val="sr-Cyrl-RS"/>
+        </w:rPr>
+        <w:t>афине трансформације.</w:t>
+      </w:r>
     </w:p>
     <w:p>
       <w:pPr>
@@ -7039,19 +7928,13 @@
         <w:rPr>
           <w:lang w:val="sr-Cyrl-RS"/>
         </w:rPr>
-        <w:t xml:space="preserve">Скалирање можемо посматрати и као </w:t>
-      </w:r>
-      <w:r>
-        <w:rPr>
-          <w:lang w:val="sr-Cyrl-RS"/>
-        </w:rPr>
-        <w:t xml:space="preserve">просторну </w:t>
-      </w:r>
-      <w:r>
-        <w:rPr>
-          <w:lang w:val="sr-Cyrl-RS"/>
-        </w:rPr>
-        <w:t xml:space="preserve">трансформацију слике. Ако усвојимо следеће ознаке: </w:t>
+        <w:t>Скалирање, као геометријска трансформација, може се свести на одређивање положаја тачака приликом трансформације и на интерполацију њиховог интензитета</w:t>
+      </w:r>
+      <w:r>
+        <w:rPr>
+          <w:lang w:val="sr-Cyrl-RS"/>
+        </w:rPr>
+        <w:t xml:space="preserve">. Ако усвојимо следеће ознаке: </w:t>
       </w:r>
     </w:p>
     <w:p>
@@ -7517,7 +8400,7 @@
           <w:lang w:val="en-GB" w:eastAsia="en-GB"/>
         </w:rPr>
         <w:drawing>
-          <wp:inline distT="0" distB="0" distL="0" distR="0" wp14:anchorId="3458A388" wp14:editId="47867491">
+          <wp:inline distT="0" distB="0" distL="0" distR="0" wp14:anchorId="51C8E39A" wp14:editId="22D07066">
             <wp:extent cx="4410075" cy="2152649"/>
             <wp:effectExtent l="0" t="0" r="0" b="635"/>
             <wp:docPr id="9" name="Picture 9"/>
@@ -7574,7 +8457,7 @@
           <w:lang w:val="en-GB"/>
         </w:rPr>
       </w:pPr>
-      <w:bookmarkStart w:id="37" w:name="_Toc84527198"/>
+      <w:bookmarkStart w:id="37" w:name="_Toc84603864"/>
       <w:proofErr w:type="spellStart"/>
       <w:r>
         <w:rPr>
@@ -7683,7 +8566,34 @@
         <w:rPr>
           <w:lang w:val="sr-Cyrl-RS"/>
         </w:rPr>
-        <w:t>Како координате тачака треба да буду цијели бројеви, док се наведеним једначинама не могу увијек добити цијели бројеви (тачке оригиналне слике се пресликавају између тачака резултантне слике, тј. вриједност улазне тачке утиче на више тачака резултујуће слике, па би се коначна вриједност интензитета сваке од тачака добијала интерполацијом), а и узимајући у обзир чињеницу да се неке тачке могу пресликавати и ван оквира излазне слике, овакво пресликавање може се сматрати неефикасним.</w:t>
+        <w:t xml:space="preserve">Како координате тачака треба да буду цијели бројеви, док се наведеним једначинама не могу увијек добити цијели бројеви (тачке оригиналне слике се пресликавају између тачака резултантне слике, тј. вриједност улазне тачке утиче на више тачака резултујуће слике, па би се коначна вриједност интензитета сваке од тачака добијала интерполацијом), а и узимајући у обзир чињеницу да се неке тачке могу </w:t>
+      </w:r>
+      <w:r>
+        <w:rPr>
+          <w:lang w:val="sr-Cyrl-RS"/>
+        </w:rPr>
+        <w:lastRenderedPageBreak/>
+        <w:t>пресликавати и ван оквира излазне слике, овакво пресликавање може се сматрати неефикасним</w:t>
+      </w:r>
+      <w:r>
+        <w:rPr>
+          <w:vertAlign w:val="superscript"/>
+          <w:lang w:val="sr-Cyrl-RS"/>
+        </w:rPr>
+        <w:t xml:space="preserve"> </w:t>
+      </w:r>
+      <w:r>
+        <w:rPr>
+          <w:vertAlign w:val="superscript"/>
+          <w:lang w:val="en-GB"/>
+        </w:rPr>
+        <w:t>[3]</w:t>
+      </w:r>
+      <w:r>
+        <w:rPr>
+          <w:lang w:val="sr-Cyrl-RS"/>
+        </w:rPr>
+        <w:t>.</w:t>
       </w:r>
     </w:p>
     <w:p>
@@ -7697,8 +8607,49 @@
         <w:rPr>
           <w:lang w:val="sr-Cyrl-RS"/>
         </w:rPr>
-        <w:lastRenderedPageBreak/>
-        <w:t>Ефикаснији метод би био тзв. пресликавање уназад, гдје бисмо за сваку тачку резултујуће слике израчунавали координате њеног оригинала. Да би ово било могуће потребно је познавати инверзну трансформацију поменуте трансформације Т. Сада би важило:</w:t>
+        <w:t>Ефикаснији метод би био тзв. пресликавање уназад, гдје би</w:t>
+      </w:r>
+      <w:r>
+        <w:rPr>
+          <w:lang w:val="en-GB"/>
+        </w:rPr>
+        <w:t xml:space="preserve"> </w:t>
+      </w:r>
+      <w:r>
+        <w:rPr>
+          <w:lang w:val="sr-Cyrl-RS"/>
+        </w:rPr>
+        <w:t>се</w:t>
+      </w:r>
+      <w:r>
+        <w:rPr>
+          <w:lang w:val="sr-Cyrl-RS"/>
+        </w:rPr>
+        <w:t xml:space="preserve"> за сваку тачку резултујуће слике израчунавал</w:t>
+      </w:r>
+      <w:r>
+        <w:rPr>
+          <w:lang w:val="sr-Cyrl-RS"/>
+        </w:rPr>
+        <w:t>е</w:t>
+      </w:r>
+      <w:r>
+        <w:rPr>
+          <w:lang w:val="sr-Cyrl-RS"/>
+        </w:rPr>
+        <w:t xml:space="preserve"> координате њеног оригинала. Да би ово било могуће потребно је познавати инверзну трансформацију поменуте трансформације Т</w:t>
+      </w:r>
+      <w:r>
+        <w:rPr>
+          <w:lang w:val="sr-Cyrl-RS"/>
+        </w:rPr>
+        <w:t xml:space="preserve">, гдје би </w:t>
+      </w:r>
+      <w:r>
+        <w:rPr>
+          <w:lang w:val="sr-Cyrl-RS"/>
+        </w:rPr>
+        <w:t>важило:</w:t>
       </w:r>
     </w:p>
     <w:p>
@@ -7711,14 +8662,7 @@
             <w:rFonts w:ascii="Cambria Math" w:hAnsi="Cambria Math"/>
             <w:lang w:val="sr-Cyrl-RS"/>
           </w:rPr>
-          <m:t>f</m:t>
-        </m:r>
-        <m:r>
-          <w:rPr>
-            <w:rFonts w:ascii="Cambria Math" w:hAnsi="Cambria Math"/>
-            <w:lang w:val="sr-Cyrl-RS"/>
-          </w:rPr>
-          <m:t>=</m:t>
+          <m:t>f=</m:t>
         </m:r>
         <m:sSup>
           <m:sSupPr>
@@ -7753,21 +8697,7 @@
             <w:rFonts w:ascii="Cambria Math" w:hAnsi="Cambria Math"/>
             <w:lang w:val="sr-Cyrl-RS"/>
           </w:rPr>
-          <m:t>(</m:t>
-        </m:r>
-        <m:r>
-          <w:rPr>
-            <w:rFonts w:ascii="Cambria Math" w:hAnsi="Cambria Math"/>
-            <w:lang w:val="sr-Cyrl-RS"/>
-          </w:rPr>
-          <m:t>g</m:t>
-        </m:r>
-        <m:r>
-          <w:rPr>
-            <w:rFonts w:ascii="Cambria Math" w:hAnsi="Cambria Math"/>
-            <w:lang w:val="sr-Cyrl-RS"/>
-          </w:rPr>
-          <m:t>)</m:t>
+          <m:t>(g)</m:t>
         </m:r>
       </m:oMath>
       <w:r>
@@ -7819,14 +8749,7 @@
               <w:rFonts w:ascii="Cambria Math" w:hAnsi="Cambria Math"/>
               <w:lang w:val="sr-Cyrl-RS"/>
             </w:rPr>
-            <m:t xml:space="preserve">)=( </m:t>
-          </m:r>
-          <m:r>
-            <w:rPr>
-              <w:rFonts w:ascii="Cambria Math" w:hAnsi="Cambria Math"/>
-              <w:lang w:val="sr-Cyrl-RS"/>
-            </w:rPr>
-            <m:t>u</m:t>
+            <m:t>)=( u</m:t>
           </m:r>
           <m:d>
             <m:dPr>
@@ -7915,14 +8838,7 @@
               <w:rFonts w:ascii="Cambria Math" w:hAnsi="Cambria Math"/>
               <w:lang w:val="sr-Cyrl-RS"/>
             </w:rPr>
-            <m:t xml:space="preserve"> , </m:t>
-          </m:r>
-          <m:r>
-            <w:rPr>
-              <w:rFonts w:ascii="Cambria Math" w:hAnsi="Cambria Math"/>
-              <w:lang w:val="sr-Cyrl-RS"/>
-            </w:rPr>
-            <m:t>v</m:t>
+            <m:t xml:space="preserve"> , v</m:t>
           </m:r>
           <m:d>
             <m:dPr>
@@ -8034,7 +8950,7 @@
           <w:lang w:val="en-GB" w:eastAsia="en-GB"/>
         </w:rPr>
         <w:drawing>
-          <wp:inline distT="0" distB="0" distL="0" distR="0" wp14:anchorId="0C32C88E" wp14:editId="134495F4">
+          <wp:inline distT="0" distB="0" distL="0" distR="0" wp14:anchorId="3174D0A6" wp14:editId="697530BE">
             <wp:extent cx="4467225" cy="2162175"/>
             <wp:effectExtent l="0" t="0" r="9525" b="9525"/>
             <wp:docPr id="10" name="Picture 10" descr="E:\video_scaler_repo\video_scaler\scaler_v2\doc\stream\preslikavanje_unazad.png"/>
@@ -8092,7 +9008,7 @@
           <w:lang w:val="sr-Cyrl-RS"/>
         </w:rPr>
       </w:pPr>
-      <w:bookmarkStart w:id="38" w:name="_Toc84527199"/>
+      <w:bookmarkStart w:id="38" w:name="_Toc84603865"/>
       <w:proofErr w:type="spellStart"/>
       <w:r>
         <w:rPr>
@@ -8202,99 +9118,923 @@
         <w:rPr>
           <w:lang w:val="sr-Cyrl-RS"/>
         </w:rPr>
-        <w:t>Сада се вриједност улазне тачке рачуна интерполацијом вриједности тачака улазне слике. На овај начин свакој тачки резултујуће слике приступа се само једном и не постоји могућност да вријеност неке од њих буде недефинсана.</w:t>
-      </w:r>
-    </w:p>
-    <w:p>
-      <w:pPr>
-        <w:rPr>
-          <w:lang w:val="sr-Cyrl-RS"/>
-        </w:rPr>
-      </w:pPr>
-    </w:p>
-    <w:p>
-      <w:pPr>
-        <w:rPr>
-          <w:lang w:val="sr-Cyrl-RS"/>
-        </w:rPr>
-      </w:pPr>
-    </w:p>
-    <w:p>
-      <w:pPr>
-        <w:rPr>
-          <w:lang w:val="sr-Cyrl-RS"/>
-        </w:rPr>
-      </w:pPr>
-    </w:p>
-    <w:p>
-      <w:pPr>
-        <w:rPr>
-          <w:lang w:val="sr-Cyrl-RS"/>
-        </w:rPr>
-      </w:pPr>
-    </w:p>
-    <w:p>
-      <w:pPr>
-        <w:rPr>
-          <w:lang w:val="sr-Cyrl-RS"/>
-        </w:rPr>
-      </w:pPr>
-    </w:p>
-    <w:p>
-      <w:pPr>
-        <w:rPr>
-          <w:lang w:val="sr-Cyrl-RS"/>
-        </w:rPr>
-      </w:pPr>
-    </w:p>
-    <w:p>
-      <w:pPr>
-        <w:rPr>
-          <w:lang w:val="sr-Cyrl-RS"/>
-        </w:rPr>
-      </w:pPr>
-    </w:p>
-    <w:p>
-      <w:pPr>
-        <w:rPr>
-          <w:lang w:val="sr-Cyrl-RS"/>
-        </w:rPr>
-      </w:pPr>
-    </w:p>
-    <w:p>
-      <w:pPr>
-        <w:rPr>
-          <w:lang w:val="sr-Cyrl-RS"/>
-        </w:rPr>
-      </w:pPr>
-    </w:p>
-    <w:p>
-      <w:pPr>
-        <w:rPr>
-          <w:lang w:val="sr-Cyrl-RS"/>
-        </w:rPr>
-      </w:pPr>
-    </w:p>
-    <w:p>
-      <w:pPr>
-        <w:rPr>
-          <w:lang w:val="sr-Cyrl-RS"/>
-        </w:rPr>
-      </w:pPr>
-    </w:p>
-    <w:p>
-      <w:pPr>
-        <w:rPr>
-          <w:lang w:val="sr-Cyrl-RS"/>
-        </w:rPr>
-      </w:pPr>
-    </w:p>
-    <w:p>
-      <w:pPr>
-        <w:rPr>
-          <w:lang w:val="sr-Cyrl-RS"/>
-        </w:rPr>
-      </w:pPr>
+        <w:t>Сада се вриједност улазне тачке рачуна интерполацијом вриједности тачака улазне слике. На овај начин свакој тачки резултујуће слике приступа се само једном и не постоји могућност да вријеност неке од њих буде недефинсана</w:t>
+      </w:r>
+      <w:r>
+        <w:rPr>
+          <w:vertAlign w:val="superscript"/>
+          <w:lang w:val="en-GB"/>
+        </w:rPr>
+        <w:t>[3]</w:t>
+      </w:r>
+      <w:r>
+        <w:rPr>
+          <w:lang w:val="sr-Cyrl-RS"/>
+        </w:rPr>
+        <w:t>.</w:t>
+      </w:r>
+    </w:p>
+    <w:p>
+      <w:pPr>
+        <w:rPr>
+          <w:lang w:val="sr-Cyrl-RS"/>
+        </w:rPr>
+      </w:pPr>
+    </w:p>
+    <w:p>
+      <w:pPr>
+        <w:pStyle w:val="Heading2"/>
+        <w:rPr>
+          <w:lang w:val="sr-Cyrl-RS"/>
+        </w:rPr>
+      </w:pPr>
+      <w:bookmarkStart w:id="39" w:name="_Toc84603845"/>
+      <w:r>
+        <w:rPr>
+          <w:lang w:val="sr-Cyrl-RS"/>
+        </w:rPr>
+        <w:t>Преглед метода</w:t>
+      </w:r>
+      <w:r>
+        <w:rPr>
+          <w:lang w:val="sr-Cyrl-RS"/>
+        </w:rPr>
+        <w:t xml:space="preserve"> за</w:t>
+      </w:r>
+      <w:r>
+        <w:rPr>
+          <w:lang w:val="sr-Cyrl-RS"/>
+        </w:rPr>
+        <w:t xml:space="preserve"> скалирањ</w:t>
+      </w:r>
+      <w:r>
+        <w:rPr>
+          <w:lang w:val="sr-Cyrl-RS"/>
+        </w:rPr>
+        <w:t>е</w:t>
+      </w:r>
+      <w:r>
+        <w:rPr>
+          <w:lang w:val="sr-Cyrl-RS"/>
+        </w:rPr>
+        <w:t xml:space="preserve"> слике</w:t>
+      </w:r>
+      <w:bookmarkEnd w:id="39"/>
+    </w:p>
+    <w:p>
+      <w:pPr>
+        <w:pStyle w:val="Heading3"/>
+      </w:pPr>
+      <w:bookmarkStart w:id="40" w:name="_Toc84603846"/>
+      <w:r>
+        <w:t>о</w:t>
+      </w:r>
+      <w:r>
+        <w:t>собине</w:t>
+      </w:r>
+      <w:bookmarkEnd w:id="40"/>
+    </w:p>
+    <w:p>
+      <w:pPr>
+        <w:pStyle w:val="ListParagraph"/>
+        <w:numPr>
+          <w:ilvl w:val="0"/>
+          <w:numId w:val="12"/>
+        </w:numPr>
+        <w:rPr>
+          <w:lang w:val="sr-Cyrl-RS"/>
+        </w:rPr>
+      </w:pPr>
+      <w:r>
+        <w:rPr>
+          <w:lang w:val="sr-Cyrl-RS"/>
+        </w:rPr>
+        <w:t>сепаабилност</w:t>
+      </w:r>
+    </w:p>
+    <w:p>
+      <w:pPr>
+        <w:rPr>
+          <w:lang w:val="sr-Cyrl-RS"/>
+        </w:rPr>
+      </w:pPr>
+    </w:p>
+    <w:p>
+      <w:pPr>
+        <w:pStyle w:val="Heading3"/>
+        <w:rPr>
+          <w:lang w:val="en-US"/>
+        </w:rPr>
+      </w:pPr>
+      <w:bookmarkStart w:id="41" w:name="_Toc84603847"/>
+      <w:r>
+        <w:t>н</w:t>
+      </w:r>
+      <w:r>
+        <w:t xml:space="preserve">ајближи сусјед (енг. </w:t>
+      </w:r>
+      <w:r>
+        <w:rPr>
+          <w:lang w:val="en-GB"/>
+        </w:rPr>
+        <w:t>Nearest Neighbour</w:t>
+      </w:r>
+      <w:r>
+        <w:t>)</w:t>
+      </w:r>
+      <w:bookmarkEnd w:id="41"/>
+    </w:p>
+    <w:p>
+      <w:pPr>
+        <w:ind w:left="-90" w:firstLine="720"/>
+        <w:rPr>
+          <w:lang w:val="sr-Cyrl-RS"/>
+        </w:rPr>
+      </w:pPr>
+      <w:bookmarkStart w:id="42" w:name="_Toc84603866"/>
+      <w:r>
+        <w:rPr>
+          <w:lang w:val="sr-Cyrl-RS"/>
+        </w:rPr>
+        <w:t>Примјеном ове методе, тачки чију вриједност интерполирамо додјељује се вриједност најближе познате сусједне тачке</w:t>
+      </w:r>
+      <w:r>
+        <w:rPr>
+          <w:lang w:val="sr-Cyrl-RS"/>
+        </w:rPr>
+        <w:t xml:space="preserve">. На дијаграмима испод приказана је </w:t>
+      </w:r>
+      <w:r>
+        <w:rPr>
+          <w:lang w:val="sr-Cyrl-RS"/>
+        </w:rPr>
+        <w:t>а</w:t>
+      </w:r>
+      <w:r>
+        <w:rPr>
+          <w:lang w:val="sr-Cyrl-RS"/>
+        </w:rPr>
+        <w:t>проксимација функције једне промјенљиве кориштењем ове методе (</w:t>
+      </w:r>
+      <w:proofErr w:type="spellStart"/>
+      <w:r>
+        <w:rPr>
+          <w:i/>
+        </w:rPr>
+        <w:t>Слика</w:t>
+      </w:r>
+      <w:proofErr w:type="spellEnd"/>
+      <w:r>
+        <w:rPr>
+          <w:i/>
+        </w:rPr>
+        <w:t xml:space="preserve"> </w:t>
+      </w:r>
+      <w:r>
+        <w:rPr>
+          <w:i/>
+        </w:rPr>
+        <w:fldChar w:fldCharType="begin"/>
+      </w:r>
+      <w:r>
+        <w:rPr>
+          <w:i/>
+        </w:rPr>
+        <w:instrText xml:space="preserve"> STYLEREF 1 \s </w:instrText>
+      </w:r>
+      <w:r>
+        <w:rPr>
+          <w:i/>
+        </w:rPr>
+        <w:fldChar w:fldCharType="separate"/>
+      </w:r>
+      <w:r>
+        <w:rPr>
+          <w:i/>
+          <w:noProof/>
+        </w:rPr>
+        <w:t>3</w:t>
+      </w:r>
+      <w:r>
+        <w:rPr>
+          <w:i/>
+        </w:rPr>
+        <w:fldChar w:fldCharType="end"/>
+      </w:r>
+      <w:r>
+        <w:rPr>
+          <w:i/>
+        </w:rPr>
+        <w:t>.</w:t>
+      </w:r>
+      <w:r>
+        <w:rPr>
+          <w:i/>
+        </w:rPr>
+        <w:fldChar w:fldCharType="begin"/>
+      </w:r>
+      <w:r>
+        <w:rPr>
+          <w:i/>
+        </w:rPr>
+        <w:instrText xml:space="preserve"> SEQ Слика \* ARABIC \s 1 </w:instrText>
+      </w:r>
+      <w:r>
+        <w:rPr>
+          <w:i/>
+        </w:rPr>
+        <w:fldChar w:fldCharType="separate"/>
+      </w:r>
+      <w:r>
+        <w:rPr>
+          <w:i/>
+          <w:noProof/>
+        </w:rPr>
+        <w:t>4</w:t>
+      </w:r>
+      <w:r>
+        <w:rPr>
+          <w:i/>
+        </w:rPr>
+        <w:fldChar w:fldCharType="end"/>
+      </w:r>
+      <w:r>
+        <w:rPr>
+          <w:lang w:val="sr-Cyrl-RS"/>
+        </w:rPr>
+        <w:t>) и област у којој је свака од познатих тачака најближи сусјед за дводимензионалне сигнале.</w:t>
+      </w:r>
+      <w:bookmarkEnd w:id="42"/>
+    </w:p>
+    <w:p>
+      <w:pPr>
+        <w:ind w:left="-90" w:firstLine="720"/>
+        <w:rPr>
+          <w:lang w:val="sr-Cyrl-RS"/>
+        </w:rPr>
+      </w:pPr>
+      <w:r>
+        <w:rPr>
+          <w:lang w:val="sr-Cyrl-RS"/>
+        </w:rPr>
+        <w:t xml:space="preserve">Ово је алгоритам који је најједноставнији и најлакши за реализацију, јер је након одређивања позиције улазне тачке (пресликавање уназад) потребно наћи најближу </w:t>
+      </w:r>
+      <w:r>
+        <w:rPr>
+          <w:lang w:val="sr-Cyrl-RS"/>
+        </w:rPr>
+        <w:lastRenderedPageBreak/>
+        <w:t xml:space="preserve">познату тачку оригиналне слике, те њену вриједност </w:t>
+      </w:r>
+      <w:r>
+        <w:rPr>
+          <w:lang w:val="sr-Cyrl-RS"/>
+        </w:rPr>
+        <w:t xml:space="preserve">додијелити </w:t>
+      </w:r>
+      <w:r>
+        <w:rPr>
+          <w:lang w:val="sr-Cyrl-RS"/>
+        </w:rPr>
+        <w:t>резултантној тачки. Због тога је наведени алгоритам погодан за рад у реалном времену.</w:t>
+      </w:r>
+    </w:p>
+    <w:p>
+      <w:pPr>
+        <w:ind w:left="-90" w:firstLine="720"/>
+        <w:rPr>
+          <w:lang w:val="sr-Cyrl-RS"/>
+        </w:rPr>
+      </w:pPr>
+      <w:r>
+        <w:rPr>
+          <w:lang w:val="sr-Cyrl-RS"/>
+        </w:rPr>
+        <w:t xml:space="preserve">Међутим, примјена овог алгоритма може знатно нарушити глаткоћу ивица на сликама, па се због тога чешће примјењује за бирање боја текстуре при </w:t>
+      </w:r>
+      <w:r>
+        <w:rPr>
+          <w:lang w:val="sr-Cyrl-RS"/>
+        </w:rPr>
+        <w:t>3</w:t>
+      </w:r>
+      <w:r>
+        <w:rPr>
+          <w:lang w:val="en-GB"/>
+        </w:rPr>
+        <w:t xml:space="preserve">D </w:t>
+      </w:r>
+      <w:r>
+        <w:rPr>
+          <w:lang w:val="sr-Cyrl-RS"/>
+        </w:rPr>
+        <w:t xml:space="preserve">рендеровању </w:t>
+      </w:r>
+      <w:r>
+        <w:rPr>
+          <w:lang w:val="sr-Cyrl-RS"/>
+        </w:rPr>
+        <w:t>у реалном времену.</w:t>
+      </w:r>
+    </w:p>
+    <w:p>
+      <w:pPr>
+        <w:rPr>
+          <w:lang w:val="sr-Cyrl-RS"/>
+        </w:rPr>
+      </w:pPr>
+    </w:p>
+    <w:p>
+      <w:pPr>
+        <w:keepNext/>
+        <w:jc w:val="center"/>
+      </w:pPr>
+      <w:r>
+        <w:rPr>
+          <w:noProof/>
+          <w:lang w:val="en-GB" w:eastAsia="en-GB"/>
+        </w:rPr>
+        <w:drawing>
+          <wp:inline distT="0" distB="0" distL="0" distR="0" wp14:anchorId="4FDBCAF4" wp14:editId="3E05DBFE">
+            <wp:extent cx="2915057" cy="2791215"/>
+            <wp:effectExtent l="0" t="0" r="9525" b="9525"/>
+            <wp:docPr id="3" name="Picture 3"/>
+            <wp:cNvGraphicFramePr>
+              <a:graphicFrameLocks xmlns:a="http://schemas.openxmlformats.org/drawingml/2006/main" noChangeAspect="1"/>
+            </wp:cNvGraphicFramePr>
+            <a:graphic xmlns:a="http://schemas.openxmlformats.org/drawingml/2006/main">
+              <a:graphicData uri="http://schemas.openxmlformats.org/drawingml/2006/picture">
+                <pic:pic xmlns:pic="http://schemas.openxmlformats.org/drawingml/2006/picture">
+                  <pic:nvPicPr>
+                    <pic:cNvPr id="3" name="nearest_neighbour_1D.png"/>
+                    <pic:cNvPicPr/>
+                  </pic:nvPicPr>
+                  <pic:blipFill>
+                    <a:blip r:embed="rId19">
+                      <a:extLst>
+                        <a:ext uri="{28A0092B-C50C-407E-A947-70E740481C1C}">
+                          <a14:useLocalDpi xmlns:a14="http://schemas.microsoft.com/office/drawing/2010/main" val="0"/>
+                        </a:ext>
+                      </a:extLst>
+                    </a:blip>
+                    <a:stretch>
+                      <a:fillRect/>
+                    </a:stretch>
+                  </pic:blipFill>
+                  <pic:spPr>
+                    <a:xfrm>
+                      <a:off x="0" y="0"/>
+                      <a:ext cx="2915057" cy="2791215"/>
+                    </a:xfrm>
+                    <a:prstGeom prst="rect">
+                      <a:avLst/>
+                    </a:prstGeom>
+                  </pic:spPr>
+                </pic:pic>
+              </a:graphicData>
+            </a:graphic>
+          </wp:inline>
+        </w:drawing>
+      </w:r>
+    </w:p>
+    <w:p>
+      <w:pPr>
+        <w:pStyle w:val="Caption"/>
+        <w:jc w:val="center"/>
+        <w:rPr>
+          <w:sz w:val="24"/>
+        </w:rPr>
+      </w:pPr>
+      <w:bookmarkStart w:id="43" w:name="_Toc84603867"/>
+      <w:proofErr w:type="spellStart"/>
+      <w:r>
+        <w:rPr>
+          <w:sz w:val="24"/>
+        </w:rPr>
+        <w:t>Слика</w:t>
+      </w:r>
+      <w:proofErr w:type="spellEnd"/>
+      <w:r>
+        <w:rPr>
+          <w:sz w:val="24"/>
+        </w:rPr>
+        <w:t xml:space="preserve"> </w:t>
+      </w:r>
+      <w:r>
+        <w:rPr>
+          <w:sz w:val="24"/>
+        </w:rPr>
+        <w:fldChar w:fldCharType="begin"/>
+      </w:r>
+      <w:r>
+        <w:rPr>
+          <w:sz w:val="24"/>
+        </w:rPr>
+        <w:instrText xml:space="preserve"> STYLEREF 1 \s </w:instrText>
+      </w:r>
+      <w:r>
+        <w:rPr>
+          <w:sz w:val="24"/>
+        </w:rPr>
+        <w:fldChar w:fldCharType="separate"/>
+      </w:r>
+      <w:r>
+        <w:rPr>
+          <w:noProof/>
+          <w:sz w:val="24"/>
+        </w:rPr>
+        <w:t>3</w:t>
+      </w:r>
+      <w:r>
+        <w:rPr>
+          <w:sz w:val="24"/>
+        </w:rPr>
+        <w:fldChar w:fldCharType="end"/>
+      </w:r>
+      <w:r>
+        <w:rPr>
+          <w:sz w:val="24"/>
+        </w:rPr>
+        <w:t>.</w:t>
+      </w:r>
+      <w:r>
+        <w:rPr>
+          <w:sz w:val="24"/>
+        </w:rPr>
+        <w:fldChar w:fldCharType="begin"/>
+      </w:r>
+      <w:r>
+        <w:rPr>
+          <w:sz w:val="24"/>
+        </w:rPr>
+        <w:instrText xml:space="preserve"> SEQ Слика \* ARABIC \s 1 </w:instrText>
+      </w:r>
+      <w:r>
+        <w:rPr>
+          <w:sz w:val="24"/>
+        </w:rPr>
+        <w:fldChar w:fldCharType="separate"/>
+      </w:r>
+      <w:r>
+        <w:rPr>
+          <w:noProof/>
+          <w:sz w:val="24"/>
+        </w:rPr>
+        <w:t>5</w:t>
+      </w:r>
+      <w:r>
+        <w:rPr>
+          <w:sz w:val="24"/>
+        </w:rPr>
+        <w:fldChar w:fldCharType="end"/>
+      </w:r>
+      <w:r>
+        <w:rPr>
+          <w:sz w:val="24"/>
+        </w:rPr>
+        <w:t xml:space="preserve">: </w:t>
+      </w:r>
+      <w:r>
+        <w:rPr>
+          <w:sz w:val="24"/>
+          <w:lang w:val="sr-Cyrl-RS"/>
+        </w:rPr>
+        <w:t>Апроксимација функције једне промјенљиве методом најближи сусјед</w:t>
+      </w:r>
+      <w:bookmarkEnd w:id="43"/>
+    </w:p>
+    <w:p>
+      <w:pPr>
+        <w:rPr>
+          <w:lang w:val="sr-Cyrl-RS"/>
+        </w:rPr>
+      </w:pPr>
+    </w:p>
+    <w:p>
+      <w:pPr>
+        <w:keepNext/>
+        <w:jc w:val="center"/>
+      </w:pPr>
+      <w:r>
+        <w:rPr>
+          <w:noProof/>
+          <w:lang w:val="en-GB" w:eastAsia="en-GB"/>
+        </w:rPr>
+        <w:drawing>
+          <wp:inline distT="0" distB="0" distL="0" distR="0" wp14:anchorId="01D56197" wp14:editId="720D87D0">
+            <wp:extent cx="2848373" cy="2829320"/>
+            <wp:effectExtent l="0" t="0" r="9525" b="9525"/>
+            <wp:docPr id="11" name="Picture 11"/>
+            <wp:cNvGraphicFramePr>
+              <a:graphicFrameLocks xmlns:a="http://schemas.openxmlformats.org/drawingml/2006/main" noChangeAspect="1"/>
+            </wp:cNvGraphicFramePr>
+            <a:graphic xmlns:a="http://schemas.openxmlformats.org/drawingml/2006/main">
+              <a:graphicData uri="http://schemas.openxmlformats.org/drawingml/2006/picture">
+                <pic:pic xmlns:pic="http://schemas.openxmlformats.org/drawingml/2006/picture">
+                  <pic:nvPicPr>
+                    <pic:cNvPr id="11" name="nearest_neighbour_2D.png"/>
+                    <pic:cNvPicPr/>
+                  </pic:nvPicPr>
+                  <pic:blipFill>
+                    <a:blip r:embed="rId20">
+                      <a:extLst>
+                        <a:ext uri="{28A0092B-C50C-407E-A947-70E740481C1C}">
+                          <a14:useLocalDpi xmlns:a14="http://schemas.microsoft.com/office/drawing/2010/main" val="0"/>
+                        </a:ext>
+                      </a:extLst>
+                    </a:blip>
+                    <a:stretch>
+                      <a:fillRect/>
+                    </a:stretch>
+                  </pic:blipFill>
+                  <pic:spPr>
+                    <a:xfrm>
+                      <a:off x="0" y="0"/>
+                      <a:ext cx="2848373" cy="2829320"/>
+                    </a:xfrm>
+                    <a:prstGeom prst="rect">
+                      <a:avLst/>
+                    </a:prstGeom>
+                  </pic:spPr>
+                </pic:pic>
+              </a:graphicData>
+            </a:graphic>
+          </wp:inline>
+        </w:drawing>
+      </w:r>
+    </w:p>
+    <w:p>
+      <w:pPr>
+        <w:pStyle w:val="Caption"/>
+        <w:jc w:val="center"/>
+        <w:rPr>
+          <w:sz w:val="24"/>
+          <w:lang w:val="sr-Cyrl-RS"/>
+        </w:rPr>
+      </w:pPr>
+      <w:bookmarkStart w:id="44" w:name="_Toc84603868"/>
+      <w:proofErr w:type="spellStart"/>
+      <w:r>
+        <w:rPr>
+          <w:sz w:val="24"/>
+        </w:rPr>
+        <w:t>Слика</w:t>
+      </w:r>
+      <w:proofErr w:type="spellEnd"/>
+      <w:r>
+        <w:rPr>
+          <w:sz w:val="24"/>
+        </w:rPr>
+        <w:t xml:space="preserve"> </w:t>
+      </w:r>
+      <w:r>
+        <w:rPr>
+          <w:sz w:val="24"/>
+        </w:rPr>
+        <w:fldChar w:fldCharType="begin"/>
+      </w:r>
+      <w:r>
+        <w:rPr>
+          <w:sz w:val="24"/>
+        </w:rPr>
+        <w:instrText xml:space="preserve"> STYLEREF 1 \s </w:instrText>
+      </w:r>
+      <w:r>
+        <w:rPr>
+          <w:sz w:val="24"/>
+        </w:rPr>
+        <w:fldChar w:fldCharType="separate"/>
+      </w:r>
+      <w:r>
+        <w:rPr>
+          <w:noProof/>
+          <w:sz w:val="24"/>
+        </w:rPr>
+        <w:t>3</w:t>
+      </w:r>
+      <w:r>
+        <w:rPr>
+          <w:sz w:val="24"/>
+        </w:rPr>
+        <w:fldChar w:fldCharType="end"/>
+      </w:r>
+      <w:r>
+        <w:rPr>
+          <w:sz w:val="24"/>
+        </w:rPr>
+        <w:t>.</w:t>
+      </w:r>
+      <w:r>
+        <w:rPr>
+          <w:sz w:val="24"/>
+        </w:rPr>
+        <w:fldChar w:fldCharType="begin"/>
+      </w:r>
+      <w:r>
+        <w:rPr>
+          <w:sz w:val="24"/>
+        </w:rPr>
+        <w:instrText xml:space="preserve"> SEQ Слика \* ARABIC \s 1 </w:instrText>
+      </w:r>
+      <w:r>
+        <w:rPr>
+          <w:sz w:val="24"/>
+        </w:rPr>
+        <w:fldChar w:fldCharType="separate"/>
+      </w:r>
+      <w:r>
+        <w:rPr>
+          <w:noProof/>
+          <w:sz w:val="24"/>
+        </w:rPr>
+        <w:t>6</w:t>
+      </w:r>
+      <w:r>
+        <w:rPr>
+          <w:sz w:val="24"/>
+        </w:rPr>
+        <w:fldChar w:fldCharType="end"/>
+      </w:r>
+      <w:r>
+        <w:rPr>
+          <w:sz w:val="24"/>
+          <w:lang w:val="sr-Cyrl-RS"/>
+        </w:rPr>
+        <w:t>:  Интерполација дводимензионалне функције методом најближи сусјед</w:t>
+      </w:r>
+      <w:bookmarkEnd w:id="44"/>
+    </w:p>
+    <w:p>
+      <w:pPr>
+        <w:rPr>
+          <w:lang w:val="sr-Cyrl-RS"/>
+        </w:rPr>
+      </w:pPr>
+    </w:p>
+    <w:p/>
+    <w:p>
+      <w:pPr>
+        <w:pStyle w:val="Heading3"/>
+        <w:rPr>
+          <w:lang w:val="en-US"/>
+        </w:rPr>
+      </w:pPr>
+      <w:bookmarkStart w:id="45" w:name="_Toc84603848"/>
+      <w:r>
+        <w:lastRenderedPageBreak/>
+        <w:t>билинеарна</w:t>
+      </w:r>
+      <w:r>
+        <w:t xml:space="preserve"> </w:t>
+      </w:r>
+      <w:r>
+        <w:t>интерполација</w:t>
+      </w:r>
+      <w:bookmarkEnd w:id="45"/>
+    </w:p>
+    <w:p>
+      <w:pPr>
+        <w:rPr>
+          <w:lang w:val="sr-Cyrl-RS"/>
+        </w:rPr>
+      </w:pPr>
+    </w:p>
+    <w:p>
+      <w:pPr>
+        <w:rPr>
+          <w:lang w:val="sr-Cyrl-RS"/>
+        </w:rPr>
+      </w:pPr>
+    </w:p>
+    <w:p>
+      <w:pPr>
+        <w:keepNext/>
+        <w:jc w:val="center"/>
+      </w:pPr>
+      <w:r>
+        <w:rPr>
+          <w:noProof/>
+          <w:lang w:val="en-GB" w:eastAsia="en-GB"/>
+        </w:rPr>
+        <w:drawing>
+          <wp:inline distT="0" distB="0" distL="0" distR="0" wp14:anchorId="71D4BFE6" wp14:editId="09D2D2BE">
+            <wp:extent cx="2915057" cy="2791215"/>
+            <wp:effectExtent l="0" t="0" r="0" b="9525"/>
+            <wp:docPr id="12" name="Picture 12"/>
+            <wp:cNvGraphicFramePr>
+              <a:graphicFrameLocks xmlns:a="http://schemas.openxmlformats.org/drawingml/2006/main" noChangeAspect="1"/>
+            </wp:cNvGraphicFramePr>
+            <a:graphic xmlns:a="http://schemas.openxmlformats.org/drawingml/2006/main">
+              <a:graphicData uri="http://schemas.openxmlformats.org/drawingml/2006/picture">
+                <pic:pic xmlns:pic="http://schemas.openxmlformats.org/drawingml/2006/picture">
+                  <pic:nvPicPr>
+                    <pic:cNvPr id="12" name="BILINEARNA_tr_1d.png"/>
+                    <pic:cNvPicPr/>
+                  </pic:nvPicPr>
+                  <pic:blipFill>
+                    <a:blip r:embed="rId21">
+                      <a:extLst>
+                        <a:ext uri="{28A0092B-C50C-407E-A947-70E740481C1C}">
+                          <a14:useLocalDpi xmlns:a14="http://schemas.microsoft.com/office/drawing/2010/main" val="0"/>
+                        </a:ext>
+                      </a:extLst>
+                    </a:blip>
+                    <a:stretch>
+                      <a:fillRect/>
+                    </a:stretch>
+                  </pic:blipFill>
+                  <pic:spPr>
+                    <a:xfrm>
+                      <a:off x="0" y="0"/>
+                      <a:ext cx="2915057" cy="2791215"/>
+                    </a:xfrm>
+                    <a:prstGeom prst="rect">
+                      <a:avLst/>
+                    </a:prstGeom>
+                  </pic:spPr>
+                </pic:pic>
+              </a:graphicData>
+            </a:graphic>
+          </wp:inline>
+        </w:drawing>
+      </w:r>
+    </w:p>
+    <w:p>
+      <w:pPr>
+        <w:pStyle w:val="Caption"/>
+        <w:jc w:val="center"/>
+        <w:rPr>
+          <w:sz w:val="24"/>
+          <w:lang w:val="sr-Cyrl-RS"/>
+        </w:rPr>
+      </w:pPr>
+      <w:proofErr w:type="spellStart"/>
+      <w:r>
+        <w:rPr>
+          <w:sz w:val="24"/>
+        </w:rPr>
+        <w:t>Слика</w:t>
+      </w:r>
+      <w:proofErr w:type="spellEnd"/>
+      <w:r>
+        <w:rPr>
+          <w:sz w:val="24"/>
+        </w:rPr>
+        <w:t xml:space="preserve"> </w:t>
+      </w:r>
+      <w:r>
+        <w:rPr>
+          <w:sz w:val="24"/>
+        </w:rPr>
+        <w:fldChar w:fldCharType="begin"/>
+      </w:r>
+      <w:r>
+        <w:rPr>
+          <w:sz w:val="24"/>
+        </w:rPr>
+        <w:instrText xml:space="preserve"> STYLEREF 1 \s </w:instrText>
+      </w:r>
+      <w:r>
+        <w:rPr>
+          <w:sz w:val="24"/>
+        </w:rPr>
+        <w:fldChar w:fldCharType="separate"/>
+      </w:r>
+      <w:r>
+        <w:rPr>
+          <w:noProof/>
+          <w:sz w:val="24"/>
+        </w:rPr>
+        <w:t>3</w:t>
+      </w:r>
+      <w:r>
+        <w:rPr>
+          <w:sz w:val="24"/>
+        </w:rPr>
+        <w:fldChar w:fldCharType="end"/>
+      </w:r>
+      <w:r>
+        <w:rPr>
+          <w:sz w:val="24"/>
+        </w:rPr>
+        <w:t>.</w:t>
+      </w:r>
+      <w:r>
+        <w:rPr>
+          <w:sz w:val="24"/>
+        </w:rPr>
+        <w:fldChar w:fldCharType="begin"/>
+      </w:r>
+      <w:r>
+        <w:rPr>
+          <w:sz w:val="24"/>
+        </w:rPr>
+        <w:instrText xml:space="preserve"> SEQ Слика \* ARABIC \s 1 </w:instrText>
+      </w:r>
+      <w:r>
+        <w:rPr>
+          <w:sz w:val="24"/>
+        </w:rPr>
+        <w:fldChar w:fldCharType="separate"/>
+      </w:r>
+      <w:r>
+        <w:rPr>
+          <w:noProof/>
+          <w:sz w:val="24"/>
+        </w:rPr>
+        <w:t>7</w:t>
+      </w:r>
+      <w:r>
+        <w:rPr>
+          <w:sz w:val="24"/>
+        </w:rPr>
+        <w:fldChar w:fldCharType="end"/>
+      </w:r>
+      <w:r>
+        <w:rPr>
+          <w:sz w:val="24"/>
+        </w:rPr>
+        <w:t xml:space="preserve">: </w:t>
+      </w:r>
+      <w:proofErr w:type="spellStart"/>
+      <w:r>
+        <w:rPr>
+          <w:sz w:val="24"/>
+        </w:rPr>
+        <w:t>Апроксимација</w:t>
+      </w:r>
+      <w:proofErr w:type="spellEnd"/>
+      <w:r>
+        <w:rPr>
+          <w:sz w:val="24"/>
+        </w:rPr>
+        <w:t xml:space="preserve"> </w:t>
+      </w:r>
+      <w:proofErr w:type="spellStart"/>
+      <w:r>
+        <w:rPr>
+          <w:sz w:val="24"/>
+        </w:rPr>
+        <w:t>функције</w:t>
+      </w:r>
+      <w:proofErr w:type="spellEnd"/>
+      <w:r>
+        <w:rPr>
+          <w:sz w:val="24"/>
+        </w:rPr>
+        <w:t xml:space="preserve"> </w:t>
+      </w:r>
+      <w:proofErr w:type="spellStart"/>
+      <w:r>
+        <w:rPr>
+          <w:sz w:val="24"/>
+        </w:rPr>
+        <w:t>једне</w:t>
+      </w:r>
+      <w:proofErr w:type="spellEnd"/>
+      <w:r>
+        <w:rPr>
+          <w:sz w:val="24"/>
+        </w:rPr>
+        <w:t xml:space="preserve"> </w:t>
+      </w:r>
+      <w:proofErr w:type="spellStart"/>
+      <w:r>
+        <w:rPr>
+          <w:sz w:val="24"/>
+        </w:rPr>
+        <w:t>промјенљиве</w:t>
+      </w:r>
+      <w:proofErr w:type="spellEnd"/>
+      <w:r>
+        <w:rPr>
+          <w:sz w:val="24"/>
+        </w:rPr>
+        <w:t xml:space="preserve"> </w:t>
+      </w:r>
+      <w:r>
+        <w:rPr>
+          <w:sz w:val="24"/>
+          <w:lang w:val="sr-Cyrl-RS"/>
+        </w:rPr>
+        <w:t>примјеном билинеарне интерполације</w:t>
+      </w:r>
+    </w:p>
+    <w:p>
+      <w:pPr>
+        <w:rPr>
+          <w:lang w:val="sr-Cyrl-RS"/>
+        </w:rPr>
+      </w:pPr>
+    </w:p>
+    <w:p>
+      <w:pPr>
+        <w:rPr>
+          <w:lang w:val="sr-Cyrl-RS"/>
+        </w:rPr>
+      </w:pPr>
+      <w:bookmarkStart w:id="46" w:name="_GoBack"/>
+      <w:bookmarkEnd w:id="46"/>
     </w:p>
     <w:p>
       <w:pPr>
@@ -8339,7 +10079,7 @@
           <w:lang w:val="sr-Cyrl-RS"/>
         </w:rPr>
       </w:pPr>
-      <w:bookmarkStart w:id="39" w:name="_Toc83045205"/>
+      <w:bookmarkStart w:id="47" w:name="_Toc84603849"/>
       <w:r>
         <w:rPr>
           <w:lang w:val="sr-Cyrl-RS"/>
@@ -8347,7 +10087,7 @@
         <w:lastRenderedPageBreak/>
         <w:t>АНАЛИЗА ПРЕДЛОЖЕНОГ АЛГОРИТМА</w:t>
       </w:r>
-      <w:bookmarkEnd w:id="39"/>
+      <w:bookmarkEnd w:id="47"/>
     </w:p>
     <w:p>
       <w:pPr>
@@ -8559,7 +10299,7 @@
           <w:lang w:val="sr-Cyrl-RS"/>
         </w:rPr>
       </w:pPr>
-      <w:bookmarkStart w:id="40" w:name="_Toc83045206"/>
+      <w:bookmarkStart w:id="48" w:name="_Toc84603850"/>
       <w:r>
         <w:rPr>
           <w:lang w:val="sr-Cyrl-RS"/>
@@ -8590,7 +10330,7 @@
         </w:rPr>
         <w:t>)</w:t>
       </w:r>
-      <w:bookmarkEnd w:id="40"/>
+      <w:bookmarkEnd w:id="48"/>
     </w:p>
     <w:p/>
     <w:p>
@@ -8796,7 +10536,7 @@
           <w:lang w:val="sr-Cyrl-RS"/>
         </w:rPr>
       </w:pPr>
-      <w:bookmarkStart w:id="41" w:name="_Toc83045207"/>
+      <w:bookmarkStart w:id="49" w:name="_Toc84603851"/>
       <w:r>
         <w:rPr>
           <w:lang w:val="sr-Cyrl-RS"/>
@@ -8804,7 +10544,7 @@
         <w:lastRenderedPageBreak/>
         <w:t>ОПИС ДИЗАЈНА</w:t>
       </w:r>
-      <w:bookmarkEnd w:id="41"/>
+      <w:bookmarkEnd w:id="49"/>
     </w:p>
     <w:p>
       <w:pPr>
@@ -9023,7 +10763,7 @@
           <w:lang w:val="sr-Cyrl-RS"/>
         </w:rPr>
       </w:pPr>
-      <w:bookmarkStart w:id="42" w:name="_Toc83045208"/>
+      <w:bookmarkStart w:id="50" w:name="_Toc84603852"/>
       <w:r>
         <w:rPr>
           <w:lang w:val="sr-Cyrl-RS"/>
@@ -9031,7 +10771,7 @@
         <w:lastRenderedPageBreak/>
         <w:t>ЗАКЉУЧАК</w:t>
       </w:r>
-      <w:bookmarkEnd w:id="42"/>
+      <w:bookmarkEnd w:id="50"/>
     </w:p>
     <w:p>
       <w:pPr>
@@ -9250,7 +10990,7 @@
           <w:lang w:val="sr-Cyrl-RS"/>
         </w:rPr>
       </w:pPr>
-      <w:bookmarkStart w:id="43" w:name="_Toc83045209"/>
+      <w:bookmarkStart w:id="51" w:name="_Toc84603853"/>
       <w:r>
         <w:rPr>
           <w:lang w:val="sr-Cyrl-RS"/>
@@ -9258,7 +10998,7 @@
         <w:lastRenderedPageBreak/>
         <w:t>ЛИТЕРАТУРА</w:t>
       </w:r>
-      <w:bookmarkEnd w:id="43"/>
+      <w:bookmarkEnd w:id="51"/>
     </w:p>
     <w:p>
       <w:pPr>
@@ -9307,7 +11047,29 @@
       <w:r>
         <w:t xml:space="preserve">[3] </w:t>
       </w:r>
-      <w:hyperlink r:id="rId19" w:history="1">
+      <w:r>
+        <w:rPr>
+          <w:lang w:val="sr-Cyrl-RS"/>
+        </w:rPr>
+        <w:t>Мултумедијални системи, проф. др Владимир Рисојевић</w:t>
+      </w:r>
+    </w:p>
+    <w:p>
+      <w:pPr>
+        <w:rPr>
+          <w:lang w:val="sr-Cyrl-RS"/>
+        </w:rPr>
+      </w:pPr>
+      <w:r>
+        <w:t>[</w:t>
+      </w:r>
+      <w:r>
+        <w:t>4</w:t>
+      </w:r>
+      <w:r>
+        <w:t xml:space="preserve">] </w:t>
+      </w:r>
+      <w:hyperlink r:id="rId22" w:history="1">
         <w:r>
           <w:rPr>
             <w:rStyle w:val="Hyperlink"/>
@@ -9396,7 +11158,7 @@
       <w:rPr>
         <w:noProof/>
       </w:rPr>
-      <w:t>11</w:t>
+      <w:t>17</w:t>
     </w:r>
     <w:r>
       <w:rPr>
@@ -9529,7 +11291,7 @@
   <w:abstractNum w:abstractNumId="1" w15:restartNumberingAfterBreak="0">
     <w:nsid w:val="16795EF1"/>
     <w:multiLevelType w:val="multilevel"/>
-    <w:tmpl w:val="92E6EDEC"/>
+    <w:tmpl w:val="96FCD710"/>
     <w:lvl w:ilvl="0">
       <w:start w:val="1"/>
       <w:numFmt w:val="decimal"/>
@@ -9744,7 +11506,7 @@
       <w:lvlText w:val=""/>
       <w:lvlJc w:val="left"/>
       <w:pPr>
-        <w:ind w:left="720" w:hanging="360"/>
+        <w:ind w:left="1080" w:hanging="360"/>
       </w:pPr>
       <w:rPr>
         <w:rFonts w:ascii="Symbol" w:hAnsi="Symbol" w:hint="default"/>
@@ -9756,7 +11518,7 @@
       <w:lvlText w:val="o"/>
       <w:lvlJc w:val="left"/>
       <w:pPr>
-        <w:ind w:left="1440" w:hanging="360"/>
+        <w:ind w:left="1800" w:hanging="360"/>
       </w:pPr>
       <w:rPr>
         <w:rFonts w:ascii="Courier New" w:hAnsi="Courier New" w:cs="Courier New" w:hint="default"/>
@@ -9768,7 +11530,7 @@
       <w:lvlText w:val=""/>
       <w:lvlJc w:val="left"/>
       <w:pPr>
-        <w:ind w:left="2160" w:hanging="360"/>
+        <w:ind w:left="2520" w:hanging="360"/>
       </w:pPr>
       <w:rPr>
         <w:rFonts w:ascii="Wingdings" w:hAnsi="Wingdings" w:hint="default"/>
@@ -9780,7 +11542,7 @@
       <w:lvlText w:val=""/>
       <w:lvlJc w:val="left"/>
       <w:pPr>
-        <w:ind w:left="2880" w:hanging="360"/>
+        <w:ind w:left="3240" w:hanging="360"/>
       </w:pPr>
       <w:rPr>
         <w:rFonts w:ascii="Symbol" w:hAnsi="Symbol" w:hint="default"/>
@@ -9792,7 +11554,7 @@
       <w:lvlText w:val="o"/>
       <w:lvlJc w:val="left"/>
       <w:pPr>
-        <w:ind w:left="3600" w:hanging="360"/>
+        <w:ind w:left="3960" w:hanging="360"/>
       </w:pPr>
       <w:rPr>
         <w:rFonts w:ascii="Courier New" w:hAnsi="Courier New" w:cs="Courier New" w:hint="default"/>
@@ -9804,7 +11566,7 @@
       <w:lvlText w:val=""/>
       <w:lvlJc w:val="left"/>
       <w:pPr>
-        <w:ind w:left="4320" w:hanging="360"/>
+        <w:ind w:left="4680" w:hanging="360"/>
       </w:pPr>
       <w:rPr>
         <w:rFonts w:ascii="Wingdings" w:hAnsi="Wingdings" w:hint="default"/>
@@ -9816,7 +11578,7 @@
       <w:lvlText w:val=""/>
       <w:lvlJc w:val="left"/>
       <w:pPr>
-        <w:ind w:left="5040" w:hanging="360"/>
+        <w:ind w:left="5400" w:hanging="360"/>
       </w:pPr>
       <w:rPr>
         <w:rFonts w:ascii="Symbol" w:hAnsi="Symbol" w:hint="default"/>
@@ -9828,7 +11590,7 @@
       <w:lvlText w:val="o"/>
       <w:lvlJc w:val="left"/>
       <w:pPr>
-        <w:ind w:left="5760" w:hanging="360"/>
+        <w:ind w:left="6120" w:hanging="360"/>
       </w:pPr>
       <w:rPr>
         <w:rFonts w:ascii="Courier New" w:hAnsi="Courier New" w:cs="Courier New" w:hint="default"/>
@@ -9840,7 +11602,7 @@
       <w:lvlText w:val=""/>
       <w:lvlJc w:val="left"/>
       <w:pPr>
-        <w:ind w:left="6480" w:hanging="360"/>
+        <w:ind w:left="6840" w:hanging="360"/>
       </w:pPr>
       <w:rPr>
         <w:rFonts w:ascii="Wingdings" w:hAnsi="Wingdings" w:hint="default"/>
@@ -10074,16 +11836,16 @@
     </w:lvl>
   </w:abstractNum>
   <w:abstractNum w:abstractNumId="6" w15:restartNumberingAfterBreak="0">
-    <w:nsid w:val="5F0C26B4"/>
+    <w:nsid w:val="479F56EE"/>
     <w:multiLevelType w:val="hybridMultilevel"/>
-    <w:tmpl w:val="F97E183C"/>
+    <w:tmpl w:val="66A2BC46"/>
     <w:lvl w:ilvl="0" w:tplc="08090001">
       <w:start w:val="1"/>
       <w:numFmt w:val="bullet"/>
       <w:lvlText w:val=""/>
       <w:lvlJc w:val="left"/>
       <w:pPr>
-        <w:ind w:left="1440" w:hanging="360"/>
+        <w:ind w:left="1080" w:hanging="360"/>
       </w:pPr>
       <w:rPr>
         <w:rFonts w:ascii="Symbol" w:hAnsi="Symbol" w:hint="default"/>
@@ -10095,7 +11857,7 @@
       <w:lvlText w:val="o"/>
       <w:lvlJc w:val="left"/>
       <w:pPr>
-        <w:ind w:left="2160" w:hanging="360"/>
+        <w:ind w:left="1800" w:hanging="360"/>
       </w:pPr>
       <w:rPr>
         <w:rFonts w:ascii="Courier New" w:hAnsi="Courier New" w:cs="Courier New" w:hint="default"/>
@@ -10107,7 +11869,7 @@
       <w:lvlText w:val=""/>
       <w:lvlJc w:val="left"/>
       <w:pPr>
-        <w:ind w:left="2880" w:hanging="360"/>
+        <w:ind w:left="2520" w:hanging="360"/>
       </w:pPr>
       <w:rPr>
         <w:rFonts w:ascii="Wingdings" w:hAnsi="Wingdings" w:hint="default"/>
@@ -10119,7 +11881,7 @@
       <w:lvlText w:val=""/>
       <w:lvlJc w:val="left"/>
       <w:pPr>
-        <w:ind w:left="3600" w:hanging="360"/>
+        <w:ind w:left="3240" w:hanging="360"/>
       </w:pPr>
       <w:rPr>
         <w:rFonts w:ascii="Symbol" w:hAnsi="Symbol" w:hint="default"/>
@@ -10131,7 +11893,7 @@
       <w:lvlText w:val="o"/>
       <w:lvlJc w:val="left"/>
       <w:pPr>
-        <w:ind w:left="4320" w:hanging="360"/>
+        <w:ind w:left="3960" w:hanging="360"/>
       </w:pPr>
       <w:rPr>
         <w:rFonts w:ascii="Courier New" w:hAnsi="Courier New" w:cs="Courier New" w:hint="default"/>
@@ -10143,7 +11905,7 @@
       <w:lvlText w:val=""/>
       <w:lvlJc w:val="left"/>
       <w:pPr>
-        <w:ind w:left="5040" w:hanging="360"/>
+        <w:ind w:left="4680" w:hanging="360"/>
       </w:pPr>
       <w:rPr>
         <w:rFonts w:ascii="Wingdings" w:hAnsi="Wingdings" w:hint="default"/>
@@ -10155,7 +11917,7 @@
       <w:lvlText w:val=""/>
       <w:lvlJc w:val="left"/>
       <w:pPr>
-        <w:ind w:left="5760" w:hanging="360"/>
+        <w:ind w:left="5400" w:hanging="360"/>
       </w:pPr>
       <w:rPr>
         <w:rFonts w:ascii="Symbol" w:hAnsi="Symbol" w:hint="default"/>
@@ -10167,7 +11929,7 @@
       <w:lvlText w:val="o"/>
       <w:lvlJc w:val="left"/>
       <w:pPr>
-        <w:ind w:left="6480" w:hanging="360"/>
+        <w:ind w:left="6120" w:hanging="360"/>
       </w:pPr>
       <w:rPr>
         <w:rFonts w:ascii="Courier New" w:hAnsi="Courier New" w:cs="Courier New" w:hint="default"/>
@@ -10179,7 +11941,7 @@
       <w:lvlText w:val=""/>
       <w:lvlJc w:val="left"/>
       <w:pPr>
-        <w:ind w:left="7200" w:hanging="360"/>
+        <w:ind w:left="6840" w:hanging="360"/>
       </w:pPr>
       <w:rPr>
         <w:rFonts w:ascii="Wingdings" w:hAnsi="Wingdings" w:hint="default"/>
@@ -10187,102 +11949,16 @@
     </w:lvl>
   </w:abstractNum>
   <w:abstractNum w:abstractNumId="7" w15:restartNumberingAfterBreak="0">
-    <w:nsid w:val="653B530B"/>
+    <w:nsid w:val="5F0C26B4"/>
     <w:multiLevelType w:val="hybridMultilevel"/>
-    <w:tmpl w:val="46105406"/>
-    <w:lvl w:ilvl="0" w:tplc="0409000F">
-      <w:start w:val="1"/>
-      <w:numFmt w:val="decimal"/>
-      <w:lvlText w:val="%1."/>
-      <w:lvlJc w:val="left"/>
-      <w:pPr>
-        <w:ind w:left="720" w:hanging="360"/>
-      </w:pPr>
-    </w:lvl>
-    <w:lvl w:ilvl="1" w:tplc="04090019" w:tentative="1">
-      <w:start w:val="1"/>
-      <w:numFmt w:val="lowerLetter"/>
-      <w:lvlText w:val="%2."/>
-      <w:lvlJc w:val="left"/>
-      <w:pPr>
-        <w:ind w:left="1440" w:hanging="360"/>
-      </w:pPr>
-    </w:lvl>
-    <w:lvl w:ilvl="2" w:tplc="0409001B" w:tentative="1">
-      <w:start w:val="1"/>
-      <w:numFmt w:val="lowerRoman"/>
-      <w:lvlText w:val="%3."/>
-      <w:lvlJc w:val="right"/>
-      <w:pPr>
-        <w:ind w:left="2160" w:hanging="180"/>
-      </w:pPr>
-    </w:lvl>
-    <w:lvl w:ilvl="3" w:tplc="0409000F" w:tentative="1">
-      <w:start w:val="1"/>
-      <w:numFmt w:val="decimal"/>
-      <w:lvlText w:val="%4."/>
-      <w:lvlJc w:val="left"/>
-      <w:pPr>
-        <w:ind w:left="2880" w:hanging="360"/>
-      </w:pPr>
-    </w:lvl>
-    <w:lvl w:ilvl="4" w:tplc="04090019" w:tentative="1">
-      <w:start w:val="1"/>
-      <w:numFmt w:val="lowerLetter"/>
-      <w:lvlText w:val="%5."/>
-      <w:lvlJc w:val="left"/>
-      <w:pPr>
-        <w:ind w:left="3600" w:hanging="360"/>
-      </w:pPr>
-    </w:lvl>
-    <w:lvl w:ilvl="5" w:tplc="0409001B" w:tentative="1">
-      <w:start w:val="1"/>
-      <w:numFmt w:val="lowerRoman"/>
-      <w:lvlText w:val="%6."/>
-      <w:lvlJc w:val="right"/>
-      <w:pPr>
-        <w:ind w:left="4320" w:hanging="180"/>
-      </w:pPr>
-    </w:lvl>
-    <w:lvl w:ilvl="6" w:tplc="0409000F" w:tentative="1">
-      <w:start w:val="1"/>
-      <w:numFmt w:val="decimal"/>
-      <w:lvlText w:val="%7."/>
-      <w:lvlJc w:val="left"/>
-      <w:pPr>
-        <w:ind w:left="5040" w:hanging="360"/>
-      </w:pPr>
-    </w:lvl>
-    <w:lvl w:ilvl="7" w:tplc="04090019" w:tentative="1">
-      <w:start w:val="1"/>
-      <w:numFmt w:val="lowerLetter"/>
-      <w:lvlText w:val="%8."/>
-      <w:lvlJc w:val="left"/>
-      <w:pPr>
-        <w:ind w:left="5760" w:hanging="360"/>
-      </w:pPr>
-    </w:lvl>
-    <w:lvl w:ilvl="8" w:tplc="0409001B" w:tentative="1">
-      <w:start w:val="1"/>
-      <w:numFmt w:val="lowerRoman"/>
-      <w:lvlText w:val="%9."/>
-      <w:lvlJc w:val="right"/>
-      <w:pPr>
-        <w:ind w:left="6480" w:hanging="180"/>
-      </w:pPr>
-    </w:lvl>
-  </w:abstractNum>
-  <w:abstractNum w:abstractNumId="8" w15:restartNumberingAfterBreak="0">
-    <w:nsid w:val="7B967245"/>
-    <w:multiLevelType w:val="hybridMultilevel"/>
-    <w:tmpl w:val="39B896D4"/>
+    <w:tmpl w:val="F97E183C"/>
     <w:lvl w:ilvl="0" w:tplc="08090001">
       <w:start w:val="1"/>
       <w:numFmt w:val="bullet"/>
       <w:lvlText w:val=""/>
       <w:lvlJc w:val="left"/>
       <w:pPr>
-        <w:ind w:left="720" w:hanging="360"/>
+        <w:ind w:left="1440" w:hanging="360"/>
       </w:pPr>
       <w:rPr>
         <w:rFonts w:ascii="Symbol" w:hAnsi="Symbol" w:hint="default"/>
@@ -10294,7 +11970,7 @@
       <w:lvlText w:val="o"/>
       <w:lvlJc w:val="left"/>
       <w:pPr>
-        <w:ind w:left="1440" w:hanging="360"/>
+        <w:ind w:left="2160" w:hanging="360"/>
       </w:pPr>
       <w:rPr>
         <w:rFonts w:ascii="Courier New" w:hAnsi="Courier New" w:cs="Courier New" w:hint="default"/>
@@ -10306,7 +11982,7 @@
       <w:lvlText w:val=""/>
       <w:lvlJc w:val="left"/>
       <w:pPr>
-        <w:ind w:left="2160" w:hanging="360"/>
+        <w:ind w:left="2880" w:hanging="360"/>
       </w:pPr>
       <w:rPr>
         <w:rFonts w:ascii="Wingdings" w:hAnsi="Wingdings" w:hint="default"/>
@@ -10318,7 +11994,7 @@
       <w:lvlText w:val=""/>
       <w:lvlJc w:val="left"/>
       <w:pPr>
-        <w:ind w:left="2880" w:hanging="360"/>
+        <w:ind w:left="3600" w:hanging="360"/>
       </w:pPr>
       <w:rPr>
         <w:rFonts w:ascii="Symbol" w:hAnsi="Symbol" w:hint="default"/>
@@ -10330,7 +12006,7 @@
       <w:lvlText w:val="o"/>
       <w:lvlJc w:val="left"/>
       <w:pPr>
-        <w:ind w:left="3600" w:hanging="360"/>
+        <w:ind w:left="4320" w:hanging="360"/>
       </w:pPr>
       <w:rPr>
         <w:rFonts w:ascii="Courier New" w:hAnsi="Courier New" w:cs="Courier New" w:hint="default"/>
@@ -10342,7 +12018,7 @@
       <w:lvlText w:val=""/>
       <w:lvlJc w:val="left"/>
       <w:pPr>
-        <w:ind w:left="4320" w:hanging="360"/>
+        <w:ind w:left="5040" w:hanging="360"/>
       </w:pPr>
       <w:rPr>
         <w:rFonts w:ascii="Wingdings" w:hAnsi="Wingdings" w:hint="default"/>
@@ -10354,7 +12030,7 @@
       <w:lvlText w:val=""/>
       <w:lvlJc w:val="left"/>
       <w:pPr>
-        <w:ind w:left="5040" w:hanging="360"/>
+        <w:ind w:left="5760" w:hanging="360"/>
       </w:pPr>
       <w:rPr>
         <w:rFonts w:ascii="Symbol" w:hAnsi="Symbol" w:hint="default"/>
@@ -10366,7 +12042,7 @@
       <w:lvlText w:val="o"/>
       <w:lvlJc w:val="left"/>
       <w:pPr>
-        <w:ind w:left="5760" w:hanging="360"/>
+        <w:ind w:left="6480" w:hanging="360"/>
       </w:pPr>
       <w:rPr>
         <w:rFonts w:ascii="Courier New" w:hAnsi="Courier New" w:cs="Courier New" w:hint="default"/>
@@ -10378,6 +12054,431 @@
       <w:lvlText w:val=""/>
       <w:lvlJc w:val="left"/>
       <w:pPr>
+        <w:ind w:left="7200" w:hanging="360"/>
+      </w:pPr>
+      <w:rPr>
+        <w:rFonts w:ascii="Wingdings" w:hAnsi="Wingdings" w:hint="default"/>
+      </w:rPr>
+    </w:lvl>
+  </w:abstractNum>
+  <w:abstractNum w:abstractNumId="8" w15:restartNumberingAfterBreak="0">
+    <w:nsid w:val="62C44140"/>
+    <w:multiLevelType w:val="hybridMultilevel"/>
+    <w:tmpl w:val="FD1E10D0"/>
+    <w:lvl w:ilvl="0" w:tplc="08090001">
+      <w:start w:val="1"/>
+      <w:numFmt w:val="bullet"/>
+      <w:lvlText w:val=""/>
+      <w:lvlJc w:val="left"/>
+      <w:pPr>
+        <w:ind w:left="720" w:hanging="360"/>
+      </w:pPr>
+      <w:rPr>
+        <w:rFonts w:ascii="Symbol" w:hAnsi="Symbol" w:hint="default"/>
+      </w:rPr>
+    </w:lvl>
+    <w:lvl w:ilvl="1" w:tplc="08090003" w:tentative="1">
+      <w:start w:val="1"/>
+      <w:numFmt w:val="bullet"/>
+      <w:lvlText w:val="o"/>
+      <w:lvlJc w:val="left"/>
+      <w:pPr>
+        <w:ind w:left="1440" w:hanging="360"/>
+      </w:pPr>
+      <w:rPr>
+        <w:rFonts w:ascii="Courier New" w:hAnsi="Courier New" w:cs="Courier New" w:hint="default"/>
+      </w:rPr>
+    </w:lvl>
+    <w:lvl w:ilvl="2" w:tplc="08090005" w:tentative="1">
+      <w:start w:val="1"/>
+      <w:numFmt w:val="bullet"/>
+      <w:lvlText w:val=""/>
+      <w:lvlJc w:val="left"/>
+      <w:pPr>
+        <w:ind w:left="2160" w:hanging="360"/>
+      </w:pPr>
+      <w:rPr>
+        <w:rFonts w:ascii="Wingdings" w:hAnsi="Wingdings" w:hint="default"/>
+      </w:rPr>
+    </w:lvl>
+    <w:lvl w:ilvl="3" w:tplc="08090001" w:tentative="1">
+      <w:start w:val="1"/>
+      <w:numFmt w:val="bullet"/>
+      <w:lvlText w:val=""/>
+      <w:lvlJc w:val="left"/>
+      <w:pPr>
+        <w:ind w:left="2880" w:hanging="360"/>
+      </w:pPr>
+      <w:rPr>
+        <w:rFonts w:ascii="Symbol" w:hAnsi="Symbol" w:hint="default"/>
+      </w:rPr>
+    </w:lvl>
+    <w:lvl w:ilvl="4" w:tplc="08090003" w:tentative="1">
+      <w:start w:val="1"/>
+      <w:numFmt w:val="bullet"/>
+      <w:lvlText w:val="o"/>
+      <w:lvlJc w:val="left"/>
+      <w:pPr>
+        <w:ind w:left="3600" w:hanging="360"/>
+      </w:pPr>
+      <w:rPr>
+        <w:rFonts w:ascii="Courier New" w:hAnsi="Courier New" w:cs="Courier New" w:hint="default"/>
+      </w:rPr>
+    </w:lvl>
+    <w:lvl w:ilvl="5" w:tplc="08090005" w:tentative="1">
+      <w:start w:val="1"/>
+      <w:numFmt w:val="bullet"/>
+      <w:lvlText w:val=""/>
+      <w:lvlJc w:val="left"/>
+      <w:pPr>
+        <w:ind w:left="4320" w:hanging="360"/>
+      </w:pPr>
+      <w:rPr>
+        <w:rFonts w:ascii="Wingdings" w:hAnsi="Wingdings" w:hint="default"/>
+      </w:rPr>
+    </w:lvl>
+    <w:lvl w:ilvl="6" w:tplc="08090001" w:tentative="1">
+      <w:start w:val="1"/>
+      <w:numFmt w:val="bullet"/>
+      <w:lvlText w:val=""/>
+      <w:lvlJc w:val="left"/>
+      <w:pPr>
+        <w:ind w:left="5040" w:hanging="360"/>
+      </w:pPr>
+      <w:rPr>
+        <w:rFonts w:ascii="Symbol" w:hAnsi="Symbol" w:hint="default"/>
+      </w:rPr>
+    </w:lvl>
+    <w:lvl w:ilvl="7" w:tplc="08090003" w:tentative="1">
+      <w:start w:val="1"/>
+      <w:numFmt w:val="bullet"/>
+      <w:lvlText w:val="o"/>
+      <w:lvlJc w:val="left"/>
+      <w:pPr>
+        <w:ind w:left="5760" w:hanging="360"/>
+      </w:pPr>
+      <w:rPr>
+        <w:rFonts w:ascii="Courier New" w:hAnsi="Courier New" w:cs="Courier New" w:hint="default"/>
+      </w:rPr>
+    </w:lvl>
+    <w:lvl w:ilvl="8" w:tplc="08090005" w:tentative="1">
+      <w:start w:val="1"/>
+      <w:numFmt w:val="bullet"/>
+      <w:lvlText w:val=""/>
+      <w:lvlJc w:val="left"/>
+      <w:pPr>
+        <w:ind w:left="6480" w:hanging="360"/>
+      </w:pPr>
+      <w:rPr>
+        <w:rFonts w:ascii="Wingdings" w:hAnsi="Wingdings" w:hint="default"/>
+      </w:rPr>
+    </w:lvl>
+  </w:abstractNum>
+  <w:abstractNum w:abstractNumId="9" w15:restartNumberingAfterBreak="0">
+    <w:nsid w:val="653B530B"/>
+    <w:multiLevelType w:val="hybridMultilevel"/>
+    <w:tmpl w:val="46105406"/>
+    <w:lvl w:ilvl="0" w:tplc="0409000F">
+      <w:start w:val="1"/>
+      <w:numFmt w:val="decimal"/>
+      <w:lvlText w:val="%1."/>
+      <w:lvlJc w:val="left"/>
+      <w:pPr>
+        <w:ind w:left="720" w:hanging="360"/>
+      </w:pPr>
+    </w:lvl>
+    <w:lvl w:ilvl="1" w:tplc="04090019" w:tentative="1">
+      <w:start w:val="1"/>
+      <w:numFmt w:val="lowerLetter"/>
+      <w:lvlText w:val="%2."/>
+      <w:lvlJc w:val="left"/>
+      <w:pPr>
+        <w:ind w:left="1440" w:hanging="360"/>
+      </w:pPr>
+    </w:lvl>
+    <w:lvl w:ilvl="2" w:tplc="0409001B" w:tentative="1">
+      <w:start w:val="1"/>
+      <w:numFmt w:val="lowerRoman"/>
+      <w:lvlText w:val="%3."/>
+      <w:lvlJc w:val="right"/>
+      <w:pPr>
+        <w:ind w:left="2160" w:hanging="180"/>
+      </w:pPr>
+    </w:lvl>
+    <w:lvl w:ilvl="3" w:tplc="0409000F" w:tentative="1">
+      <w:start w:val="1"/>
+      <w:numFmt w:val="decimal"/>
+      <w:lvlText w:val="%4."/>
+      <w:lvlJc w:val="left"/>
+      <w:pPr>
+        <w:ind w:left="2880" w:hanging="360"/>
+      </w:pPr>
+    </w:lvl>
+    <w:lvl w:ilvl="4" w:tplc="04090019" w:tentative="1">
+      <w:start w:val="1"/>
+      <w:numFmt w:val="lowerLetter"/>
+      <w:lvlText w:val="%5."/>
+      <w:lvlJc w:val="left"/>
+      <w:pPr>
+        <w:ind w:left="3600" w:hanging="360"/>
+      </w:pPr>
+    </w:lvl>
+    <w:lvl w:ilvl="5" w:tplc="0409001B" w:tentative="1">
+      <w:start w:val="1"/>
+      <w:numFmt w:val="lowerRoman"/>
+      <w:lvlText w:val="%6."/>
+      <w:lvlJc w:val="right"/>
+      <w:pPr>
+        <w:ind w:left="4320" w:hanging="180"/>
+      </w:pPr>
+    </w:lvl>
+    <w:lvl w:ilvl="6" w:tplc="0409000F" w:tentative="1">
+      <w:start w:val="1"/>
+      <w:numFmt w:val="decimal"/>
+      <w:lvlText w:val="%7."/>
+      <w:lvlJc w:val="left"/>
+      <w:pPr>
+        <w:ind w:left="5040" w:hanging="360"/>
+      </w:pPr>
+    </w:lvl>
+    <w:lvl w:ilvl="7" w:tplc="04090019" w:tentative="1">
+      <w:start w:val="1"/>
+      <w:numFmt w:val="lowerLetter"/>
+      <w:lvlText w:val="%8."/>
+      <w:lvlJc w:val="left"/>
+      <w:pPr>
+        <w:ind w:left="5760" w:hanging="360"/>
+      </w:pPr>
+    </w:lvl>
+    <w:lvl w:ilvl="8" w:tplc="0409001B" w:tentative="1">
+      <w:start w:val="1"/>
+      <w:numFmt w:val="lowerRoman"/>
+      <w:lvlText w:val="%9."/>
+      <w:lvlJc w:val="right"/>
+      <w:pPr>
+        <w:ind w:left="6480" w:hanging="180"/>
+      </w:pPr>
+    </w:lvl>
+  </w:abstractNum>
+  <w:abstractNum w:abstractNumId="10" w15:restartNumberingAfterBreak="0">
+    <w:nsid w:val="75D0728E"/>
+    <w:multiLevelType w:val="hybridMultilevel"/>
+    <w:tmpl w:val="15EEA380"/>
+    <w:lvl w:ilvl="0" w:tplc="08090001">
+      <w:start w:val="1"/>
+      <w:numFmt w:val="bullet"/>
+      <w:lvlText w:val=""/>
+      <w:lvlJc w:val="left"/>
+      <w:pPr>
+        <w:ind w:left="1080" w:hanging="360"/>
+      </w:pPr>
+      <w:rPr>
+        <w:rFonts w:ascii="Symbol" w:hAnsi="Symbol" w:hint="default"/>
+      </w:rPr>
+    </w:lvl>
+    <w:lvl w:ilvl="1" w:tplc="08090003" w:tentative="1">
+      <w:start w:val="1"/>
+      <w:numFmt w:val="bullet"/>
+      <w:lvlText w:val="o"/>
+      <w:lvlJc w:val="left"/>
+      <w:pPr>
+        <w:ind w:left="1800" w:hanging="360"/>
+      </w:pPr>
+      <w:rPr>
+        <w:rFonts w:ascii="Courier New" w:hAnsi="Courier New" w:cs="Courier New" w:hint="default"/>
+      </w:rPr>
+    </w:lvl>
+    <w:lvl w:ilvl="2" w:tplc="08090005" w:tentative="1">
+      <w:start w:val="1"/>
+      <w:numFmt w:val="bullet"/>
+      <w:lvlText w:val=""/>
+      <w:lvlJc w:val="left"/>
+      <w:pPr>
+        <w:ind w:left="2520" w:hanging="360"/>
+      </w:pPr>
+      <w:rPr>
+        <w:rFonts w:ascii="Wingdings" w:hAnsi="Wingdings" w:hint="default"/>
+      </w:rPr>
+    </w:lvl>
+    <w:lvl w:ilvl="3" w:tplc="08090001" w:tentative="1">
+      <w:start w:val="1"/>
+      <w:numFmt w:val="bullet"/>
+      <w:lvlText w:val=""/>
+      <w:lvlJc w:val="left"/>
+      <w:pPr>
+        <w:ind w:left="3240" w:hanging="360"/>
+      </w:pPr>
+      <w:rPr>
+        <w:rFonts w:ascii="Symbol" w:hAnsi="Symbol" w:hint="default"/>
+      </w:rPr>
+    </w:lvl>
+    <w:lvl w:ilvl="4" w:tplc="08090003" w:tentative="1">
+      <w:start w:val="1"/>
+      <w:numFmt w:val="bullet"/>
+      <w:lvlText w:val="o"/>
+      <w:lvlJc w:val="left"/>
+      <w:pPr>
+        <w:ind w:left="3960" w:hanging="360"/>
+      </w:pPr>
+      <w:rPr>
+        <w:rFonts w:ascii="Courier New" w:hAnsi="Courier New" w:cs="Courier New" w:hint="default"/>
+      </w:rPr>
+    </w:lvl>
+    <w:lvl w:ilvl="5" w:tplc="08090005" w:tentative="1">
+      <w:start w:val="1"/>
+      <w:numFmt w:val="bullet"/>
+      <w:lvlText w:val=""/>
+      <w:lvlJc w:val="left"/>
+      <w:pPr>
+        <w:ind w:left="4680" w:hanging="360"/>
+      </w:pPr>
+      <w:rPr>
+        <w:rFonts w:ascii="Wingdings" w:hAnsi="Wingdings" w:hint="default"/>
+      </w:rPr>
+    </w:lvl>
+    <w:lvl w:ilvl="6" w:tplc="08090001" w:tentative="1">
+      <w:start w:val="1"/>
+      <w:numFmt w:val="bullet"/>
+      <w:lvlText w:val=""/>
+      <w:lvlJc w:val="left"/>
+      <w:pPr>
+        <w:ind w:left="5400" w:hanging="360"/>
+      </w:pPr>
+      <w:rPr>
+        <w:rFonts w:ascii="Symbol" w:hAnsi="Symbol" w:hint="default"/>
+      </w:rPr>
+    </w:lvl>
+    <w:lvl w:ilvl="7" w:tplc="08090003" w:tentative="1">
+      <w:start w:val="1"/>
+      <w:numFmt w:val="bullet"/>
+      <w:lvlText w:val="o"/>
+      <w:lvlJc w:val="left"/>
+      <w:pPr>
+        <w:ind w:left="6120" w:hanging="360"/>
+      </w:pPr>
+      <w:rPr>
+        <w:rFonts w:ascii="Courier New" w:hAnsi="Courier New" w:cs="Courier New" w:hint="default"/>
+      </w:rPr>
+    </w:lvl>
+    <w:lvl w:ilvl="8" w:tplc="08090005" w:tentative="1">
+      <w:start w:val="1"/>
+      <w:numFmt w:val="bullet"/>
+      <w:lvlText w:val=""/>
+      <w:lvlJc w:val="left"/>
+      <w:pPr>
+        <w:ind w:left="6840" w:hanging="360"/>
+      </w:pPr>
+      <w:rPr>
+        <w:rFonts w:ascii="Wingdings" w:hAnsi="Wingdings" w:hint="default"/>
+      </w:rPr>
+    </w:lvl>
+  </w:abstractNum>
+  <w:abstractNum w:abstractNumId="11" w15:restartNumberingAfterBreak="0">
+    <w:nsid w:val="7B967245"/>
+    <w:multiLevelType w:val="hybridMultilevel"/>
+    <w:tmpl w:val="39B896D4"/>
+    <w:lvl w:ilvl="0" w:tplc="08090001">
+      <w:start w:val="1"/>
+      <w:numFmt w:val="bullet"/>
+      <w:lvlText w:val=""/>
+      <w:lvlJc w:val="left"/>
+      <w:pPr>
+        <w:ind w:left="720" w:hanging="360"/>
+      </w:pPr>
+      <w:rPr>
+        <w:rFonts w:ascii="Symbol" w:hAnsi="Symbol" w:hint="default"/>
+      </w:rPr>
+    </w:lvl>
+    <w:lvl w:ilvl="1" w:tplc="08090003" w:tentative="1">
+      <w:start w:val="1"/>
+      <w:numFmt w:val="bullet"/>
+      <w:lvlText w:val="o"/>
+      <w:lvlJc w:val="left"/>
+      <w:pPr>
+        <w:ind w:left="1440" w:hanging="360"/>
+      </w:pPr>
+      <w:rPr>
+        <w:rFonts w:ascii="Courier New" w:hAnsi="Courier New" w:cs="Courier New" w:hint="default"/>
+      </w:rPr>
+    </w:lvl>
+    <w:lvl w:ilvl="2" w:tplc="08090005" w:tentative="1">
+      <w:start w:val="1"/>
+      <w:numFmt w:val="bullet"/>
+      <w:lvlText w:val=""/>
+      <w:lvlJc w:val="left"/>
+      <w:pPr>
+        <w:ind w:left="2160" w:hanging="360"/>
+      </w:pPr>
+      <w:rPr>
+        <w:rFonts w:ascii="Wingdings" w:hAnsi="Wingdings" w:hint="default"/>
+      </w:rPr>
+    </w:lvl>
+    <w:lvl w:ilvl="3" w:tplc="08090001" w:tentative="1">
+      <w:start w:val="1"/>
+      <w:numFmt w:val="bullet"/>
+      <w:lvlText w:val=""/>
+      <w:lvlJc w:val="left"/>
+      <w:pPr>
+        <w:ind w:left="2880" w:hanging="360"/>
+      </w:pPr>
+      <w:rPr>
+        <w:rFonts w:ascii="Symbol" w:hAnsi="Symbol" w:hint="default"/>
+      </w:rPr>
+    </w:lvl>
+    <w:lvl w:ilvl="4" w:tplc="08090003" w:tentative="1">
+      <w:start w:val="1"/>
+      <w:numFmt w:val="bullet"/>
+      <w:lvlText w:val="o"/>
+      <w:lvlJc w:val="left"/>
+      <w:pPr>
+        <w:ind w:left="3600" w:hanging="360"/>
+      </w:pPr>
+      <w:rPr>
+        <w:rFonts w:ascii="Courier New" w:hAnsi="Courier New" w:cs="Courier New" w:hint="default"/>
+      </w:rPr>
+    </w:lvl>
+    <w:lvl w:ilvl="5" w:tplc="08090005" w:tentative="1">
+      <w:start w:val="1"/>
+      <w:numFmt w:val="bullet"/>
+      <w:lvlText w:val=""/>
+      <w:lvlJc w:val="left"/>
+      <w:pPr>
+        <w:ind w:left="4320" w:hanging="360"/>
+      </w:pPr>
+      <w:rPr>
+        <w:rFonts w:ascii="Wingdings" w:hAnsi="Wingdings" w:hint="default"/>
+      </w:rPr>
+    </w:lvl>
+    <w:lvl w:ilvl="6" w:tplc="08090001" w:tentative="1">
+      <w:start w:val="1"/>
+      <w:numFmt w:val="bullet"/>
+      <w:lvlText w:val=""/>
+      <w:lvlJc w:val="left"/>
+      <w:pPr>
+        <w:ind w:left="5040" w:hanging="360"/>
+      </w:pPr>
+      <w:rPr>
+        <w:rFonts w:ascii="Symbol" w:hAnsi="Symbol" w:hint="default"/>
+      </w:rPr>
+    </w:lvl>
+    <w:lvl w:ilvl="7" w:tplc="08090003" w:tentative="1">
+      <w:start w:val="1"/>
+      <w:numFmt w:val="bullet"/>
+      <w:lvlText w:val="o"/>
+      <w:lvlJc w:val="left"/>
+      <w:pPr>
+        <w:ind w:left="5760" w:hanging="360"/>
+      </w:pPr>
+      <w:rPr>
+        <w:rFonts w:ascii="Courier New" w:hAnsi="Courier New" w:cs="Courier New" w:hint="default"/>
+      </w:rPr>
+    </w:lvl>
+    <w:lvl w:ilvl="8" w:tplc="08090005" w:tentative="1">
+      <w:start w:val="1"/>
+      <w:numFmt w:val="bullet"/>
+      <w:lvlText w:val=""/>
+      <w:lvlJc w:val="left"/>
+      <w:pPr>
         <w:ind w:left="6480" w:hanging="360"/>
       </w:pPr>
       <w:rPr>
@@ -10389,7 +12490,7 @@
     <w:abstractNumId w:val="0"/>
   </w:num>
   <w:num w:numId="2">
-    <w:abstractNumId w:val="7"/>
+    <w:abstractNumId w:val="9"/>
   </w:num>
   <w:num w:numId="3">
     <w:abstractNumId w:val="1"/>
@@ -10398,7 +12499,7 @@
     <w:abstractNumId w:val="5"/>
   </w:num>
   <w:num w:numId="5">
-    <w:abstractNumId w:val="6"/>
+    <w:abstractNumId w:val="7"/>
   </w:num>
   <w:num w:numId="6">
     <w:abstractNumId w:val="2"/>
@@ -10407,10 +12508,19 @@
     <w:abstractNumId w:val="4"/>
   </w:num>
   <w:num w:numId="8">
-    <w:abstractNumId w:val="8"/>
+    <w:abstractNumId w:val="11"/>
   </w:num>
   <w:num w:numId="9">
     <w:abstractNumId w:val="3"/>
+  </w:num>
+  <w:num w:numId="10">
+    <w:abstractNumId w:val="10"/>
+  </w:num>
+  <w:num w:numId="11">
+    <w:abstractNumId w:val="6"/>
+  </w:num>
+  <w:num w:numId="12">
+    <w:abstractNumId w:val="8"/>
   </w:num>
 </w:numbering>
 </file>
@@ -10879,7 +12989,7 @@
     <w:uiPriority w:val="9"/>
     <w:unhideWhenUsed/>
     <w:qFormat/>
-    <w:rsid w:val="002D384F"/>
+    <w:rsid w:val="008A2979"/>
     <w:pPr>
       <w:keepNext/>
       <w:keepLines/>
@@ -10895,8 +13005,8 @@
       <w:rFonts w:eastAsiaTheme="majorEastAsia" w:cstheme="majorBidi"/>
       <w:b/>
       <w:i/>
-      <w:sz w:val="32"/>
       <w:szCs w:val="24"/>
+      <w:lang w:val="sr-Cyrl-RS"/>
     </w:rPr>
   </w:style>
   <w:style w:type="paragraph" w:styleId="Heading4">
@@ -11119,14 +13229,14 @@
     <w:basedOn w:val="DefaultParagraphFont"/>
     <w:link w:val="Heading3"/>
     <w:uiPriority w:val="9"/>
-    <w:rsid w:val="002D384F"/>
+    <w:rsid w:val="008A2979"/>
     <w:rPr>
       <w:rFonts w:ascii="Times New Roman" w:eastAsiaTheme="majorEastAsia" w:hAnsi="Times New Roman" w:cstheme="majorBidi"/>
       <w:b/>
       <w:i/>
-      <w:sz w:val="32"/>
+      <w:sz w:val="24"/>
       <w:szCs w:val="24"/>
-      <w:lang w:val="en-US"/>
+      <w:lang w:val="sr-Cyrl-RS"/>
     </w:rPr>
   </w:style>
   <w:style w:type="character" w:customStyle="1" w:styleId="Heading4Char">
@@ -11371,544 +13481,6 @@
     </w:rPr>
   </w:style>
 </w:styles>
-</file>
-
-<file path=word/glossary/document.xml><?xml version="1.0" encoding="utf-8"?>
-<w:glossaryDocument xmlns:wpc="http://schemas.microsoft.com/office/word/2010/wordprocessingCanvas" xmlns:cx="http://schemas.microsoft.com/office/drawing/2014/chartex" xmlns:mc="http://schemas.openxmlformats.org/markup-compatibility/2006" xmlns:o="urn:schemas-microsoft-com:office:office" xmlns:r="http://schemas.openxmlformats.org/officeDocument/2006/relationships" xmlns:m="http://schemas.openxmlformats.org/officeDocument/2006/math" xmlns:v="urn:schemas-microsoft-com:vml" xmlns:wp14="http://schemas.microsoft.com/office/word/2010/wordprocessingDrawing" xmlns:wp="http://schemas.openxmlformats.org/drawingml/2006/wordprocessingDrawing" xmlns:w10="urn:schemas-microsoft-com:office:word" xmlns:w="http://schemas.openxmlformats.org/wordprocessingml/2006/main" xmlns:w14="http://schemas.microsoft.com/office/word/2010/wordml" xmlns:w15="http://schemas.microsoft.com/office/word/2012/wordml" xmlns:w16se="http://schemas.microsoft.com/office/word/2015/wordml/symex" xmlns:wpg="http://schemas.microsoft.com/office/word/2010/wordprocessingGroup" xmlns:wpi="http://schemas.microsoft.com/office/word/2010/wordprocessingInk" xmlns:wne="http://schemas.microsoft.com/office/word/2006/wordml" xmlns:wps="http://schemas.microsoft.com/office/word/2010/wordprocessingShape" mc:Ignorable="w14 w15 w16se wp14"/>
-</file>
-
-<file path=word/glossary/fontTable.xml><?xml version="1.0" encoding="utf-8"?>
-<w:fonts xmlns:mc="http://schemas.openxmlformats.org/markup-compatibility/2006" xmlns:r="http://schemas.openxmlformats.org/officeDocument/2006/relationships" xmlns:w="http://schemas.openxmlformats.org/wordprocessingml/2006/main" xmlns:w14="http://schemas.microsoft.com/office/word/2010/wordml" xmlns:w15="http://schemas.microsoft.com/office/word/2012/wordml" xmlns:w16se="http://schemas.microsoft.com/office/word/2015/wordml/symex" mc:Ignorable="w14 w15 w16se">
-  <w:font w:name="Symbol">
-    <w:panose1 w:val="05050102010706020507"/>
-    <w:charset w:val="02"/>
-    <w:family w:val="roman"/>
-    <w:pitch w:val="variable"/>
-    <w:sig w:usb0="00000000" w:usb1="10000000" w:usb2="00000000" w:usb3="00000000" w:csb0="80000000" w:csb1="00000000"/>
-  </w:font>
-  <w:font w:name="Times New Roman">
-    <w:panose1 w:val="02020603050405020304"/>
-    <w:charset w:val="00"/>
-    <w:family w:val="roman"/>
-    <w:pitch w:val="variable"/>
-    <w:sig w:usb0="E0002AFF" w:usb1="C0007843" w:usb2="00000009" w:usb3="00000000" w:csb0="000001FF" w:csb1="00000000"/>
-  </w:font>
-  <w:font w:name="Courier New">
-    <w:panose1 w:val="02070309020205020404"/>
-    <w:charset w:val="00"/>
-    <w:family w:val="modern"/>
-    <w:pitch w:val="fixed"/>
-    <w:sig w:usb0="E0002EFF" w:usb1="C0007843" w:usb2="00000009" w:usb3="00000000" w:csb0="000001FF" w:csb1="00000000"/>
-  </w:font>
-  <w:font w:name="Wingdings">
-    <w:panose1 w:val="05000000000000000000"/>
-    <w:charset w:val="02"/>
-    <w:family w:val="auto"/>
-    <w:pitch w:val="variable"/>
-    <w:sig w:usb0="00000000" w:usb1="10000000" w:usb2="00000000" w:usb3="00000000" w:csb0="80000000" w:csb1="00000000"/>
-  </w:font>
-  <w:font w:name="Calibri">
-    <w:panose1 w:val="020F0502020204030204"/>
-    <w:charset w:val="00"/>
-    <w:family w:val="swiss"/>
-    <w:pitch w:val="variable"/>
-    <w:sig w:usb0="E00002FF" w:usb1="4000ACFF" w:usb2="00000001" w:usb3="00000000" w:csb0="0000019F" w:csb1="00000000"/>
-  </w:font>
-  <w:font w:name="Calibri Light">
-    <w:panose1 w:val="020F0302020204030204"/>
-    <w:charset w:val="00"/>
-    <w:family w:val="swiss"/>
-    <w:pitch w:val="variable"/>
-    <w:sig w:usb0="A00002EF" w:usb1="4000207B" w:usb2="00000000" w:usb3="00000000" w:csb0="0000009F" w:csb1="00000000"/>
-  </w:font>
-  <w:font w:name="Cambria Math">
-    <w:panose1 w:val="02040503050406030204"/>
-    <w:charset w:val="00"/>
-    <w:family w:val="roman"/>
-    <w:pitch w:val="variable"/>
-    <w:sig w:usb0="E00006FF" w:usb1="420024FF" w:usb2="02000000" w:usb3="00000000" w:csb0="0000019F" w:csb1="00000000"/>
-  </w:font>
-</w:fonts>
-</file>
-
-<file path=word/glossary/settings.xml><?xml version="1.0" encoding="utf-8"?>
-<w:settings xmlns:mc="http://schemas.openxmlformats.org/markup-compatibility/2006" xmlns:o="urn:schemas-microsoft-com:office:office" xmlns:r="http://schemas.openxmlformats.org/officeDocument/2006/relationships" xmlns:m="http://schemas.openxmlformats.org/officeDocument/2006/math" xmlns:v="urn:schemas-microsoft-com:vml" xmlns:w10="urn:schemas-microsoft-com:office:word" xmlns:w="http://schemas.openxmlformats.org/wordprocessingml/2006/main" xmlns:w14="http://schemas.microsoft.com/office/word/2010/wordml" xmlns:w15="http://schemas.microsoft.com/office/word/2012/wordml" xmlns:w16se="http://schemas.microsoft.com/office/word/2015/wordml/symex" xmlns:sl="http://schemas.openxmlformats.org/schemaLibrary/2006/main" mc:Ignorable="w14 w15 w16se">
-  <w:view w:val="normal"/>
-  <w:defaultTabStop w:val="720"/>
-  <w:characterSpacingControl w:val="doNotCompress"/>
-  <w:compat>
-    <w:useFELayout/>
-    <w:compatSetting w:name="compatibilityMode" w:uri="http://schemas.microsoft.com/office/word" w:val="15"/>
-    <w:compatSetting w:name="overrideTableStyleFontSizeAndJustification" w:uri="http://schemas.microsoft.com/office/word" w:val="1"/>
-    <w:compatSetting w:name="enableOpenTypeFeatures" w:uri="http://schemas.microsoft.com/office/word" w:val="1"/>
-    <w:compatSetting w:name="doNotFlipMirrorIndents" w:uri="http://schemas.microsoft.com/office/word" w:val="1"/>
-    <w:compatSetting w:name="differentiateMultirowTableHeaders" w:uri="http://schemas.microsoft.com/office/word" w:val="1"/>
-  </w:compat>
-  <w:rsids>
-    <w:rsidRoot w:val="00BE5985"/>
-    <w:rsid w:val="009E2624"/>
-    <w:rsid w:val="00BE5985"/>
-  </w:rsids>
-  <m:mathPr>
-    <m:mathFont m:val="Cambria Math"/>
-    <m:brkBin m:val="before"/>
-    <m:brkBinSub m:val="--"/>
-    <m:smallFrac m:val="0"/>
-    <m:dispDef/>
-    <m:lMargin m:val="0"/>
-    <m:rMargin m:val="0"/>
-    <m:defJc m:val="centerGroup"/>
-    <m:wrapIndent m:val="1440"/>
-    <m:intLim m:val="subSup"/>
-    <m:naryLim m:val="undOvr"/>
-  </m:mathPr>
-  <w:themeFontLang w:val="en-GB"/>
-  <w:clrSchemeMapping w:bg1="light1" w:t1="dark1" w:bg2="light2" w:t2="dark2" w:accent1="accent1" w:accent2="accent2" w:accent3="accent3" w:accent4="accent4" w:accent5="accent5" w:accent6="accent6" w:hyperlink="hyperlink" w:followedHyperlink="followedHyperlink"/>
-  <w:decimalSymbol w:val="."/>
-  <w:listSeparator w:val=","/>
-  <w15:chartTrackingRefBased/>
-</w:settings>
-</file>
-
-<file path=word/glossary/styles.xml><?xml version="1.0" encoding="utf-8"?>
-<w:styles xmlns:mc="http://schemas.openxmlformats.org/markup-compatibility/2006" xmlns:r="http://schemas.openxmlformats.org/officeDocument/2006/relationships" xmlns:w="http://schemas.openxmlformats.org/wordprocessingml/2006/main" xmlns:w14="http://schemas.microsoft.com/office/word/2010/wordml" xmlns:w15="http://schemas.microsoft.com/office/word/2012/wordml" xmlns:w16se="http://schemas.microsoft.com/office/word/2015/wordml/symex" mc:Ignorable="w14 w15 w16se">
-  <w:docDefaults>
-    <w:rPrDefault>
-      <w:rPr>
-        <w:rFonts w:asciiTheme="minorHAnsi" w:eastAsiaTheme="minorEastAsia" w:hAnsiTheme="minorHAnsi" w:cstheme="minorBidi"/>
-        <w:sz w:val="22"/>
-        <w:szCs w:val="22"/>
-        <w:lang w:val="en-GB" w:eastAsia="en-GB" w:bidi="ar-SA"/>
-      </w:rPr>
-    </w:rPrDefault>
-    <w:pPrDefault>
-      <w:pPr>
-        <w:spacing w:after="160" w:line="259" w:lineRule="auto"/>
-      </w:pPr>
-    </w:pPrDefault>
-  </w:docDefaults>
-  <w:latentStyles w:defLockedState="0" w:defUIPriority="99" w:defSemiHidden="0" w:defUnhideWhenUsed="0" w:defQFormat="0" w:count="371">
-    <w:lsdException w:name="Normal" w:uiPriority="0" w:qFormat="1"/>
-    <w:lsdException w:name="heading 1" w:uiPriority="9" w:qFormat="1"/>
-    <w:lsdException w:name="heading 2" w:semiHidden="1" w:uiPriority="9" w:unhideWhenUsed="1" w:qFormat="1"/>
-    <w:lsdException w:name="heading 3" w:semiHidden="1" w:uiPriority="9" w:unhideWhenUsed="1" w:qFormat="1"/>
-    <w:lsdException w:name="heading 4" w:semiHidden="1" w:uiPriority="9" w:unhideWhenUsed="1" w:qFormat="1"/>
-    <w:lsdException w:name="heading 5" w:semiHidden="1" w:uiPriority="9" w:unhideWhenUsed="1" w:qFormat="1"/>
-    <w:lsdException w:name="heading 6" w:semiHidden="1" w:uiPriority="9" w:unhideWhenUsed="1" w:qFormat="1"/>
-    <w:lsdException w:name="heading 7" w:semiHidden="1" w:uiPriority="9" w:unhideWhenUsed="1" w:qFormat="1"/>
-    <w:lsdException w:name="heading 8" w:semiHidden="1" w:uiPriority="9" w:unhideWhenUsed="1" w:qFormat="1"/>
-    <w:lsdException w:name="heading 9" w:semiHidden="1" w:uiPriority="9" w:unhideWhenUsed="1" w:qFormat="1"/>
-    <w:lsdException w:name="index 1" w:semiHidden="1" w:unhideWhenUsed="1"/>
-    <w:lsdException w:name="index 2" w:semiHidden="1" w:unhideWhenUsed="1"/>
-    <w:lsdException w:name="index 3" w:semiHidden="1" w:unhideWhenUsed="1"/>
-    <w:lsdException w:name="index 4" w:semiHidden="1" w:unhideWhenUsed="1"/>
-    <w:lsdException w:name="index 5" w:semiHidden="1" w:unhideWhenUsed="1"/>
-    <w:lsdException w:name="index 6" w:semiHidden="1" w:unhideWhenUsed="1"/>
-    <w:lsdException w:name="index 7" w:semiHidden="1" w:unhideWhenUsed="1"/>
-    <w:lsdException w:name="index 8" w:semiHidden="1" w:unhideWhenUsed="1"/>
-    <w:lsdException w:name="index 9" w:semiHidden="1" w:unhideWhenUsed="1"/>
-    <w:lsdException w:name="toc 1" w:semiHidden="1" w:uiPriority="39" w:unhideWhenUsed="1"/>
-    <w:lsdException w:name="toc 2" w:semiHidden="1" w:uiPriority="39" w:unhideWhenUsed="1"/>
-    <w:lsdException w:name="toc 3" w:semiHidden="1" w:uiPriority="39" w:unhideWhenUsed="1"/>
-    <w:lsdException w:name="toc 4" w:semiHidden="1" w:uiPriority="39" w:unhideWhenUsed="1"/>
-    <w:lsdException w:name="toc 5" w:semiHidden="1" w:uiPriority="39" w:unhideWhenUsed="1"/>
-    <w:lsdException w:name="toc 6" w:semiHidden="1" w:uiPriority="39" w:unhideWhenUsed="1"/>
-    <w:lsdException w:name="toc 7" w:semiHidden="1" w:uiPriority="39" w:unhideWhenUsed="1"/>
-    <w:lsdException w:name="toc 8" w:semiHidden="1" w:uiPriority="39" w:unhideWhenUsed="1"/>
-    <w:lsdException w:name="toc 9" w:semiHidden="1" w:uiPriority="39" w:unhideWhenUsed="1"/>
-    <w:lsdException w:name="Normal Indent" w:semiHidden="1" w:unhideWhenUsed="1"/>
-    <w:lsdException w:name="footnote text" w:semiHidden="1" w:unhideWhenUsed="1"/>
-    <w:lsdException w:name="annotation text" w:semiHidden="1" w:unhideWhenUsed="1"/>
-    <w:lsdException w:name="header" w:semiHidden="1" w:unhideWhenUsed="1"/>
-    <w:lsdException w:name="footer" w:semiHidden="1" w:unhideWhenUsed="1"/>
-    <w:lsdException w:name="index heading" w:semiHidden="1" w:unhideWhenUsed="1"/>
-    <w:lsdException w:name="caption" w:semiHidden="1" w:uiPriority="35" w:unhideWhenUsed="1" w:qFormat="1"/>
-    <w:lsdException w:name="table of figures" w:semiHidden="1" w:unhideWhenUsed="1"/>
-    <w:lsdException w:name="envelope address" w:semiHidden="1" w:unhideWhenUsed="1"/>
-    <w:lsdException w:name="envelope return" w:semiHidden="1" w:unhideWhenUsed="1"/>
-    <w:lsdException w:name="footnote reference" w:semiHidden="1" w:unhideWhenUsed="1"/>
-    <w:lsdException w:name="annotation reference" w:semiHidden="1" w:unhideWhenUsed="1"/>
-    <w:lsdException w:name="line number" w:semiHidden="1" w:unhideWhenUsed="1"/>
-    <w:lsdException w:name="page number" w:semiHidden="1" w:unhideWhenUsed="1"/>
-    <w:lsdException w:name="endnote reference" w:semiHidden="1" w:unhideWhenUsed="1"/>
-    <w:lsdException w:name="endnote text" w:semiHidden="1" w:unhideWhenUsed="1"/>
-    <w:lsdException w:name="table of authorities" w:semiHidden="1" w:unhideWhenUsed="1"/>
-    <w:lsdException w:name="macro" w:semiHidden="1" w:unhideWhenUsed="1"/>
-    <w:lsdException w:name="toa heading" w:semiHidden="1" w:unhideWhenUsed="1"/>
-    <w:lsdException w:name="List" w:semiHidden="1" w:unhideWhenUsed="1"/>
-    <w:lsdException w:name="List Bullet" w:semiHidden="1" w:unhideWhenUsed="1"/>
-    <w:lsdException w:name="List Number" w:semiHidden="1" w:unhideWhenUsed="1"/>
-    <w:lsdException w:name="List 2" w:semiHidden="1" w:unhideWhenUsed="1"/>
-    <w:lsdException w:name="List 3" w:semiHidden="1" w:unhideWhenUsed="1"/>
-    <w:lsdException w:name="List 4" w:semiHidden="1" w:unhideWhenUsed="1"/>
-    <w:lsdException w:name="List 5" w:semiHidden="1" w:unhideWhenUsed="1"/>
-    <w:lsdException w:name="List Bullet 2" w:semiHidden="1" w:unhideWhenUsed="1"/>
-    <w:lsdException w:name="List Bullet 3" w:semiHidden="1" w:unhideWhenUsed="1"/>
-    <w:lsdException w:name="List Bullet 4" w:semiHidden="1" w:unhideWhenUsed="1"/>
-    <w:lsdException w:name="List Bullet 5" w:semiHidden="1" w:unhideWhenUsed="1"/>
-    <w:lsdException w:name="List Number 2" w:semiHidden="1" w:unhideWhenUsed="1"/>
-    <w:lsdException w:name="List Number 3" w:semiHidden="1" w:unhideWhenUsed="1"/>
-    <w:lsdException w:name="List Number 4" w:semiHidden="1" w:unhideWhenUsed="1"/>
-    <w:lsdException w:name="List Number 5" w:semiHidden="1" w:unhideWhenUsed="1"/>
-    <w:lsdException w:name="Title" w:uiPriority="10" w:qFormat="1"/>
-    <w:lsdException w:name="Closing" w:semiHidden="1" w:unhideWhenUsed="1"/>
-    <w:lsdException w:name="Signature" w:semiHidden="1" w:unhideWhenUsed="1"/>
-    <w:lsdException w:name="Default Paragraph Font" w:semiHidden="1" w:uiPriority="1" w:unhideWhenUsed="1"/>
-    <w:lsdException w:name="Body Text" w:semiHidden="1" w:unhideWhenUsed="1"/>
-    <w:lsdException w:name="Body Text Indent" w:semiHidden="1" w:unhideWhenUsed="1"/>
-    <w:lsdException w:name="List Continue" w:semiHidden="1" w:unhideWhenUsed="1"/>
-    <w:lsdException w:name="List Continue 2" w:semiHidden="1" w:unhideWhenUsed="1"/>
-    <w:lsdException w:name="List Continue 3" w:semiHidden="1" w:unhideWhenUsed="1"/>
-    <w:lsdException w:name="List Continue 4" w:semiHidden="1" w:unhideWhenUsed="1"/>
-    <w:lsdException w:name="List Continue 5" w:semiHidden="1" w:unhideWhenUsed="1"/>
-    <w:lsdException w:name="Message Header" w:semiHidden="1" w:unhideWhenUsed="1"/>
-    <w:lsdException w:name="Subtitle" w:uiPriority="11" w:qFormat="1"/>
-    <w:lsdException w:name="Salutation" w:semiHidden="1" w:unhideWhenUsed="1"/>
-    <w:lsdException w:name="Date" w:semiHidden="1" w:unhideWhenUsed="1"/>
-    <w:lsdException w:name="Body Text First Indent" w:semiHidden="1" w:unhideWhenUsed="1"/>
-    <w:lsdException w:name="Body Text First Indent 2" w:semiHidden="1" w:unhideWhenUsed="1"/>
-    <w:lsdException w:name="Note Heading" w:semiHidden="1" w:unhideWhenUsed="1"/>
-    <w:lsdException w:name="Body Text 2" w:semiHidden="1" w:unhideWhenUsed="1"/>
-    <w:lsdException w:name="Body Text 3" w:semiHidden="1" w:unhideWhenUsed="1"/>
-    <w:lsdException w:name="Body Text Indent 2" w:semiHidden="1" w:unhideWhenUsed="1"/>
-    <w:lsdException w:name="Body Text Indent 3" w:semiHidden="1" w:unhideWhenUsed="1"/>
-    <w:lsdException w:name="Block Text" w:semiHidden="1" w:unhideWhenUsed="1"/>
-    <w:lsdException w:name="Hyperlink" w:semiHidden="1" w:unhideWhenUsed="1"/>
-    <w:lsdException w:name="FollowedHyperlink" w:semiHidden="1" w:unhideWhenUsed="1"/>
-    <w:lsdException w:name="Strong" w:uiPriority="22" w:qFormat="1"/>
-    <w:lsdException w:name="Emphasis" w:uiPriority="20" w:qFormat="1"/>
-    <w:lsdException w:name="Document Map" w:semiHidden="1" w:unhideWhenUsed="1"/>
-    <w:lsdException w:name="Plain Text" w:semiHidden="1" w:unhideWhenUsed="1"/>
-    <w:lsdException w:name="E-mail Signature" w:semiHidden="1" w:unhideWhenUsed="1"/>
-    <w:lsdException w:name="HTML Top of Form" w:semiHidden="1" w:unhideWhenUsed="1"/>
-    <w:lsdException w:name="HTML Bottom of Form" w:semiHidden="1" w:unhideWhenUsed="1"/>
-    <w:lsdException w:name="Normal (Web)" w:semiHidden="1" w:unhideWhenUsed="1"/>
-    <w:lsdException w:name="HTML Acronym" w:semiHidden="1" w:unhideWhenUsed="1"/>
-    <w:lsdException w:name="HTML Address" w:semiHidden="1" w:unhideWhenUsed="1"/>
-    <w:lsdException w:name="HTML Cite" w:semiHidden="1" w:unhideWhenUsed="1"/>
-    <w:lsdException w:name="HTML Code" w:semiHidden="1" w:unhideWhenUsed="1"/>
-    <w:lsdException w:name="HTML Definition" w:semiHidden="1" w:unhideWhenUsed="1"/>
-    <w:lsdException w:name="HTML Keyboard" w:semiHidden="1" w:unhideWhenUsed="1"/>
-    <w:lsdException w:name="HTML Preformatted" w:semiHidden="1" w:unhideWhenUsed="1"/>
-    <w:lsdException w:name="HTML Sample" w:semiHidden="1" w:unhideWhenUsed="1"/>
-    <w:lsdException w:name="HTML Typewriter" w:semiHidden="1" w:unhideWhenUsed="1"/>
-    <w:lsdException w:name="HTML Variable" w:semiHidden="1" w:unhideWhenUsed="1"/>
-    <w:lsdException w:name="Normal Table" w:semiHidden="1" w:unhideWhenUsed="1"/>
-    <w:lsdException w:name="annotation subject" w:semiHidden="1" w:unhideWhenUsed="1"/>
-    <w:lsdException w:name="No List" w:semiHidden="1" w:unhideWhenUsed="1"/>
-    <w:lsdException w:name="Outline List 1" w:semiHidden="1" w:unhideWhenUsed="1"/>
-    <w:lsdException w:name="Outline List 2" w:semiHidden="1" w:unhideWhenUsed="1"/>
-    <w:lsdException w:name="Outline List 3" w:semiHidden="1" w:unhideWhenUsed="1"/>
-    <w:lsdException w:name="Table Simple 1" w:semiHidden="1" w:unhideWhenUsed="1"/>
-    <w:lsdException w:name="Table Simple 2" w:semiHidden="1" w:unhideWhenUsed="1"/>
-    <w:lsdException w:name="Table Simple 3" w:semiHidden="1" w:unhideWhenUsed="1"/>
-    <w:lsdException w:name="Table Classic 1" w:semiHidden="1" w:unhideWhenUsed="1"/>
-    <w:lsdException w:name="Table Classic 2" w:semiHidden="1" w:unhideWhenUsed="1"/>
-    <w:lsdException w:name="Table Classic 3" w:semiHidden="1" w:unhideWhenUsed="1"/>
-    <w:lsdException w:name="Table Classic 4" w:semiHidden="1" w:unhideWhenUsed="1"/>
-    <w:lsdException w:name="Table Colorful 1" w:semiHidden="1" w:unhideWhenUsed="1"/>
-    <w:lsdException w:name="Table Colorful 2" w:semiHidden="1" w:unhideWhenUsed="1"/>
-    <w:lsdException w:name="Table Colorful 3" w:semiHidden="1" w:unhideWhenUsed="1"/>
-    <w:lsdException w:name="Table Columns 1" w:semiHidden="1" w:unhideWhenUsed="1"/>
-    <w:lsdException w:name="Table Columns 2" w:semiHidden="1" w:unhideWhenUsed="1"/>
-    <w:lsdException w:name="Table Columns 3" w:semiHidden="1" w:unhideWhenUsed="1"/>
-    <w:lsdException w:name="Table Columns 4" w:semiHidden="1" w:unhideWhenUsed="1"/>
-    <w:lsdException w:name="Table Columns 5" w:semiHidden="1" w:unhideWhenUsed="1"/>
-    <w:lsdException w:name="Table Grid 1" w:semiHidden="1" w:unhideWhenUsed="1"/>
-    <w:lsdException w:name="Table Grid 2" w:semiHidden="1" w:unhideWhenUsed="1"/>
-    <w:lsdException w:name="Table Grid 3" w:semiHidden="1" w:unhideWhenUsed="1"/>
-    <w:lsdException w:name="Table Grid 4" w:semiHidden="1" w:unhideWhenUsed="1"/>
-    <w:lsdException w:name="Table Grid 5" w:semiHidden="1" w:unhideWhenUsed="1"/>
-    <w:lsdException w:name="Table Grid 6" w:semiHidden="1" w:unhideWhenUsed="1"/>
-    <w:lsdException w:name="Table Grid 7" w:semiHidden="1" w:unhideWhenUsed="1"/>
-    <w:lsdException w:name="Table Grid 8" w:semiHidden="1" w:unhideWhenUsed="1"/>
-    <w:lsdException w:name="Table List 1" w:semiHidden="1" w:unhideWhenUsed="1"/>
-    <w:lsdException w:name="Table List 2" w:semiHidden="1" w:unhideWhenUsed="1"/>
-    <w:lsdException w:name="Table List 3" w:semiHidden="1" w:unhideWhenUsed="1"/>
-    <w:lsdException w:name="Table List 4" w:semiHidden="1" w:unhideWhenUsed="1"/>
-    <w:lsdException w:name="Table List 5" w:semiHidden="1" w:unhideWhenUsed="1"/>
-    <w:lsdException w:name="Table List 6" w:semiHidden="1" w:unhideWhenUsed="1"/>
-    <w:lsdException w:name="Table List 7" w:semiHidden="1" w:unhideWhenUsed="1"/>
-    <w:lsdException w:name="Table List 8" w:semiHidden="1" w:unhideWhenUsed="1"/>
-    <w:lsdException w:name="Table 3D effects 1" w:semiHidden="1" w:unhideWhenUsed="1"/>
-    <w:lsdException w:name="Table 3D effects 2" w:semiHidden="1" w:unhideWhenUsed="1"/>
-    <w:lsdException w:name="Table 3D effects 3" w:semiHidden="1" w:unhideWhenUsed="1"/>
-    <w:lsdException w:name="Table Contemporary" w:semiHidden="1" w:unhideWhenUsed="1"/>
-    <w:lsdException w:name="Table Elegant" w:semiHidden="1" w:unhideWhenUsed="1"/>
-    <w:lsdException w:name="Table Professional" w:semiHidden="1" w:unhideWhenUsed="1"/>
-    <w:lsdException w:name="Table Subtle 1" w:semiHidden="1" w:unhideWhenUsed="1"/>
-    <w:lsdException w:name="Table Subtle 2" w:semiHidden="1" w:unhideWhenUsed="1"/>
-    <w:lsdException w:name="Table Web 1" w:semiHidden="1" w:unhideWhenUsed="1"/>
-    <w:lsdException w:name="Table Web 2" w:semiHidden="1" w:unhideWhenUsed="1"/>
-    <w:lsdException w:name="Table Web 3" w:semiHidden="1" w:unhideWhenUsed="1"/>
-    <w:lsdException w:name="Balloon Text" w:semiHidden="1" w:unhideWhenUsed="1"/>
-    <w:lsdException w:name="Table Grid" w:uiPriority="39"/>
-    <w:lsdException w:name="Table Theme" w:semiHidden="1" w:unhideWhenUsed="1"/>
-    <w:lsdException w:name="Placeholder Text" w:semiHidden="1"/>
-    <w:lsdException w:name="No Spacing" w:uiPriority="1" w:qFormat="1"/>
-    <w:lsdException w:name="Light Shading" w:uiPriority="60"/>
-    <w:lsdException w:name="Light List" w:uiPriority="61"/>
-    <w:lsdException w:name="Light Grid" w:uiPriority="62"/>
-    <w:lsdException w:name="Medium Shading 1" w:uiPriority="63"/>
-    <w:lsdException w:name="Medium Shading 2" w:uiPriority="64"/>
-    <w:lsdException w:name="Medium List 1" w:uiPriority="65"/>
-    <w:lsdException w:name="Medium List 2" w:uiPriority="66"/>
-    <w:lsdException w:name="Medium Grid 1" w:uiPriority="67"/>
-    <w:lsdException w:name="Medium Grid 2" w:uiPriority="68"/>
-    <w:lsdException w:name="Medium Grid 3" w:uiPriority="69"/>
-    <w:lsdException w:name="Dark List" w:uiPriority="70"/>
-    <w:lsdException w:name="Colorful Shading" w:uiPriority="71"/>
-    <w:lsdException w:name="Colorful List" w:uiPriority="72"/>
-    <w:lsdException w:name="Colorful Grid" w:uiPriority="73"/>
-    <w:lsdException w:name="Light Shading Accent 1" w:uiPriority="60"/>
-    <w:lsdException w:name="Light List Accent 1" w:uiPriority="61"/>
-    <w:lsdException w:name="Light Grid Accent 1" w:uiPriority="62"/>
-    <w:lsdException w:name="Medium Shading 1 Accent 1" w:uiPriority="63"/>
-    <w:lsdException w:name="Medium Shading 2 Accent 1" w:uiPriority="64"/>
-    <w:lsdException w:name="Medium List 1 Accent 1" w:uiPriority="65"/>
-    <w:lsdException w:name="Revision" w:semiHidden="1"/>
-    <w:lsdException w:name="List Paragraph" w:uiPriority="34" w:qFormat="1"/>
-    <w:lsdException w:name="Quote" w:uiPriority="29" w:qFormat="1"/>
-    <w:lsdException w:name="Intense Quote" w:uiPriority="30" w:qFormat="1"/>
-    <w:lsdException w:name="Medium List 2 Accent 1" w:uiPriority="66"/>
-    <w:lsdException w:name="Medium Grid 1 Accent 1" w:uiPriority="67"/>
-    <w:lsdException w:name="Medium Grid 2 Accent 1" w:uiPriority="68"/>
-    <w:lsdException w:name="Medium Grid 3 Accent 1" w:uiPriority="69"/>
-    <w:lsdException w:name="Dark List Accent 1" w:uiPriority="70"/>
-    <w:lsdException w:name="Colorful Shading Accent 1" w:uiPriority="71"/>
-    <w:lsdException w:name="Colorful List Accent 1" w:uiPriority="72"/>
-    <w:lsdException w:name="Colorful Grid Accent 1" w:uiPriority="73"/>
-    <w:lsdException w:name="Light Shading Accent 2" w:uiPriority="60"/>
-    <w:lsdException w:name="Light List Accent 2" w:uiPriority="61"/>
-    <w:lsdException w:name="Light Grid Accent 2" w:uiPriority="62"/>
-    <w:lsdException w:name="Medium Shading 1 Accent 2" w:uiPriority="63"/>
-    <w:lsdException w:name="Medium Shading 2 Accent 2" w:uiPriority="64"/>
-    <w:lsdException w:name="Medium List 1 Accent 2" w:uiPriority="65"/>
-    <w:lsdException w:name="Medium List 2 Accent 2" w:uiPriority="66"/>
-    <w:lsdException w:name="Medium Grid 1 Accent 2" w:uiPriority="67"/>
-    <w:lsdException w:name="Medium Grid 2 Accent 2" w:uiPriority="68"/>
-    <w:lsdException w:name="Medium Grid 3 Accent 2" w:uiPriority="69"/>
-    <w:lsdException w:name="Dark List Accent 2" w:uiPriority="70"/>
-    <w:lsdException w:name="Colorful Shading Accent 2" w:uiPriority="71"/>
-    <w:lsdException w:name="Colorful List Accent 2" w:uiPriority="72"/>
-    <w:lsdException w:name="Colorful Grid Accent 2" w:uiPriority="73"/>
-    <w:lsdException w:name="Light Shading Accent 3" w:uiPriority="60"/>
-    <w:lsdException w:name="Light List Accent 3" w:uiPriority="61"/>
-    <w:lsdException w:name="Light Grid Accent 3" w:uiPriority="62"/>
-    <w:lsdException w:name="Medium Shading 1 Accent 3" w:uiPriority="63"/>
-    <w:lsdException w:name="Medium Shading 2 Accent 3" w:uiPriority="64"/>
-    <w:lsdException w:name="Medium List 1 Accent 3" w:uiPriority="65"/>
-    <w:lsdException w:name="Medium List 2 Accent 3" w:uiPriority="66"/>
-    <w:lsdException w:name="Medium Grid 1 Accent 3" w:uiPriority="67"/>
-    <w:lsdException w:name="Medium Grid 2 Accent 3" w:uiPriority="68"/>
-    <w:lsdException w:name="Medium Grid 3 Accent 3" w:uiPriority="69"/>
-    <w:lsdException w:name="Dark List Accent 3" w:uiPriority="70"/>
-    <w:lsdException w:name="Colorful Shading Accent 3" w:uiPriority="71"/>
-    <w:lsdException w:name="Colorful List Accent 3" w:uiPriority="72"/>
-    <w:lsdException w:name="Colorful Grid Accent 3" w:uiPriority="73"/>
-    <w:lsdException w:name="Light Shading Accent 4" w:uiPriority="60"/>
-    <w:lsdException w:name="Light List Accent 4" w:uiPriority="61"/>
-    <w:lsdException w:name="Light Grid Accent 4" w:uiPriority="62"/>
-    <w:lsdException w:name="Medium Shading 1 Accent 4" w:uiPriority="63"/>
-    <w:lsdException w:name="Medium Shading 2 Accent 4" w:uiPriority="64"/>
-    <w:lsdException w:name="Medium List 1 Accent 4" w:uiPriority="65"/>
-    <w:lsdException w:name="Medium List 2 Accent 4" w:uiPriority="66"/>
-    <w:lsdException w:name="Medium Grid 1 Accent 4" w:uiPriority="67"/>
-    <w:lsdException w:name="Medium Grid 2 Accent 4" w:uiPriority="68"/>
-    <w:lsdException w:name="Medium Grid 3 Accent 4" w:uiPriority="69"/>
-    <w:lsdException w:name="Dark List Accent 4" w:uiPriority="70"/>
-    <w:lsdException w:name="Colorful Shading Accent 4" w:uiPriority="71"/>
-    <w:lsdException w:name="Colorful List Accent 4" w:uiPriority="72"/>
-    <w:lsdException w:name="Colorful Grid Accent 4" w:uiPriority="73"/>
-    <w:lsdException w:name="Light Shading Accent 5" w:uiPriority="60"/>
-    <w:lsdException w:name="Light List Accent 5" w:uiPriority="61"/>
-    <w:lsdException w:name="Light Grid Accent 5" w:uiPriority="62"/>
-    <w:lsdException w:name="Medium Shading 1 Accent 5" w:uiPriority="63"/>
-    <w:lsdException w:name="Medium Shading 2 Accent 5" w:uiPriority="64"/>
-    <w:lsdException w:name="Medium List 1 Accent 5" w:uiPriority="65"/>
-    <w:lsdException w:name="Medium List 2 Accent 5" w:uiPriority="66"/>
-    <w:lsdException w:name="Medium Grid 1 Accent 5" w:uiPriority="67"/>
-    <w:lsdException w:name="Medium Grid 2 Accent 5" w:uiPriority="68"/>
-    <w:lsdException w:name="Medium Grid 3 Accent 5" w:uiPriority="69"/>
-    <w:lsdException w:name="Dark List Accent 5" w:uiPriority="70"/>
-    <w:lsdException w:name="Colorful Shading Accent 5" w:uiPriority="71"/>
-    <w:lsdException w:name="Colorful List Accent 5" w:uiPriority="72"/>
-    <w:lsdException w:name="Colorful Grid Accent 5" w:uiPriority="73"/>
-    <w:lsdException w:name="Light Shading Accent 6" w:uiPriority="60"/>
-    <w:lsdException w:name="Light List Accent 6" w:uiPriority="61"/>
-    <w:lsdException w:name="Light Grid Accent 6" w:uiPriority="62"/>
-    <w:lsdException w:name="Medium Shading 1 Accent 6" w:uiPriority="63"/>
-    <w:lsdException w:name="Medium Shading 2 Accent 6" w:uiPriority="64"/>
-    <w:lsdException w:name="Medium List 1 Accent 6" w:uiPriority="65"/>
-    <w:lsdException w:name="Medium List 2 Accent 6" w:uiPriority="66"/>
-    <w:lsdException w:name="Medium Grid 1 Accent 6" w:uiPriority="67"/>
-    <w:lsdException w:name="Medium Grid 2 Accent 6" w:uiPriority="68"/>
-    <w:lsdException w:name="Medium Grid 3 Accent 6" w:uiPriority="69"/>
-    <w:lsdException w:name="Dark List Accent 6" w:uiPriority="70"/>
-    <w:lsdException w:name="Colorful Shading Accent 6" w:uiPriority="71"/>
-    <w:lsdException w:name="Colorful List Accent 6" w:uiPriority="72"/>
-    <w:lsdException w:name="Colorful Grid Accent 6" w:uiPriority="73"/>
-    <w:lsdException w:name="Subtle Emphasis" w:uiPriority="19" w:qFormat="1"/>
-    <w:lsdException w:name="Intense Emphasis" w:uiPriority="21" w:qFormat="1"/>
-    <w:lsdException w:name="Subtle Reference" w:uiPriority="31" w:qFormat="1"/>
-    <w:lsdException w:name="Intense Reference" w:uiPriority="32" w:qFormat="1"/>
-    <w:lsdException w:name="Book Title" w:uiPriority="33" w:qFormat="1"/>
-    <w:lsdException w:name="Bibliography" w:semiHidden="1" w:uiPriority="37" w:unhideWhenUsed="1"/>
-    <w:lsdException w:name="TOC Heading" w:semiHidden="1" w:uiPriority="39" w:unhideWhenUsed="1" w:qFormat="1"/>
-    <w:lsdException w:name="Plain Table 1" w:uiPriority="41"/>
-    <w:lsdException w:name="Plain Table 2" w:uiPriority="42"/>
-    <w:lsdException w:name="Plain Table 3" w:uiPriority="43"/>
-    <w:lsdException w:name="Plain Table 4" w:uiPriority="44"/>
-    <w:lsdException w:name="Plain Table 5" w:uiPriority="45"/>
-    <w:lsdException w:name="Grid Table Light" w:uiPriority="40"/>
-    <w:lsdException w:name="Grid Table 1 Light" w:uiPriority="46"/>
-    <w:lsdException w:name="Grid Table 2" w:uiPriority="47"/>
-    <w:lsdException w:name="Grid Table 3" w:uiPriority="48"/>
-    <w:lsdException w:name="Grid Table 4" w:uiPriority="49"/>
-    <w:lsdException w:name="Grid Table 5 Dark" w:uiPriority="50"/>
-    <w:lsdException w:name="Grid Table 6 Colorful" w:uiPriority="51"/>
-    <w:lsdException w:name="Grid Table 7 Colorful" w:uiPriority="52"/>
-    <w:lsdException w:name="Grid Table 1 Light Accent 1" w:uiPriority="46"/>
-    <w:lsdException w:name="Grid Table 2 Accent 1" w:uiPriority="47"/>
-    <w:lsdException w:name="Grid Table 3 Accent 1" w:uiPriority="48"/>
-    <w:lsdException w:name="Grid Table 4 Accent 1" w:uiPriority="49"/>
-    <w:lsdException w:name="Grid Table 5 Dark Accent 1" w:uiPriority="50"/>
-    <w:lsdException w:name="Grid Table 6 Colorful Accent 1" w:uiPriority="51"/>
-    <w:lsdException w:name="Grid Table 7 Colorful Accent 1" w:uiPriority="52"/>
-    <w:lsdException w:name="Grid Table 1 Light Accent 2" w:uiPriority="46"/>
-    <w:lsdException w:name="Grid Table 2 Accent 2" w:uiPriority="47"/>
-    <w:lsdException w:name="Grid Table 3 Accent 2" w:uiPriority="48"/>
-    <w:lsdException w:name="Grid Table 4 Accent 2" w:uiPriority="49"/>
-    <w:lsdException w:name="Grid Table 5 Dark Accent 2" w:uiPriority="50"/>
-    <w:lsdException w:name="Grid Table 6 Colorful Accent 2" w:uiPriority="51"/>
-    <w:lsdException w:name="Grid Table 7 Colorful Accent 2" w:uiPriority="52"/>
-    <w:lsdException w:name="Grid Table 1 Light Accent 3" w:uiPriority="46"/>
-    <w:lsdException w:name="Grid Table 2 Accent 3" w:uiPriority="47"/>
-    <w:lsdException w:name="Grid Table 3 Accent 3" w:uiPriority="48"/>
-    <w:lsdException w:name="Grid Table 4 Accent 3" w:uiPriority="49"/>
-    <w:lsdException w:name="Grid Table 5 Dark Accent 3" w:uiPriority="50"/>
-    <w:lsdException w:name="Grid Table 6 Colorful Accent 3" w:uiPriority="51"/>
-    <w:lsdException w:name="Grid Table 7 Colorful Accent 3" w:uiPriority="52"/>
-    <w:lsdException w:name="Grid Table 1 Light Accent 4" w:uiPriority="46"/>
-    <w:lsdException w:name="Grid Table 2 Accent 4" w:uiPriority="47"/>
-    <w:lsdException w:name="Grid Table 3 Accent 4" w:uiPriority="48"/>
-    <w:lsdException w:name="Grid Table 4 Accent 4" w:uiPriority="49"/>
-    <w:lsdException w:name="Grid Table 5 Dark Accent 4" w:uiPriority="50"/>
-    <w:lsdException w:name="Grid Table 6 Colorful Accent 4" w:uiPriority="51"/>
-    <w:lsdException w:name="Grid Table 7 Colorful Accent 4" w:uiPriority="52"/>
-    <w:lsdException w:name="Grid Table 1 Light Accent 5" w:uiPriority="46"/>
-    <w:lsdException w:name="Grid Table 2 Accent 5" w:uiPriority="47"/>
-    <w:lsdException w:name="Grid Table 3 Accent 5" w:uiPriority="48"/>
-    <w:lsdException w:name="Grid Table 4 Accent 5" w:uiPriority="49"/>
-    <w:lsdException w:name="Grid Table 5 Dark Accent 5" w:uiPriority="50"/>
-    <w:lsdException w:name="Grid Table 6 Colorful Accent 5" w:uiPriority="51"/>
-    <w:lsdException w:name="Grid Table 7 Colorful Accent 5" w:uiPriority="52"/>
-    <w:lsdException w:name="Grid Table 1 Light Accent 6" w:uiPriority="46"/>
-    <w:lsdException w:name="Grid Table 2 Accent 6" w:uiPriority="47"/>
-    <w:lsdException w:name="Grid Table 3 Accent 6" w:uiPriority="48"/>
-    <w:lsdException w:name="Grid Table 4 Accent 6" w:uiPriority="49"/>
-    <w:lsdException w:name="Grid Table 5 Dark Accent 6" w:uiPriority="50"/>
-    <w:lsdException w:name="Grid Table 6 Colorful Accent 6" w:uiPriority="51"/>
-    <w:lsdException w:name="Grid Table 7 Colorful Accent 6" w:uiPriority="52"/>
-    <w:lsdException w:name="List Table 1 Light" w:uiPriority="46"/>
-    <w:lsdException w:name="List Table 2" w:uiPriority="47"/>
-    <w:lsdException w:name="List Table 3" w:uiPriority="48"/>
-    <w:lsdException w:name="List Table 4" w:uiPriority="49"/>
-    <w:lsdException w:name="List Table 5 Dark" w:uiPriority="50"/>
-    <w:lsdException w:name="List Table 6 Colorful" w:uiPriority="51"/>
-    <w:lsdException w:name="List Table 7 Colorful" w:uiPriority="52"/>
-    <w:lsdException w:name="List Table 1 Light Accent 1" w:uiPriority="46"/>
-    <w:lsdException w:name="List Table 2 Accent 1" w:uiPriority="47"/>
-    <w:lsdException w:name="List Table 3 Accent 1" w:uiPriority="48"/>
-    <w:lsdException w:name="List Table 4 Accent 1" w:uiPriority="49"/>
-    <w:lsdException w:name="List Table 5 Dark Accent 1" w:uiPriority="50"/>
-    <w:lsdException w:name="List Table 6 Colorful Accent 1" w:uiPriority="51"/>
-    <w:lsdException w:name="List Table 7 Colorful Accent 1" w:uiPriority="52"/>
-    <w:lsdException w:name="List Table 1 Light Accent 2" w:uiPriority="46"/>
-    <w:lsdException w:name="List Table 2 Accent 2" w:uiPriority="47"/>
-    <w:lsdException w:name="List Table 3 Accent 2" w:uiPriority="48"/>
-    <w:lsdException w:name="List Table 4 Accent 2" w:uiPriority="49"/>
-    <w:lsdException w:name="List Table 5 Dark Accent 2" w:uiPriority="50"/>
-    <w:lsdException w:name="List Table 6 Colorful Accent 2" w:uiPriority="51"/>
-    <w:lsdException w:name="List Table 7 Colorful Accent 2" w:uiPriority="52"/>
-    <w:lsdException w:name="List Table 1 Light Accent 3" w:uiPriority="46"/>
-    <w:lsdException w:name="List Table 2 Accent 3" w:uiPriority="47"/>
-    <w:lsdException w:name="List Table 3 Accent 3" w:uiPriority="48"/>
-    <w:lsdException w:name="List Table 4 Accent 3" w:uiPriority="49"/>
-    <w:lsdException w:name="List Table 5 Dark Accent 3" w:uiPriority="50"/>
-    <w:lsdException w:name="List Table 6 Colorful Accent 3" w:uiPriority="51"/>
-    <w:lsdException w:name="List Table 7 Colorful Accent 3" w:uiPriority="52"/>
-    <w:lsdException w:name="List Table 1 Light Accent 4" w:uiPriority="46"/>
-    <w:lsdException w:name="List Table 2 Accent 4" w:uiPriority="47"/>
-    <w:lsdException w:name="List Table 3 Accent 4" w:uiPriority="48"/>
-    <w:lsdException w:name="List Table 4 Accent 4" w:uiPriority="49"/>
-    <w:lsdException w:name="List Table 5 Dark Accent 4" w:uiPriority="50"/>
-    <w:lsdException w:name="List Table 6 Colorful Accent 4" w:uiPriority="51"/>
-    <w:lsdException w:name="List Table 7 Colorful Accent 4" w:uiPriority="52"/>
-    <w:lsdException w:name="List Table 1 Light Accent 5" w:uiPriority="46"/>
-    <w:lsdException w:name="List Table 2 Accent 5" w:uiPriority="47"/>
-    <w:lsdException w:name="List Table 3 Accent 5" w:uiPriority="48"/>
-    <w:lsdException w:name="List Table 4 Accent 5" w:uiPriority="49"/>
-    <w:lsdException w:name="List Table 5 Dark Accent 5" w:uiPriority="50"/>
-    <w:lsdException w:name="List Table 6 Colorful Accent 5" w:uiPriority="51"/>
-    <w:lsdException w:name="List Table 7 Colorful Accent 5" w:uiPriority="52"/>
-    <w:lsdException w:name="List Table 1 Light Accent 6" w:uiPriority="46"/>
-    <w:lsdException w:name="List Table 2 Accent 6" w:uiPriority="47"/>
-    <w:lsdException w:name="List Table 3 Accent 6" w:uiPriority="48"/>
-    <w:lsdException w:name="List Table 4 Accent 6" w:uiPriority="49"/>
-    <w:lsdException w:name="List Table 5 Dark Accent 6" w:uiPriority="50"/>
-    <w:lsdException w:name="List Table 6 Colorful Accent 6" w:uiPriority="51"/>
-    <w:lsdException w:name="List Table 7 Colorful Accent 6" w:uiPriority="52"/>
-  </w:latentStyles>
-  <w:style w:type="paragraph" w:default="1" w:styleId="Normal">
-    <w:name w:val="Normal"/>
-    <w:qFormat/>
-  </w:style>
-  <w:style w:type="character" w:default="1" w:styleId="DefaultParagraphFont">
-    <w:name w:val="Default Paragraph Font"/>
-    <w:uiPriority w:val="1"/>
-    <w:semiHidden/>
-    <w:unhideWhenUsed/>
-  </w:style>
-  <w:style w:type="table" w:default="1" w:styleId="TableNormal">
-    <w:name w:val="Normal Table"/>
-    <w:uiPriority w:val="99"/>
-    <w:semiHidden/>
-    <w:unhideWhenUsed/>
-    <w:tblPr>
-      <w:tblInd w:w="0" w:type="dxa"/>
-      <w:tblCellMar>
-        <w:top w:w="0" w:type="dxa"/>
-        <w:left w:w="108" w:type="dxa"/>
-        <w:bottom w:w="0" w:type="dxa"/>
-        <w:right w:w="108" w:type="dxa"/>
-      </w:tblCellMar>
-    </w:tblPr>
-  </w:style>
-  <w:style w:type="numbering" w:default="1" w:styleId="NoList">
-    <w:name w:val="No List"/>
-    <w:uiPriority w:val="99"/>
-    <w:semiHidden/>
-    <w:unhideWhenUsed/>
-  </w:style>
-  <w:style w:type="character" w:styleId="PlaceholderText">
-    <w:name w:val="Placeholder Text"/>
-    <w:basedOn w:val="DefaultParagraphFont"/>
-    <w:uiPriority w:val="99"/>
-    <w:semiHidden/>
-    <w:rsid w:val="00BE5985"/>
-    <w:rPr>
-      <w:color w:val="808080"/>
-    </w:rPr>
-  </w:style>
-</w:styles>
-</file>
-
-<file path=word/glossary/webSettings.xml><?xml version="1.0" encoding="utf-8"?>
-<w:webSettings xmlns:mc="http://schemas.openxmlformats.org/markup-compatibility/2006" xmlns:r="http://schemas.openxmlformats.org/officeDocument/2006/relationships" xmlns:w="http://schemas.openxmlformats.org/wordprocessingml/2006/main" xmlns:w14="http://schemas.microsoft.com/office/word/2010/wordml" xmlns:w15="http://schemas.microsoft.com/office/word/2012/wordml" xmlns:w16se="http://schemas.microsoft.com/office/word/2015/wordml/symex" mc:Ignorable="w14 w15 w16se">
-  <w:optimizeForBrowser/>
-  <w:allowPNG/>
-</w:webSettings>
 </file>
 
 <file path=word/theme/theme1.xml><?xml version="1.0" encoding="utf-8"?>
@@ -12177,7 +13749,7 @@
 </file>
 
 <file path=customXml/itemProps1.xml><?xml version="1.0" encoding="utf-8"?>
-<ds:datastoreItem xmlns:ds="http://schemas.openxmlformats.org/officeDocument/2006/customXml" ds:itemID="{20FDDE99-9D75-47F3-A2F6-11BB527EDB76}">
+<ds:datastoreItem xmlns:ds="http://schemas.openxmlformats.org/officeDocument/2006/customXml" ds:itemID="{E34063A1-A6F8-4C8E-AF69-6678C2608329}">
   <ds:schemaRefs>
     <ds:schemaRef ds:uri="http://schemas.openxmlformats.org/officeDocument/2006/bibliography"/>
   </ds:schemaRefs>

</xml_diff>

<commit_message>
update diagrams in bilinear flt
</commit_message>
<xml_diff>
--- a/diplomski.docx
+++ b/diplomski.docx
@@ -10258,7 +10258,22 @@
         <w:rPr>
           <w:lang w:val="sr-Cyrl-RS"/>
         </w:rPr>
-        <w:t xml:space="preserve">). </w:t>
+        <w:t>)</w:t>
+      </w:r>
+      <w:r>
+        <w:t xml:space="preserve">, </w:t>
+      </w:r>
+      <w:r>
+        <w:rPr>
+          <w:lang w:val="sr-Cyrl-RS"/>
+        </w:rPr>
+        <w:t>чиме се постиже каузалност функције</w:t>
+      </w:r>
+      <w:r>
+        <w:rPr>
+          <w:lang w:val="sr-Cyrl-RS"/>
+        </w:rPr>
+        <w:t xml:space="preserve">. </w:t>
       </w:r>
     </w:p>
     <w:p>
@@ -12110,169 +12125,190 @@
           </wp:inline>
         </w:drawing>
       </w:r>
+    </w:p>
+    <w:p>
+      <w:pPr>
+        <w:pStyle w:val="Caption"/>
+        <w:jc w:val="center"/>
+        <w:rPr>
+          <w:sz w:val="24"/>
+        </w:rPr>
+      </w:pPr>
+      <w:proofErr w:type="spellStart"/>
+      <w:r>
+        <w:rPr>
+          <w:sz w:val="24"/>
+        </w:rPr>
+        <w:t>Слика</w:t>
+      </w:r>
+      <w:proofErr w:type="spellEnd"/>
+      <w:r>
+        <w:rPr>
+          <w:sz w:val="24"/>
+        </w:rPr>
+        <w:t xml:space="preserve"> </w:t>
+      </w:r>
+      <w:r>
+        <w:rPr>
+          <w:sz w:val="24"/>
+        </w:rPr>
+        <w:fldChar w:fldCharType="begin"/>
+      </w:r>
+      <w:r>
+        <w:rPr>
+          <w:sz w:val="24"/>
+        </w:rPr>
+        <w:instrText xml:space="preserve"> STYLEREF 1 \s </w:instrText>
+      </w:r>
+      <w:r>
+        <w:rPr>
+          <w:sz w:val="24"/>
+        </w:rPr>
+        <w:fldChar w:fldCharType="separate"/>
+      </w:r>
+      <w:r>
+        <w:rPr>
+          <w:noProof/>
+          <w:sz w:val="24"/>
+        </w:rPr>
+        <w:t>5</w:t>
+      </w:r>
+      <w:r>
+        <w:rPr>
+          <w:sz w:val="24"/>
+        </w:rPr>
+        <w:fldChar w:fldCharType="end"/>
+      </w:r>
+      <w:r>
+        <w:rPr>
+          <w:sz w:val="24"/>
+        </w:rPr>
+        <w:t>.</w:t>
+      </w:r>
+      <w:r>
+        <w:rPr>
+          <w:sz w:val="24"/>
+        </w:rPr>
+        <w:fldChar w:fldCharType="begin"/>
+      </w:r>
+      <w:r>
+        <w:rPr>
+          <w:sz w:val="24"/>
+        </w:rPr>
+        <w:instrText xml:space="preserve"> SEQ Слика \* ARABIC \s 1 </w:instrText>
+      </w:r>
+      <w:r>
+        <w:rPr>
+          <w:sz w:val="24"/>
+        </w:rPr>
+        <w:fldChar w:fldCharType="separate"/>
+      </w:r>
+      <w:r>
+        <w:rPr>
+          <w:noProof/>
+          <w:sz w:val="24"/>
+        </w:rPr>
+        <w:t>2</w:t>
+      </w:r>
+      <w:r>
+        <w:rPr>
+          <w:sz w:val="24"/>
+        </w:rPr>
+        <w:fldChar w:fldCharType="end"/>
+      </w:r>
+      <w:r>
+        <w:rPr>
+          <w:sz w:val="24"/>
+          <w:lang w:val="sr-Cyrl-RS"/>
+        </w:rPr>
+        <w:t>: Рачунање редног броја реда слике у баферу</w:t>
+      </w:r>
+    </w:p>
+    <w:p>
+      <w:pPr>
+        <w:rPr>
+          <w:lang w:val="sr-Cyrl-RS"/>
+        </w:rPr>
+      </w:pPr>
+    </w:p>
+    <w:p>
+      <w:pPr>
+        <w:rPr>
+          <w:lang w:val="sr-Cyrl-RS"/>
+        </w:rPr>
+      </w:pPr>
+      <w:r>
+        <w:rPr>
+          <w:lang w:val="sr-Cyrl-RS"/>
+        </w:rPr>
+        <w:pict>
+          <v:shape id="_x0000_i1080" type="#_x0000_t75" style="width:451pt;height:434.7pt">
+            <v:imagedata r:id="rId26" o:title="cf_num_calc"/>
+          </v:shape>
+        </w:pict>
+      </w:r>
+    </w:p>
+    <w:p>
+      <w:pPr>
+        <w:rPr>
+          <w:lang w:val="sr-Cyrl-RS"/>
+        </w:rPr>
+      </w:pPr>
+    </w:p>
+    <w:p>
+      <w:pPr>
+        <w:rPr>
+          <w:lang w:val="sr-Cyrl-RS"/>
+        </w:rPr>
+      </w:pPr>
+    </w:p>
+    <w:p>
+      <w:pPr>
+        <w:rPr>
+          <w:lang w:val="sr-Cyrl-RS"/>
+        </w:rPr>
+      </w:pPr>
+    </w:p>
+    <w:p>
+      <w:pPr>
+        <w:rPr>
+          <w:lang w:val="sr-Cyrl-RS"/>
+        </w:rPr>
+      </w:pPr>
+    </w:p>
+    <w:p>
+      <w:pPr>
+        <w:rPr>
+          <w:lang w:val="sr-Cyrl-RS"/>
+        </w:rPr>
+      </w:pPr>
+    </w:p>
+    <w:p>
+      <w:pPr>
+        <w:rPr>
+          <w:lang w:val="sr-Cyrl-RS"/>
+        </w:rPr>
+      </w:pPr>
+    </w:p>
+    <w:p>
+      <w:pPr>
+        <w:rPr>
+          <w:lang w:val="sr-Cyrl-RS"/>
+        </w:rPr>
+      </w:pPr>
       <w:bookmarkStart w:id="53" w:name="_GoBack"/>
       <w:bookmarkEnd w:id="53"/>
-    </w:p>
-    <w:p>
-      <w:pPr>
-        <w:pStyle w:val="Caption"/>
-        <w:jc w:val="center"/>
-        <w:rPr>
-          <w:sz w:val="24"/>
-        </w:rPr>
-      </w:pPr>
-      <w:proofErr w:type="spellStart"/>
-      <w:r>
-        <w:rPr>
-          <w:sz w:val="24"/>
-        </w:rPr>
-        <w:t>Слика</w:t>
-      </w:r>
-      <w:proofErr w:type="spellEnd"/>
-      <w:r>
-        <w:rPr>
-          <w:sz w:val="24"/>
-        </w:rPr>
-        <w:t xml:space="preserve"> </w:t>
-      </w:r>
-      <w:r>
-        <w:rPr>
-          <w:sz w:val="24"/>
-        </w:rPr>
-        <w:fldChar w:fldCharType="begin"/>
-      </w:r>
-      <w:r>
-        <w:rPr>
-          <w:sz w:val="24"/>
-        </w:rPr>
-        <w:instrText xml:space="preserve"> STYLEREF 1 \s </w:instrText>
-      </w:r>
-      <w:r>
-        <w:rPr>
-          <w:sz w:val="24"/>
-        </w:rPr>
-        <w:fldChar w:fldCharType="separate"/>
-      </w:r>
-      <w:r>
-        <w:rPr>
-          <w:noProof/>
-          <w:sz w:val="24"/>
-        </w:rPr>
-        <w:t>5</w:t>
-      </w:r>
-      <w:r>
-        <w:rPr>
-          <w:sz w:val="24"/>
-        </w:rPr>
-        <w:fldChar w:fldCharType="end"/>
-      </w:r>
-      <w:r>
-        <w:rPr>
-          <w:sz w:val="24"/>
-        </w:rPr>
-        <w:t>.</w:t>
-      </w:r>
-      <w:r>
-        <w:rPr>
-          <w:sz w:val="24"/>
-        </w:rPr>
-        <w:fldChar w:fldCharType="begin"/>
-      </w:r>
-      <w:r>
-        <w:rPr>
-          <w:sz w:val="24"/>
-        </w:rPr>
-        <w:instrText xml:space="preserve"> SEQ Слика \* ARABIC \s 1 </w:instrText>
-      </w:r>
-      <w:r>
-        <w:rPr>
-          <w:sz w:val="24"/>
-        </w:rPr>
-        <w:fldChar w:fldCharType="separate"/>
-      </w:r>
-      <w:r>
-        <w:rPr>
-          <w:noProof/>
-          <w:sz w:val="24"/>
-        </w:rPr>
-        <w:t>2</w:t>
-      </w:r>
-      <w:r>
-        <w:rPr>
-          <w:sz w:val="24"/>
-        </w:rPr>
-        <w:fldChar w:fldCharType="end"/>
-      </w:r>
-      <w:r>
-        <w:rPr>
-          <w:sz w:val="24"/>
-          <w:lang w:val="sr-Cyrl-RS"/>
-        </w:rPr>
-        <w:t>: Рачунање редног броја реда слике у баферу</w:t>
-      </w:r>
-    </w:p>
-    <w:p>
-      <w:pPr>
-        <w:rPr>
-          <w:lang w:val="sr-Cyrl-RS"/>
-        </w:rPr>
-      </w:pPr>
-    </w:p>
-    <w:p>
-      <w:pPr>
-        <w:rPr>
-          <w:lang w:val="sr-Cyrl-RS"/>
-        </w:rPr>
-      </w:pPr>
-    </w:p>
-    <w:p>
-      <w:pPr>
-        <w:rPr>
-          <w:lang w:val="sr-Cyrl-RS"/>
-        </w:rPr>
-      </w:pPr>
-    </w:p>
-    <w:p>
-      <w:pPr>
-        <w:rPr>
-          <w:lang w:val="sr-Cyrl-RS"/>
-        </w:rPr>
-      </w:pPr>
-    </w:p>
-    <w:p>
-      <w:pPr>
-        <w:rPr>
-          <w:lang w:val="sr-Cyrl-RS"/>
-        </w:rPr>
-      </w:pPr>
-    </w:p>
-    <w:p>
-      <w:pPr>
-        <w:rPr>
-          <w:lang w:val="sr-Cyrl-RS"/>
-        </w:rPr>
-      </w:pPr>
-    </w:p>
-    <w:p>
-      <w:pPr>
-        <w:rPr>
-          <w:lang w:val="sr-Cyrl-RS"/>
-        </w:rPr>
-      </w:pPr>
-    </w:p>
-    <w:p>
-      <w:pPr>
-        <w:rPr>
-          <w:lang w:val="sr-Cyrl-RS"/>
-        </w:rPr>
-      </w:pPr>
-    </w:p>
-    <w:p>
-      <w:pPr>
-        <w:rPr>
-          <w:lang w:val="sr-Cyrl-RS"/>
-        </w:rPr>
-      </w:pPr>
+      <w:r>
+        <w:rPr>
+          <w:lang w:val="sr-Cyrl-RS"/>
+        </w:rPr>
+        <w:lastRenderedPageBreak/>
+        <w:pict>
+          <v:shape id="_x0000_i1081" type="#_x0000_t75" style="width:451pt;height:434.05pt">
+            <v:imagedata r:id="rId27" o:title="bilinear_flt"/>
+          </v:shape>
+        </w:pict>
+      </w:r>
     </w:p>
     <w:p>
       <w:pPr>
@@ -12692,7 +12728,7 @@
       <w:r>
         <w:t xml:space="preserve">] </w:t>
       </w:r>
-      <w:hyperlink r:id="rId26" w:history="1">
+      <w:hyperlink r:id="rId28" w:history="1">
         <w:r>
           <w:rPr>
             <w:rStyle w:val="Hyperlink"/>
@@ -15519,7 +15555,7 @@
 </file>
 
 <file path=customXml/itemProps1.xml><?xml version="1.0" encoding="utf-8"?>
-<ds:datastoreItem xmlns:ds="http://schemas.openxmlformats.org/officeDocument/2006/customXml" ds:itemID="{A9F78309-3522-4B99-B2A8-ABF722341C97}">
+<ds:datastoreItem xmlns:ds="http://schemas.openxmlformats.org/officeDocument/2006/customXml" ds:itemID="{38987DC5-E1A8-4F5E-9E7F-8EF8AA7DD2F0}">
   <ds:schemaRefs>
     <ds:schemaRef ds:uri="http://schemas.openxmlformats.org/officeDocument/2006/bibliography"/>
   </ds:schemaRefs>

</xml_diff>

<commit_message>
DIPL: Creates bfilter block diagams
</commit_message>
<xml_diff>
--- a/diplomski.docx
+++ b/diplomski.docx
@@ -2922,6 +2922,12 @@
                 <w:webHidden/>
               </w:rPr>
               <w:instrText xml:space="preserve"> PAGEREF _Toc84936795 \h </w:instrText>
+            </w:r>
+            <w:r>
+              <w:rPr>
+                <w:noProof/>
+                <w:webHidden/>
+              </w:rPr>
             </w:r>
             <w:r>
               <w:rPr>
@@ -11030,7 +11036,7 @@
             <v:path o:extrusionok="f" gradientshapeok="t" o:connecttype="rect"/>
             <o:lock v:ext="edit" aspectratio="t"/>
           </v:shapetype>
-          <v:shape id="_x0000_i1025" type="#_x0000_t75" style="width:384.45pt;height:223.45pt">
+          <v:shape id="_x0000_i1025" type="#_x0000_t75" style="width:384pt;height:223.5pt">
             <v:imagedata r:id="rId23" o:title="bilinear_2d"/>
           </v:shape>
         </w:pict>
@@ -12226,13 +12232,25 @@
     </w:p>
     <w:p>
       <w:pPr>
-        <w:rPr>
-          <w:lang w:val="sr-Cyrl-RS"/>
-        </w:rPr>
-      </w:pPr>
-    </w:p>
-    <w:p>
-      <w:pPr>
+        <w:pStyle w:val="Heading3"/>
+      </w:pPr>
+      <w:r>
+        <w:lastRenderedPageBreak/>
+        <w:t>билинеарни филтер</w:t>
+      </w:r>
+      <w:bookmarkStart w:id="53" w:name="_GoBack"/>
+      <w:bookmarkEnd w:id="53"/>
+    </w:p>
+    <w:p>
+      <w:pPr>
+        <w:rPr>
+          <w:lang w:val="sr-Cyrl-RS"/>
+        </w:rPr>
+      </w:pPr>
+    </w:p>
+    <w:p>
+      <w:pPr>
+        <w:jc w:val="center"/>
         <w:rPr>
           <w:lang w:val="sr-Cyrl-RS"/>
         </w:rPr>
@@ -12242,8 +12260,8 @@
           <w:lang w:val="sr-Cyrl-RS"/>
         </w:rPr>
         <w:pict>
-          <v:shape id="_x0000_i1080" type="#_x0000_t75" style="width:451pt;height:434.7pt">
-            <v:imagedata r:id="rId26" o:title="cf_num_calc"/>
+          <v:shape id="_x0000_i1060" type="#_x0000_t75" style="width:451.5pt;height:3in">
+            <v:imagedata r:id="rId26" o:title="bilinear_flt_top"/>
           </v:shape>
         </w:pict>
       </w:r>
@@ -12264,48 +12282,37 @@
     </w:p>
     <w:p>
       <w:pPr>
-        <w:rPr>
-          <w:lang w:val="sr-Cyrl-RS"/>
-        </w:rPr>
-      </w:pPr>
-    </w:p>
-    <w:p>
-      <w:pPr>
-        <w:rPr>
-          <w:lang w:val="sr-Cyrl-RS"/>
-        </w:rPr>
-      </w:pPr>
-    </w:p>
-    <w:p>
-      <w:pPr>
-        <w:rPr>
-          <w:lang w:val="sr-Cyrl-RS"/>
-        </w:rPr>
-      </w:pPr>
-    </w:p>
-    <w:p>
-      <w:pPr>
-        <w:rPr>
-          <w:lang w:val="sr-Cyrl-RS"/>
-        </w:rPr>
-      </w:pPr>
-    </w:p>
-    <w:p>
-      <w:pPr>
-        <w:rPr>
-          <w:lang w:val="sr-Cyrl-RS"/>
-        </w:rPr>
-      </w:pPr>
-      <w:bookmarkStart w:id="53" w:name="_GoBack"/>
-      <w:bookmarkEnd w:id="53"/>
+        <w:jc w:val="center"/>
+        <w:rPr>
+          <w:lang w:val="sr-Cyrl-RS"/>
+        </w:rPr>
+      </w:pPr>
+      <w:r>
+        <w:rPr>
+          <w:lang w:val="sr-Cyrl-RS"/>
+        </w:rPr>
+        <w:pict>
+          <v:shape id="_x0000_i1061" type="#_x0000_t75" style="width:450.75pt;height:288.75pt">
+            <v:imagedata r:id="rId27" o:title="bilinear_flt_arch"/>
+          </v:shape>
+        </w:pict>
+      </w:r>
+    </w:p>
+    <w:p>
+      <w:pPr>
+        <w:jc w:val="center"/>
+        <w:rPr>
+          <w:lang w:val="sr-Cyrl-RS"/>
+        </w:rPr>
+      </w:pPr>
       <w:r>
         <w:rPr>
           <w:lang w:val="sr-Cyrl-RS"/>
         </w:rPr>
         <w:lastRenderedPageBreak/>
         <w:pict>
-          <v:shape id="_x0000_i1081" type="#_x0000_t75" style="width:451pt;height:434.05pt">
-            <v:imagedata r:id="rId27" o:title="bilinear_flt"/>
+          <v:shape id="_x0000_i1062" type="#_x0000_t75" style="width:451.5pt;height:363pt">
+            <v:imagedata r:id="rId28" o:title="coef_calc_block_sh"/>
           </v:shape>
         </w:pict>
       </w:r>
@@ -12326,6 +12333,116 @@
     </w:p>
     <w:p>
       <w:pPr>
+        <w:tabs>
+          <w:tab w:val="left" w:pos="1665"/>
+        </w:tabs>
+        <w:jc w:val="center"/>
+        <w:rPr>
+          <w:lang w:val="sr-Cyrl-RS"/>
+        </w:rPr>
+      </w:pPr>
+      <w:r>
+        <w:rPr>
+          <w:lang w:val="sr-Cyrl-RS"/>
+        </w:rPr>
+        <w:pict>
+          <v:shape id="_x0000_i1063" type="#_x0000_t75" style="width:451.5pt;height:197.25pt">
+            <v:imagedata r:id="rId29" o:title="coef_calc_cell"/>
+          </v:shape>
+        </w:pict>
+      </w:r>
+    </w:p>
+    <w:p>
+      <w:pPr>
+        <w:rPr>
+          <w:lang w:val="sr-Cyrl-RS"/>
+        </w:rPr>
+      </w:pPr>
+    </w:p>
+    <w:p>
+      <w:pPr>
+        <w:rPr>
+          <w:lang w:val="sr-Cyrl-RS"/>
+        </w:rPr>
+      </w:pPr>
+    </w:p>
+    <w:p>
+      <w:pPr>
+        <w:rPr>
+          <w:lang w:val="sr-Cyrl-RS"/>
+        </w:rPr>
+      </w:pPr>
+    </w:p>
+    <w:p>
+      <w:pPr>
+        <w:jc w:val="center"/>
+        <w:rPr>
+          <w:lang w:val="sr-Cyrl-RS"/>
+        </w:rPr>
+      </w:pPr>
+      <w:r>
+        <w:rPr>
+          <w:lang w:val="sr-Cyrl-RS"/>
+        </w:rPr>
+        <w:lastRenderedPageBreak/>
+        <w:pict>
+          <v:shape id="_x0000_i1064" type="#_x0000_t75" style="width:450.75pt;height:285.75pt">
+            <v:imagedata r:id="rId30" o:title="bilinear_flt_v1"/>
+          </v:shape>
+        </w:pict>
+      </w:r>
+    </w:p>
+    <w:p>
+      <w:pPr>
+        <w:rPr>
+          <w:lang w:val="sr-Cyrl-RS"/>
+        </w:rPr>
+      </w:pPr>
+    </w:p>
+    <w:p>
+      <w:pPr>
+        <w:rPr>
+          <w:lang w:val="sr-Cyrl-RS"/>
+        </w:rPr>
+      </w:pPr>
+    </w:p>
+    <w:p>
+      <w:pPr>
+        <w:rPr>
+          <w:lang w:val="sr-Cyrl-RS"/>
+        </w:rPr>
+      </w:pPr>
+    </w:p>
+    <w:p>
+      <w:pPr>
+        <w:rPr>
+          <w:lang w:val="sr-Cyrl-RS"/>
+        </w:rPr>
+      </w:pPr>
+    </w:p>
+    <w:p>
+      <w:pPr>
+        <w:rPr>
+          <w:lang w:val="sr-Cyrl-RS"/>
+        </w:rPr>
+      </w:pPr>
+    </w:p>
+    <w:p>
+      <w:pPr>
+        <w:rPr>
+          <w:lang w:val="sr-Cyrl-RS"/>
+        </w:rPr>
+      </w:pPr>
+    </w:p>
+    <w:p>
+      <w:pPr>
+        <w:rPr>
+          <w:lang w:val="sr-Cyrl-RS"/>
+        </w:rPr>
+      </w:pPr>
+    </w:p>
+    <w:p>
+      <w:pPr>
         <w:rPr>
           <w:lang w:val="sr-Cyrl-RS"/>
         </w:rPr>
@@ -12412,6 +12529,7 @@
         <w:rPr>
           <w:lang w:val="sr-Cyrl-RS"/>
         </w:rPr>
+        <w:lastRenderedPageBreak/>
         <w:br w:type="page"/>
       </w:r>
     </w:p>
@@ -12728,7 +12846,7 @@
       <w:r>
         <w:t xml:space="preserve">] </w:t>
       </w:r>
-      <w:hyperlink r:id="rId28" w:history="1">
+      <w:hyperlink r:id="rId31" w:history="1">
         <w:r>
           <w:rPr>
             <w:rStyle w:val="Hyperlink"/>
@@ -12817,7 +12935,7 @@
       <w:rPr>
         <w:noProof/>
       </w:rPr>
-      <w:t>17</w:t>
+      <w:t>21</w:t>
     </w:r>
     <w:r>
       <w:rPr>
@@ -15555,7 +15673,7 @@
 </file>
 
 <file path=customXml/itemProps1.xml><?xml version="1.0" encoding="utf-8"?>
-<ds:datastoreItem xmlns:ds="http://schemas.openxmlformats.org/officeDocument/2006/customXml" ds:itemID="{38987DC5-E1A8-4F5E-9E7F-8EF8AA7DD2F0}">
+<ds:datastoreItem xmlns:ds="http://schemas.openxmlformats.org/officeDocument/2006/customXml" ds:itemID="{FADA450A-8331-4B55-857B-6187BC8BB462}">
   <ds:schemaRefs>
     <ds:schemaRef ds:uri="http://schemas.openxmlformats.org/officeDocument/2006/bibliography"/>
   </ds:schemaRefs>

</xml_diff>

<commit_message>
Adds fifo bank diagrams
</commit_message>
<xml_diff>
--- a/diplomski.docx
+++ b/diplomski.docx
@@ -12472,6 +12472,41 @@
     </w:p>
     <w:p>
       <w:pPr>
+        <w:rPr>
+          <w:lang w:val="sr-Cyrl-RS"/>
+        </w:rPr>
+      </w:pPr>
+    </w:p>
+    <w:p>
+      <w:pPr>
+        <w:rPr>
+          <w:lang w:val="sr-Cyrl-RS"/>
+        </w:rPr>
+      </w:pPr>
+    </w:p>
+    <w:p>
+      <w:pPr>
+        <w:rPr>
+          <w:lang w:val="sr-Cyrl-RS"/>
+        </w:rPr>
+      </w:pPr>
+    </w:p>
+    <w:p>
+      <w:pPr>
+        <w:rPr>
+          <w:lang w:val="sr-Cyrl-RS"/>
+        </w:rPr>
+      </w:pPr>
+    </w:p>
+    <w:p>
+      <w:pPr>
+        <w:rPr>
+          <w:lang w:val="sr-Cyrl-RS"/>
+        </w:rPr>
+      </w:pPr>
+    </w:p>
+    <w:p>
+      <w:pPr>
         <w:tabs>
           <w:tab w:val="left" w:pos="1665"/>
         </w:tabs>
@@ -12484,6 +12519,7 @@
         <w:rPr>
           <w:lang w:val="sr-Cyrl-RS"/>
         </w:rPr>
+        <w:lastRenderedPageBreak/>
         <w:pict>
           <v:shape id="_x0000_i1063" type="#_x0000_t75" style="width:451.5pt;height:197.25pt">
             <v:imagedata r:id="rId29" o:title="coef_calc_cell"/>
@@ -12521,9 +12557,52 @@
     </w:p>
     <w:p>
       <w:pPr>
+        <w:rPr>
+          <w:lang w:val="sr-Cyrl-RS"/>
+        </w:rPr>
+      </w:pPr>
+    </w:p>
+    <w:p>
+      <w:pPr>
+        <w:rPr>
+          <w:lang w:val="sr-Cyrl-RS"/>
+        </w:rPr>
+      </w:pPr>
+    </w:p>
+    <w:p>
+      <w:pPr>
+        <w:rPr>
+          <w:lang w:val="sr-Cyrl-RS"/>
+        </w:rPr>
+      </w:pPr>
+    </w:p>
+    <w:p>
+      <w:pPr>
+        <w:rPr>
+          <w:lang w:val="sr-Cyrl-RS"/>
+        </w:rPr>
+      </w:pPr>
+    </w:p>
+    <w:p>
+      <w:pPr>
+        <w:rPr>
+          <w:lang w:val="sr-Cyrl-RS"/>
+        </w:rPr>
+      </w:pPr>
+    </w:p>
+    <w:p>
+      <w:pPr>
+        <w:rPr>
+          <w:lang w:val="sr-Cyrl-RS"/>
+        </w:rPr>
+      </w:pPr>
+    </w:p>
+    <w:p>
+      <w:pPr>
         <w:jc w:val="center"/>
       </w:pPr>
       <w:r>
+        <w:lastRenderedPageBreak/>
         <w:pict>
           <v:shape id="_x0000_i1071" type="#_x0000_t75" style="width:450.75pt;height:303.75pt">
             <v:imagedata r:id="rId30" o:title="bilinear_flt_v1"/>
@@ -12665,6 +12744,7 @@
           <w:lang w:val="sr-Cyrl-RS"/>
         </w:rPr>
       </w:pPr>
+      <w:bookmarkStart w:id="53" w:name="_GoBack"/>
       <w:r>
         <w:rPr>
           <w:noProof/>
@@ -12672,10 +12752,10 @@
         </w:rPr>
         <w:lastRenderedPageBreak/>
         <w:drawing>
-          <wp:inline distT="0" distB="0" distL="0" distR="0" wp14:anchorId="70EA99B2" wp14:editId="73172CBC">
-            <wp:extent cx="4219575" cy="3860911"/>
-            <wp:effectExtent l="0" t="0" r="0" b="6350"/>
-            <wp:docPr id="22" name="Picture 22" descr="E:\video_scaler_repo\video_scaler\scaler_v2\doc\bilinear_flt\pix_calc_cell.png"/>
+          <wp:inline distT="0" distB="0" distL="0" distR="0">
+            <wp:extent cx="5731510" cy="4456249"/>
+            <wp:effectExtent l="0" t="0" r="2540" b="1905"/>
+            <wp:docPr id="25" name="Picture 25" descr="E:\video_scaler_repo\video_scaler\scaler_v2\doc\bilinear_flt\pix_calc_cell.png"/>
             <wp:cNvGraphicFramePr>
               <a:graphicFrameLocks xmlns:a="http://schemas.openxmlformats.org/drawingml/2006/main" noChangeAspect="1"/>
             </wp:cNvGraphicFramePr>
@@ -12683,7 +12763,7 @@
               <a:graphicData uri="http://schemas.openxmlformats.org/drawingml/2006/picture">
                 <pic:pic xmlns:pic="http://schemas.openxmlformats.org/drawingml/2006/picture">
                   <pic:nvPicPr>
-                    <pic:cNvPr id="0" name="Picture 54" descr="E:\video_scaler_repo\video_scaler\scaler_v2\doc\bilinear_flt\pix_calc_cell.png"/>
+                    <pic:cNvPr id="0" name="Picture 59" descr="E:\video_scaler_repo\video_scaler\scaler_v2\doc\bilinear_flt\pix_calc_cell.png"/>
                     <pic:cNvPicPr>
                       <a:picLocks noChangeAspect="1" noChangeArrowheads="1"/>
                     </pic:cNvPicPr>
@@ -12704,7 +12784,7 @@
                   <pic:spPr bwMode="auto">
                     <a:xfrm>
                       <a:off x="0" y="0"/>
-                      <a:ext cx="4281669" cy="3917727"/>
+                      <a:ext cx="5731510" cy="4456249"/>
                     </a:xfrm>
                     <a:prstGeom prst="rect">
                       <a:avLst/>
@@ -12720,6 +12800,7 @@
           </wp:inline>
         </w:drawing>
       </w:r>
+      <w:bookmarkEnd w:id="53"/>
     </w:p>
     <w:p>
       <w:pPr>
@@ -12910,15 +12991,12 @@
           <w:lang w:val="sr-Cyrl-RS"/>
         </w:rPr>
       </w:pPr>
-      <w:bookmarkStart w:id="53" w:name="_GoBack"/>
-      <w:bookmarkEnd w:id="53"/>
     </w:p>
     <w:p>
       <w:pPr>
         <w:pStyle w:val="Heading3"/>
       </w:pPr>
       <w:r>
-        <w:lastRenderedPageBreak/>
         <w:t xml:space="preserve">меморијска ФИФО (енг. </w:t>
       </w:r>
       <w:r>
@@ -12947,11 +13025,54 @@
     </w:p>
     <w:p>
       <w:pPr>
-        <w:jc w:val="left"/>
-        <w:rPr>
-          <w:lang w:val="sr-Cyrl-RS"/>
-        </w:rPr>
-      </w:pPr>
+        <w:rPr>
+          <w:lang w:val="sr-Cyrl-RS"/>
+        </w:rPr>
+      </w:pPr>
+    </w:p>
+    <w:p>
+      <w:pPr>
+        <w:jc w:val="center"/>
+        <w:rPr>
+          <w:lang w:val="sr-Cyrl-RS"/>
+        </w:rPr>
+      </w:pPr>
+      <w:r>
+        <w:rPr>
+          <w:lang w:val="sr-Cyrl-RS"/>
+        </w:rPr>
+        <w:pict>
+          <v:shape id="_x0000_i1081" type="#_x0000_t75" style="width:451.5pt;height:276pt">
+            <v:imagedata r:id="rId33" o:title="fifo_bank"/>
+          </v:shape>
+        </w:pict>
+      </w:r>
+    </w:p>
+    <w:p>
+      <w:pPr>
+        <w:jc w:val="center"/>
+        <w:rPr>
+          <w:lang w:val="sr-Cyrl-RS"/>
+        </w:rPr>
+      </w:pPr>
+    </w:p>
+    <w:p>
+      <w:pPr>
+        <w:jc w:val="center"/>
+        <w:rPr>
+          <w:lang w:val="sr-Cyrl-RS"/>
+        </w:rPr>
+      </w:pPr>
+      <w:r>
+        <w:rPr>
+          <w:lang w:val="sr-Cyrl-RS"/>
+        </w:rPr>
+        <w:pict>
+          <v:shape id="_x0000_i1082" type="#_x0000_t75" style="width:450.75pt;height:278.25pt">
+            <v:imagedata r:id="rId34" o:title="fifo_bank_arch"/>
+          </v:shape>
+        </w:pict>
+      </w:r>
       <w:r>
         <w:rPr>
           <w:lang w:val="sr-Cyrl-RS"/>
@@ -13272,7 +13393,7 @@
       <w:r>
         <w:t xml:space="preserve">] </w:t>
       </w:r>
-      <w:hyperlink r:id="rId33" w:history="1">
+      <w:hyperlink r:id="rId35" w:history="1">
         <w:r>
           <w:rPr>
             <w:rStyle w:val="Hyperlink"/>
@@ -16099,7 +16220,7 @@
 </file>
 
 <file path=customXml/itemProps1.xml><?xml version="1.0" encoding="utf-8"?>
-<ds:datastoreItem xmlns:ds="http://schemas.openxmlformats.org/officeDocument/2006/customXml" ds:itemID="{E5D5D303-2340-4356-8AC6-B311EE81E70F}">
+<ds:datastoreItem xmlns:ds="http://schemas.openxmlformats.org/officeDocument/2006/customXml" ds:itemID="{5098D467-B41A-4BA0-8C6F-56C0D6815757}">
   <ds:schemaRefs>
     <ds:schemaRef ds:uri="http://schemas.openxmlformats.org/officeDocument/2006/bibliography"/>
   </ds:schemaRefs>

</xml_diff>

<commit_message>
new version of bilinear filter
</commit_message>
<xml_diff>
--- a/diplomski.docx
+++ b/diplomski.docx
@@ -1932,7 +1932,7 @@
           <w:r>
             <w:fldChar w:fldCharType="separate"/>
           </w:r>
-          <w:hyperlink w:anchor="_Toc84936784" w:history="1">
+          <w:hyperlink w:anchor="_Toc86917642" w:history="1">
             <w:r>
               <w:rPr>
                 <w:rStyle w:val="Hyperlink"/>
@@ -1960,7 +1960,7 @@
                 <w:noProof/>
                 <w:webHidden/>
               </w:rPr>
-              <w:instrText xml:space="preserve"> PAGEREF _Toc84936784 \h </w:instrText>
+              <w:instrText xml:space="preserve"> PAGEREF _Toc86917642 \h </w:instrText>
             </w:r>
             <w:r>
               <w:rPr>
@@ -2004,7 +2004,7 @@
               <w:lang w:val="en-GB" w:eastAsia="en-GB"/>
             </w:rPr>
           </w:pPr>
-          <w:hyperlink w:anchor="_Toc84936785" w:history="1">
+          <w:hyperlink w:anchor="_Toc86917643" w:history="1">
             <w:r>
               <w:rPr>
                 <w:rStyle w:val="Hyperlink"/>
@@ -2032,7 +2032,7 @@
                 <w:noProof/>
                 <w:webHidden/>
               </w:rPr>
-              <w:instrText xml:space="preserve"> PAGEREF _Toc84936785 \h </w:instrText>
+              <w:instrText xml:space="preserve"> PAGEREF _Toc86917643 \h </w:instrText>
             </w:r>
             <w:r>
               <w:rPr>
@@ -2076,7 +2076,7 @@
               <w:lang w:val="en-GB" w:eastAsia="en-GB"/>
             </w:rPr>
           </w:pPr>
-          <w:hyperlink w:anchor="_Toc84936786" w:history="1">
+          <w:hyperlink w:anchor="_Toc86917644" w:history="1">
             <w:r>
               <w:rPr>
                 <w:rStyle w:val="Hyperlink"/>
@@ -2104,7 +2104,7 @@
                 <w:noProof/>
                 <w:webHidden/>
               </w:rPr>
-              <w:instrText xml:space="preserve"> PAGEREF _Toc84936786 \h </w:instrText>
+              <w:instrText xml:space="preserve"> PAGEREF _Toc86917644 \h </w:instrText>
             </w:r>
             <w:r>
               <w:rPr>
@@ -2149,7 +2149,7 @@
               <w:lang w:val="en-GB" w:eastAsia="en-GB"/>
             </w:rPr>
           </w:pPr>
-          <w:hyperlink w:anchor="_Toc84936787" w:history="1">
+          <w:hyperlink w:anchor="_Toc86917645" w:history="1">
             <w:r>
               <w:rPr>
                 <w:rStyle w:val="Hyperlink"/>
@@ -2194,7 +2194,7 @@
                 <w:noProof/>
                 <w:webHidden/>
               </w:rPr>
-              <w:instrText xml:space="preserve"> PAGEREF _Toc84936787 \h </w:instrText>
+              <w:instrText xml:space="preserve"> PAGEREF _Toc86917645 \h </w:instrText>
             </w:r>
             <w:r>
               <w:rPr>
@@ -2239,7 +2239,7 @@
               <w:lang w:val="en-GB" w:eastAsia="en-GB"/>
             </w:rPr>
           </w:pPr>
-          <w:hyperlink w:anchor="_Toc84936788" w:history="1">
+          <w:hyperlink w:anchor="_Toc86917646" w:history="1">
             <w:r>
               <w:rPr>
                 <w:rStyle w:val="Hyperlink"/>
@@ -2284,7 +2284,7 @@
                 <w:noProof/>
                 <w:webHidden/>
               </w:rPr>
-              <w:instrText xml:space="preserve"> PAGEREF _Toc84936788 \h </w:instrText>
+              <w:instrText xml:space="preserve"> PAGEREF _Toc86917646 \h </w:instrText>
             </w:r>
             <w:r>
               <w:rPr>
@@ -2329,7 +2329,7 @@
               <w:lang w:val="en-GB" w:eastAsia="en-GB"/>
             </w:rPr>
           </w:pPr>
-          <w:hyperlink w:anchor="_Toc84936789" w:history="1">
+          <w:hyperlink w:anchor="_Toc86917647" w:history="1">
             <w:r>
               <w:rPr>
                 <w:rStyle w:val="Hyperlink"/>
@@ -2374,7 +2374,7 @@
                 <w:noProof/>
                 <w:webHidden/>
               </w:rPr>
-              <w:instrText xml:space="preserve"> PAGEREF _Toc84936789 \h </w:instrText>
+              <w:instrText xml:space="preserve"> PAGEREF _Toc86917647 \h </w:instrText>
             </w:r>
             <w:r>
               <w:rPr>
@@ -2419,7 +2419,7 @@
               <w:lang w:val="en-GB" w:eastAsia="en-GB"/>
             </w:rPr>
           </w:pPr>
-          <w:hyperlink w:anchor="_Toc84936790" w:history="1">
+          <w:hyperlink w:anchor="_Toc86917648" w:history="1">
             <w:r>
               <w:rPr>
                 <w:rStyle w:val="Hyperlink"/>
@@ -2464,7 +2464,7 @@
                 <w:noProof/>
                 <w:webHidden/>
               </w:rPr>
-              <w:instrText xml:space="preserve"> PAGEREF _Toc84936790 \h </w:instrText>
+              <w:instrText xml:space="preserve"> PAGEREF _Toc86917648 \h </w:instrText>
             </w:r>
             <w:r>
               <w:rPr>
@@ -2509,7 +2509,7 @@
               <w:lang w:val="en-GB" w:eastAsia="en-GB"/>
             </w:rPr>
           </w:pPr>
-          <w:hyperlink w:anchor="_Toc84936791" w:history="1">
+          <w:hyperlink w:anchor="_Toc86917649" w:history="1">
             <w:r>
               <w:rPr>
                 <w:rStyle w:val="Hyperlink"/>
@@ -2552,7 +2552,7 @@
                 <w:noProof/>
                 <w:webHidden/>
               </w:rPr>
-              <w:instrText xml:space="preserve"> PAGEREF _Toc84936791 \h </w:instrText>
+              <w:instrText xml:space="preserve"> PAGEREF _Toc86917649 \h </w:instrText>
             </w:r>
             <w:r>
               <w:rPr>
@@ -2597,7 +2597,7 @@
               <w:lang w:val="en-GB" w:eastAsia="en-GB"/>
             </w:rPr>
           </w:pPr>
-          <w:hyperlink w:anchor="_Toc84936792" w:history="1">
+          <w:hyperlink w:anchor="_Toc86917650" w:history="1">
             <w:r>
               <w:rPr>
                 <w:rStyle w:val="Hyperlink"/>
@@ -2655,7 +2655,7 @@
                 <w:noProof/>
                 <w:webHidden/>
               </w:rPr>
-              <w:instrText xml:space="preserve"> PAGEREF _Toc84936792 \h </w:instrText>
+              <w:instrText xml:space="preserve"> PAGEREF _Toc86917650 \h </w:instrText>
             </w:r>
             <w:r>
               <w:rPr>
@@ -2700,7 +2700,7 @@
               <w:lang w:val="en-GB" w:eastAsia="en-GB"/>
             </w:rPr>
           </w:pPr>
-          <w:hyperlink w:anchor="_Toc84936793" w:history="1">
+          <w:hyperlink w:anchor="_Toc86917651" w:history="1">
             <w:r>
               <w:rPr>
                 <w:rStyle w:val="Hyperlink"/>
@@ -2743,7 +2743,7 @@
                 <w:noProof/>
                 <w:webHidden/>
               </w:rPr>
-              <w:instrText xml:space="preserve"> PAGEREF _Toc84936793 \h </w:instrText>
+              <w:instrText xml:space="preserve"> PAGEREF _Toc86917651 \h </w:instrText>
             </w:r>
             <w:r>
               <w:rPr>
@@ -2788,7 +2788,7 @@
               <w:lang w:val="en-GB" w:eastAsia="en-GB"/>
             </w:rPr>
           </w:pPr>
-          <w:hyperlink w:anchor="_Toc84936794" w:history="1">
+          <w:hyperlink w:anchor="_Toc86917652" w:history="1">
             <w:r>
               <w:rPr>
                 <w:rStyle w:val="Hyperlink"/>
@@ -2831,7 +2831,7 @@
                 <w:noProof/>
                 <w:webHidden/>
               </w:rPr>
-              <w:instrText xml:space="preserve"> PAGEREF _Toc84936794 \h </w:instrText>
+              <w:instrText xml:space="preserve"> PAGEREF _Toc86917652 \h </w:instrText>
             </w:r>
             <w:r>
               <w:rPr>
@@ -2876,7 +2876,7 @@
               <w:lang w:val="en-GB" w:eastAsia="en-GB"/>
             </w:rPr>
           </w:pPr>
-          <w:hyperlink w:anchor="_Toc84936795" w:history="1">
+          <w:hyperlink w:anchor="_Toc86917653" w:history="1">
             <w:r>
               <w:rPr>
                 <w:rStyle w:val="Hyperlink"/>
@@ -2900,7 +2900,37 @@
                 <w:noProof/>
                 <w:lang w:val="sr-Cyrl-RS"/>
               </w:rPr>
-              <w:t>АНАЛИЗА ПРЕДЛОЖЕНОГ АЛГОРИТМА</w:t>
+              <w:t>ФПГА</w:t>
+            </w:r>
+            <w:r>
+              <w:rPr>
+                <w:rStyle w:val="Hyperlink"/>
+                <w:noProof/>
+              </w:rPr>
+              <w:t xml:space="preserve"> </w:t>
+            </w:r>
+            <w:r>
+              <w:rPr>
+                <w:rStyle w:val="Hyperlink"/>
+                <w:noProof/>
+                <w:lang w:val="sr-Cyrl-RS"/>
+              </w:rPr>
+              <w:t>(</w:t>
+            </w:r>
+            <w:r>
+              <w:rPr>
+                <w:rStyle w:val="Hyperlink"/>
+                <w:noProof/>
+              </w:rPr>
+              <w:t>FPGA – Field Programmable Gate Arrays</w:t>
+            </w:r>
+            <w:r>
+              <w:rPr>
+                <w:rStyle w:val="Hyperlink"/>
+                <w:noProof/>
+                <w:lang w:val="sr-Cyrl-RS"/>
+              </w:rPr>
+              <w:t>)</w:t>
             </w:r>
             <w:r>
               <w:rPr>
@@ -2921,7 +2951,7 @@
                 <w:noProof/>
                 <w:webHidden/>
               </w:rPr>
-              <w:instrText xml:space="preserve"> PAGEREF _Toc84936795 \h </w:instrText>
+              <w:instrText xml:space="preserve"> PAGEREF _Toc86917653 \h </w:instrText>
             </w:r>
             <w:r>
               <w:rPr>
@@ -2938,12 +2968,10 @@
             </w:r>
             <w:r>
               <w:rPr>
-                <w:b/>
-                <w:bCs/>
                 <w:noProof/>
                 <w:webHidden/>
               </w:rPr>
-              <w:t>Error! Bookmark not defined.</w:t>
+              <w:t>14</w:t>
             </w:r>
             <w:r>
               <w:rPr>
@@ -2968,7 +2996,7 @@
               <w:lang w:val="en-GB" w:eastAsia="en-GB"/>
             </w:rPr>
           </w:pPr>
-          <w:hyperlink w:anchor="_Toc84936796" w:history="1">
+          <w:hyperlink w:anchor="_Toc86917654" w:history="1">
             <w:r>
               <w:rPr>
                 <w:rStyle w:val="Hyperlink"/>
@@ -2992,37 +3020,183 @@
                 <w:noProof/>
                 <w:lang w:val="sr-Cyrl-RS"/>
               </w:rPr>
-              <w:t>ФПГА</w:t>
-            </w:r>
+              <w:t>ОПИС ДИЗАЈНА</w:t>
+            </w:r>
+            <w:r>
+              <w:rPr>
+                <w:noProof/>
+                <w:webHidden/>
+              </w:rPr>
+              <w:tab/>
+            </w:r>
+            <w:r>
+              <w:rPr>
+                <w:noProof/>
+                <w:webHidden/>
+              </w:rPr>
+              <w:fldChar w:fldCharType="begin"/>
+            </w:r>
+            <w:r>
+              <w:rPr>
+                <w:noProof/>
+                <w:webHidden/>
+              </w:rPr>
+              <w:instrText xml:space="preserve"> PAGEREF _Toc86917654 \h </w:instrText>
+            </w:r>
+            <w:r>
+              <w:rPr>
+                <w:noProof/>
+                <w:webHidden/>
+              </w:rPr>
+            </w:r>
+            <w:r>
+              <w:rPr>
+                <w:noProof/>
+                <w:webHidden/>
+              </w:rPr>
+              <w:fldChar w:fldCharType="separate"/>
+            </w:r>
+            <w:r>
+              <w:rPr>
+                <w:noProof/>
+                <w:webHidden/>
+              </w:rPr>
+              <w:t>15</w:t>
+            </w:r>
+            <w:r>
+              <w:rPr>
+                <w:noProof/>
+                <w:webHidden/>
+              </w:rPr>
+              <w:fldChar w:fldCharType="end"/>
+            </w:r>
+          </w:hyperlink>
+        </w:p>
+        <w:p>
+          <w:pPr>
+            <w:pStyle w:val="TOC3"/>
+            <w:tabs>
+              <w:tab w:val="left" w:pos="1320"/>
+              <w:tab w:val="right" w:leader="dot" w:pos="8656"/>
+            </w:tabs>
+            <w:rPr>
+              <w:rFonts w:asciiTheme="minorHAnsi" w:eastAsiaTheme="minorEastAsia" w:hAnsiTheme="minorHAnsi"/>
+              <w:noProof/>
+              <w:sz w:val="22"/>
+              <w:lang w:val="en-GB" w:eastAsia="en-GB"/>
+            </w:rPr>
+          </w:pPr>
+          <w:hyperlink w:anchor="_Toc86917655" w:history="1">
             <w:r>
               <w:rPr>
                 <w:rStyle w:val="Hyperlink"/>
                 <w:noProof/>
               </w:rPr>
-              <w:t xml:space="preserve"> </w:t>
+              <w:t>5.1.1</w:t>
+            </w:r>
+            <w:r>
+              <w:rPr>
+                <w:rFonts w:asciiTheme="minorHAnsi" w:eastAsiaTheme="minorEastAsia" w:hAnsiTheme="minorHAnsi"/>
+                <w:noProof/>
+                <w:sz w:val="22"/>
+                <w:lang w:val="en-GB" w:eastAsia="en-GB"/>
+              </w:rPr>
+              <w:tab/>
             </w:r>
             <w:r>
               <w:rPr>
                 <w:rStyle w:val="Hyperlink"/>
                 <w:noProof/>
-                <w:lang w:val="sr-Cyrl-RS"/>
-              </w:rPr>
-              <w:t>(</w:t>
-            </w:r>
+              </w:rPr>
+              <w:t>Прилагођење улазног тока података на филтер (енг. Stream to rows модул)</w:t>
+            </w:r>
+            <w:r>
+              <w:rPr>
+                <w:noProof/>
+                <w:webHidden/>
+              </w:rPr>
+              <w:tab/>
+            </w:r>
+            <w:r>
+              <w:rPr>
+                <w:noProof/>
+                <w:webHidden/>
+              </w:rPr>
+              <w:fldChar w:fldCharType="begin"/>
+            </w:r>
+            <w:r>
+              <w:rPr>
+                <w:noProof/>
+                <w:webHidden/>
+              </w:rPr>
+              <w:instrText xml:space="preserve"> PAGEREF _Toc86917655 \h </w:instrText>
+            </w:r>
+            <w:r>
+              <w:rPr>
+                <w:noProof/>
+                <w:webHidden/>
+              </w:rPr>
+            </w:r>
+            <w:r>
+              <w:rPr>
+                <w:noProof/>
+                <w:webHidden/>
+              </w:rPr>
+              <w:fldChar w:fldCharType="separate"/>
+            </w:r>
+            <w:r>
+              <w:rPr>
+                <w:noProof/>
+                <w:webHidden/>
+              </w:rPr>
+              <w:t>16</w:t>
+            </w:r>
+            <w:r>
+              <w:rPr>
+                <w:noProof/>
+                <w:webHidden/>
+              </w:rPr>
+              <w:fldChar w:fldCharType="end"/>
+            </w:r>
+          </w:hyperlink>
+        </w:p>
+        <w:p>
+          <w:pPr>
+            <w:pStyle w:val="TOC3"/>
+            <w:tabs>
+              <w:tab w:val="left" w:pos="1320"/>
+              <w:tab w:val="right" w:leader="dot" w:pos="8656"/>
+            </w:tabs>
+            <w:rPr>
+              <w:rFonts w:asciiTheme="minorHAnsi" w:eastAsiaTheme="minorEastAsia" w:hAnsiTheme="minorHAnsi"/>
+              <w:noProof/>
+              <w:sz w:val="22"/>
+              <w:lang w:val="en-GB" w:eastAsia="en-GB"/>
+            </w:rPr>
+          </w:pPr>
+          <w:hyperlink w:anchor="_Toc86917656" w:history="1">
             <w:r>
               <w:rPr>
                 <w:rStyle w:val="Hyperlink"/>
                 <w:noProof/>
               </w:rPr>
-              <w:t>FPGA – Field Programmable Gate Arrays</w:t>
+              <w:t>5.1.2</w:t>
+            </w:r>
+            <w:r>
+              <w:rPr>
+                <w:rFonts w:asciiTheme="minorHAnsi" w:eastAsiaTheme="minorEastAsia" w:hAnsiTheme="minorHAnsi"/>
+                <w:noProof/>
+                <w:sz w:val="22"/>
+                <w:lang w:val="en-GB" w:eastAsia="en-GB"/>
+              </w:rPr>
+              <w:tab/>
             </w:r>
             <w:r>
               <w:rPr>
                 <w:rStyle w:val="Hyperlink"/>
                 <w:noProof/>
-                <w:lang w:val="sr-Cyrl-RS"/>
-              </w:rPr>
-              <w:t>)</w:t>
+              </w:rPr>
+              <w:t>билинеарни филтер</w:t>
             </w:r>
             <w:r>
               <w:rPr>
@@ -3043,7 +3217,7 @@
                 <w:noProof/>
                 <w:webHidden/>
               </w:rPr>
-              <w:instrText xml:space="preserve"> PAGEREF _Toc84936796 \h </w:instrText>
+              <w:instrText xml:space="preserve"> PAGEREF _Toc86917656 \h </w:instrText>
             </w:r>
             <w:r>
               <w:rPr>
@@ -3063,7 +3237,95 @@
                 <w:noProof/>
                 <w:webHidden/>
               </w:rPr>
-              <w:t>14</w:t>
+              <w:t>17</w:t>
+            </w:r>
+            <w:r>
+              <w:rPr>
+                <w:noProof/>
+                <w:webHidden/>
+              </w:rPr>
+              <w:fldChar w:fldCharType="end"/>
+            </w:r>
+          </w:hyperlink>
+        </w:p>
+        <w:p>
+          <w:pPr>
+            <w:pStyle w:val="TOC3"/>
+            <w:tabs>
+              <w:tab w:val="left" w:pos="1320"/>
+              <w:tab w:val="right" w:leader="dot" w:pos="8656"/>
+            </w:tabs>
+            <w:rPr>
+              <w:rFonts w:asciiTheme="minorHAnsi" w:eastAsiaTheme="minorEastAsia" w:hAnsiTheme="minorHAnsi"/>
+              <w:noProof/>
+              <w:sz w:val="22"/>
+              <w:lang w:val="en-GB" w:eastAsia="en-GB"/>
+            </w:rPr>
+          </w:pPr>
+          <w:hyperlink w:anchor="_Toc86917657" w:history="1">
+            <w:r>
+              <w:rPr>
+                <w:rStyle w:val="Hyperlink"/>
+                <w:noProof/>
+              </w:rPr>
+              <w:t>5.1.3</w:t>
+            </w:r>
+            <w:r>
+              <w:rPr>
+                <w:rFonts w:asciiTheme="minorHAnsi" w:eastAsiaTheme="minorEastAsia" w:hAnsiTheme="minorHAnsi"/>
+                <w:noProof/>
+                <w:sz w:val="22"/>
+                <w:lang w:val="en-GB" w:eastAsia="en-GB"/>
+              </w:rPr>
+              <w:tab/>
+            </w:r>
+            <w:r>
+              <w:rPr>
+                <w:rStyle w:val="Hyperlink"/>
+                <w:noProof/>
+              </w:rPr>
+              <w:t>меморијска ФИФО (енг. FIFO – First In First Out) банка</w:t>
+            </w:r>
+            <w:r>
+              <w:rPr>
+                <w:noProof/>
+                <w:webHidden/>
+              </w:rPr>
+              <w:tab/>
+            </w:r>
+            <w:r>
+              <w:rPr>
+                <w:noProof/>
+                <w:webHidden/>
+              </w:rPr>
+              <w:fldChar w:fldCharType="begin"/>
+            </w:r>
+            <w:r>
+              <w:rPr>
+                <w:noProof/>
+                <w:webHidden/>
+              </w:rPr>
+              <w:instrText xml:space="preserve"> PAGEREF _Toc86917657 \h </w:instrText>
+            </w:r>
+            <w:r>
+              <w:rPr>
+                <w:noProof/>
+                <w:webHidden/>
+              </w:rPr>
+            </w:r>
+            <w:r>
+              <w:rPr>
+                <w:noProof/>
+                <w:webHidden/>
+              </w:rPr>
+              <w:fldChar w:fldCharType="separate"/>
+            </w:r>
+            <w:r>
+              <w:rPr>
+                <w:noProof/>
+                <w:webHidden/>
+              </w:rPr>
+              <w:t>23</w:t>
             </w:r>
             <w:r>
               <w:rPr>
@@ -3088,7 +3350,7 @@
               <w:lang w:val="en-GB" w:eastAsia="en-GB"/>
             </w:rPr>
           </w:pPr>
-          <w:hyperlink w:anchor="_Toc84936797" w:history="1">
+          <w:hyperlink w:anchor="_Toc86917658" w:history="1">
             <w:r>
               <w:rPr>
                 <w:rStyle w:val="Hyperlink"/>
@@ -3112,7 +3374,7 @@
                 <w:noProof/>
                 <w:lang w:val="sr-Cyrl-RS"/>
               </w:rPr>
-              <w:t>ОПИС ДИЗАЈНА</w:t>
+              <w:t>ЗАКЉУЧАК</w:t>
             </w:r>
             <w:r>
               <w:rPr>
@@ -3133,7 +3395,7 @@
                 <w:noProof/>
                 <w:webHidden/>
               </w:rPr>
-              <w:instrText xml:space="preserve"> PAGEREF _Toc84936797 \h </w:instrText>
+              <w:instrText xml:space="preserve"> PAGEREF _Toc86917658 \h </w:instrText>
             </w:r>
             <w:r>
               <w:rPr>
@@ -3153,7 +3415,7 @@
                 <w:noProof/>
                 <w:webHidden/>
               </w:rPr>
-              <w:t>15</w:t>
+              <w:t>24</w:t>
             </w:r>
             <w:r>
               <w:rPr>
@@ -3178,7 +3440,7 @@
               <w:lang w:val="en-GB" w:eastAsia="en-GB"/>
             </w:rPr>
           </w:pPr>
-          <w:hyperlink w:anchor="_Toc84936798" w:history="1">
+          <w:hyperlink w:anchor="_Toc86917659" w:history="1">
             <w:r>
               <w:rPr>
                 <w:rStyle w:val="Hyperlink"/>
@@ -3202,7 +3464,7 @@
                 <w:noProof/>
                 <w:lang w:val="sr-Cyrl-RS"/>
               </w:rPr>
-              <w:t>ЗАКЉУЧАК</w:t>
+              <w:t>ЛИТЕРАТУРА</w:t>
             </w:r>
             <w:r>
               <w:rPr>
@@ -3223,7 +3485,7 @@
                 <w:noProof/>
                 <w:webHidden/>
               </w:rPr>
-              <w:instrText xml:space="preserve"> PAGEREF _Toc84936798 \h </w:instrText>
+              <w:instrText xml:space="preserve"> PAGEREF _Toc86917659 \h </w:instrText>
             </w:r>
             <w:r>
               <w:rPr>
@@ -3243,97 +3505,7 @@
                 <w:noProof/>
                 <w:webHidden/>
               </w:rPr>
-              <w:t>17</w:t>
-            </w:r>
-            <w:r>
-              <w:rPr>
-                <w:noProof/>
-                <w:webHidden/>
-              </w:rPr>
-              <w:fldChar w:fldCharType="end"/>
-            </w:r>
-          </w:hyperlink>
-        </w:p>
-        <w:p>
-          <w:pPr>
-            <w:pStyle w:val="TOC1"/>
-            <w:tabs>
-              <w:tab w:val="left" w:pos="480"/>
-              <w:tab w:val="right" w:leader="dot" w:pos="8656"/>
-            </w:tabs>
-            <w:rPr>
-              <w:rFonts w:asciiTheme="minorHAnsi" w:eastAsiaTheme="minorEastAsia" w:hAnsiTheme="minorHAnsi"/>
-              <w:noProof/>
-              <w:sz w:val="22"/>
-              <w:lang w:val="en-GB" w:eastAsia="en-GB"/>
-            </w:rPr>
-          </w:pPr>
-          <w:hyperlink w:anchor="_Toc84936799" w:history="1">
-            <w:r>
-              <w:rPr>
-                <w:rStyle w:val="Hyperlink"/>
-                <w:noProof/>
-                <w:lang w:val="sr-Cyrl-RS"/>
-              </w:rPr>
-              <w:t>8</w:t>
-            </w:r>
-            <w:r>
-              <w:rPr>
-                <w:rFonts w:asciiTheme="minorHAnsi" w:eastAsiaTheme="minorEastAsia" w:hAnsiTheme="minorHAnsi"/>
-                <w:noProof/>
-                <w:sz w:val="22"/>
-                <w:lang w:val="en-GB" w:eastAsia="en-GB"/>
-              </w:rPr>
-              <w:tab/>
-            </w:r>
-            <w:r>
-              <w:rPr>
-                <w:rStyle w:val="Hyperlink"/>
-                <w:noProof/>
-                <w:lang w:val="sr-Cyrl-RS"/>
-              </w:rPr>
-              <w:t>ЛИТЕРАТУРА</w:t>
-            </w:r>
-            <w:r>
-              <w:rPr>
-                <w:noProof/>
-                <w:webHidden/>
-              </w:rPr>
-              <w:tab/>
-            </w:r>
-            <w:r>
-              <w:rPr>
-                <w:noProof/>
-                <w:webHidden/>
-              </w:rPr>
-              <w:fldChar w:fldCharType="begin"/>
-            </w:r>
-            <w:r>
-              <w:rPr>
-                <w:noProof/>
-                <w:webHidden/>
-              </w:rPr>
-              <w:instrText xml:space="preserve"> PAGEREF _Toc84936799 \h </w:instrText>
-            </w:r>
-            <w:r>
-              <w:rPr>
-                <w:noProof/>
-                <w:webHidden/>
-              </w:rPr>
-            </w:r>
-            <w:r>
-              <w:rPr>
-                <w:noProof/>
-                <w:webHidden/>
-              </w:rPr>
-              <w:fldChar w:fldCharType="separate"/>
-            </w:r>
-            <w:r>
-              <w:rPr>
-                <w:noProof/>
-                <w:webHidden/>
-              </w:rPr>
-              <w:t>18</w:t>
+              <w:t>25</w:t>
             </w:r>
             <w:r>
               <w:rPr>
@@ -3426,7 +3598,7 @@
           <w:lang w:val="sr-Cyrl-RS"/>
         </w:rPr>
       </w:pPr>
-      <w:bookmarkStart w:id="24" w:name="_Toc84936784"/>
+      <w:bookmarkStart w:id="24" w:name="_Toc86917642"/>
       <w:r>
         <w:rPr>
           <w:lang w:val="sr-Cyrl-RS"/>
@@ -3747,7 +3919,7 @@
           <w:lang w:val="sr-Cyrl-RS"/>
         </w:rPr>
       </w:pPr>
-      <w:bookmarkStart w:id="25" w:name="_Toc84936785"/>
+      <w:bookmarkStart w:id="25" w:name="_Toc86917643"/>
       <w:r>
         <w:rPr>
           <w:lang w:val="sr-Cyrl-RS"/>
@@ -3791,7 +3963,7 @@
         </w:rPr>
         <w:fldChar w:fldCharType="separate"/>
       </w:r>
-      <w:hyperlink w:anchor="_Toc84936770" w:history="1">
+      <w:hyperlink w:anchor="_Toc86917660" w:history="1">
         <w:r>
           <w:rPr>
             <w:rStyle w:val="Hyperlink"/>
@@ -3818,7 +3990,7 @@
             <w:noProof/>
             <w:webHidden/>
           </w:rPr>
-          <w:instrText xml:space="preserve"> PAGEREF _Toc84936770 \h </w:instrText>
+          <w:instrText xml:space="preserve"> PAGEREF _Toc86917660 \h </w:instrText>
         </w:r>
         <w:r>
           <w:rPr>
@@ -3862,7 +4034,7 @@
           <w:lang w:val="en-GB" w:eastAsia="en-GB"/>
         </w:rPr>
       </w:pPr>
-      <w:hyperlink w:anchor="_Toc84936771" w:history="1">
+      <w:hyperlink w:anchor="_Toc86917661" w:history="1">
         <w:r>
           <w:rPr>
             <w:rStyle w:val="Hyperlink"/>
@@ -3889,7 +4061,7 @@
             <w:noProof/>
             <w:webHidden/>
           </w:rPr>
-          <w:instrText xml:space="preserve"> PAGEREF _Toc84936771 \h </w:instrText>
+          <w:instrText xml:space="preserve"> PAGEREF _Toc86917661 \h </w:instrText>
         </w:r>
         <w:r>
           <w:rPr>
@@ -3933,7 +4105,7 @@
           <w:lang w:val="en-GB" w:eastAsia="en-GB"/>
         </w:rPr>
       </w:pPr>
-      <w:hyperlink w:anchor="_Toc84936772" w:history="1">
+      <w:hyperlink w:anchor="_Toc86917662" w:history="1">
         <w:r>
           <w:rPr>
             <w:rStyle w:val="Hyperlink"/>
@@ -4013,7 +4185,7 @@
             <w:noProof/>
             <w:webHidden/>
           </w:rPr>
-          <w:instrText xml:space="preserve"> PAGEREF _Toc84936772 \h </w:instrText>
+          <w:instrText xml:space="preserve"> PAGEREF _Toc86917662 \h </w:instrText>
         </w:r>
         <w:r>
           <w:rPr>
@@ -4057,7 +4229,7 @@
           <w:lang w:val="en-GB" w:eastAsia="en-GB"/>
         </w:rPr>
       </w:pPr>
-      <w:hyperlink w:anchor="_Toc84936773" w:history="1">
+      <w:hyperlink w:anchor="_Toc86917663" w:history="1">
         <w:r>
           <w:rPr>
             <w:rStyle w:val="Hyperlink"/>
@@ -4092,7 +4264,7 @@
             <w:noProof/>
             <w:webHidden/>
           </w:rPr>
-          <w:instrText xml:space="preserve"> PAGEREF _Toc84936773 \h </w:instrText>
+          <w:instrText xml:space="preserve"> PAGEREF _Toc86917663 \h </w:instrText>
         </w:r>
         <w:r>
           <w:rPr>
@@ -4136,7 +4308,7 @@
           <w:lang w:val="en-GB" w:eastAsia="en-GB"/>
         </w:rPr>
       </w:pPr>
-      <w:hyperlink w:anchor="_Toc84936774" w:history="1">
+      <w:hyperlink w:anchor="_Toc86917664" w:history="1">
         <w:r>
           <w:rPr>
             <w:rStyle w:val="Hyperlink"/>
@@ -4198,7 +4370,7 @@
             <w:noProof/>
             <w:webHidden/>
           </w:rPr>
-          <w:instrText xml:space="preserve"> PAGEREF _Toc84936774 \h </w:instrText>
+          <w:instrText xml:space="preserve"> PAGEREF _Toc86917664 \h </w:instrText>
         </w:r>
         <w:r>
           <w:rPr>
@@ -4242,7 +4414,7 @@
           <w:lang w:val="en-GB" w:eastAsia="en-GB"/>
         </w:rPr>
       </w:pPr>
-      <w:hyperlink w:anchor="_Toc84936775" w:history="1">
+      <w:hyperlink w:anchor="_Toc86917665" w:history="1">
         <w:r>
           <w:rPr>
             <w:rStyle w:val="Hyperlink"/>
@@ -4277,7 +4449,7 @@
             <w:noProof/>
             <w:webHidden/>
           </w:rPr>
-          <w:instrText xml:space="preserve"> PAGEREF _Toc84936775 \h </w:instrText>
+          <w:instrText xml:space="preserve"> PAGEREF _Toc86917665 \h </w:instrText>
         </w:r>
         <w:r>
           <w:rPr>
@@ -4321,7 +4493,7 @@
           <w:lang w:val="en-GB" w:eastAsia="en-GB"/>
         </w:rPr>
       </w:pPr>
-      <w:hyperlink w:anchor="_Toc84936776" w:history="1">
+      <w:hyperlink w:anchor="_Toc86917666" w:history="1">
         <w:r>
           <w:rPr>
             <w:rStyle w:val="Hyperlink"/>
@@ -4356,7 +4528,7 @@
             <w:noProof/>
             <w:webHidden/>
           </w:rPr>
-          <w:instrText xml:space="preserve"> PAGEREF _Toc84936776 \h </w:instrText>
+          <w:instrText xml:space="preserve"> PAGEREF _Toc86917666 \h </w:instrText>
         </w:r>
         <w:r>
           <w:rPr>
@@ -4400,7 +4572,7 @@
           <w:lang w:val="en-GB" w:eastAsia="en-GB"/>
         </w:rPr>
       </w:pPr>
-      <w:hyperlink w:anchor="_Toc84936777" w:history="1">
+      <w:hyperlink w:anchor="_Toc86917667" w:history="1">
         <w:r>
           <w:rPr>
             <w:rStyle w:val="Hyperlink"/>
@@ -4444,7 +4616,7 @@
             <w:noProof/>
             <w:webHidden/>
           </w:rPr>
-          <w:instrText xml:space="preserve"> PAGEREF _Toc84936777 \h </w:instrText>
+          <w:instrText xml:space="preserve"> PAGEREF _Toc86917667 \h </w:instrText>
         </w:r>
         <w:r>
           <w:rPr>
@@ -4488,7 +4660,7 @@
           <w:lang w:val="en-GB" w:eastAsia="en-GB"/>
         </w:rPr>
       </w:pPr>
-      <w:hyperlink w:anchor="_Toc84936778" w:history="1">
+      <w:hyperlink w:anchor="_Toc86917668" w:history="1">
         <w:r>
           <w:rPr>
             <w:rStyle w:val="Hyperlink"/>
@@ -4523,7 +4695,7 @@
             <w:noProof/>
             <w:webHidden/>
           </w:rPr>
-          <w:instrText xml:space="preserve"> PAGEREF _Toc84936778 \h </w:instrText>
+          <w:instrText xml:space="preserve"> PAGEREF _Toc86917668 \h </w:instrText>
         </w:r>
         <w:r>
           <w:rPr>
@@ -4567,7 +4739,7 @@
           <w:lang w:val="en-GB" w:eastAsia="en-GB"/>
         </w:rPr>
       </w:pPr>
-      <w:hyperlink w:anchor="_Toc84936779" w:history="1">
+      <w:hyperlink w:anchor="_Toc86917669" w:history="1">
         <w:r>
           <w:rPr>
             <w:rStyle w:val="Hyperlink"/>
@@ -4602,7 +4774,7 @@
             <w:noProof/>
             <w:webHidden/>
           </w:rPr>
-          <w:instrText xml:space="preserve"> PAGEREF _Toc84936779 \h </w:instrText>
+          <w:instrText xml:space="preserve"> PAGEREF _Toc86917669 \h </w:instrText>
         </w:r>
         <w:r>
           <w:rPr>
@@ -4646,7 +4818,7 @@
           <w:lang w:val="en-GB" w:eastAsia="en-GB"/>
         </w:rPr>
       </w:pPr>
-      <w:hyperlink w:anchor="_Toc84936780" w:history="1">
+      <w:hyperlink w:anchor="_Toc86917670" w:history="1">
         <w:r>
           <w:rPr>
             <w:rStyle w:val="Hyperlink"/>
@@ -4681,7 +4853,7 @@
             <w:noProof/>
             <w:webHidden/>
           </w:rPr>
-          <w:instrText xml:space="preserve"> PAGEREF _Toc84936780 \h </w:instrText>
+          <w:instrText xml:space="preserve"> PAGEREF _Toc86917670 \h </w:instrText>
         </w:r>
         <w:r>
           <w:rPr>
@@ -4725,7 +4897,7 @@
           <w:lang w:val="en-GB" w:eastAsia="en-GB"/>
         </w:rPr>
       </w:pPr>
-      <w:hyperlink w:anchor="_Toc84936781" w:history="1">
+      <w:hyperlink w:anchor="_Toc86917671" w:history="1">
         <w:r>
           <w:rPr>
             <w:rStyle w:val="Hyperlink"/>
@@ -4799,7 +4971,7 @@
             <w:noProof/>
             <w:webHidden/>
           </w:rPr>
-          <w:instrText xml:space="preserve"> PAGEREF _Toc84936781 \h </w:instrText>
+          <w:instrText xml:space="preserve"> PAGEREF _Toc86917671 \h </w:instrText>
         </w:r>
         <w:r>
           <w:rPr>
@@ -4843,7 +5015,7 @@
           <w:lang w:val="en-GB" w:eastAsia="en-GB"/>
         </w:rPr>
       </w:pPr>
-      <w:hyperlink w:anchor="_Toc84936782" w:history="1">
+      <w:hyperlink w:anchor="_Toc86917672" w:history="1">
         <w:r>
           <w:rPr>
             <w:rStyle w:val="Hyperlink"/>
@@ -4878,7 +5050,7 @@
             <w:noProof/>
             <w:webHidden/>
           </w:rPr>
-          <w:instrText xml:space="preserve"> PAGEREF _Toc84936782 \h </w:instrText>
+          <w:instrText xml:space="preserve"> PAGEREF _Toc86917672 \h </w:instrText>
         </w:r>
         <w:r>
           <w:rPr>
@@ -4922,7 +5094,7 @@
           <w:lang w:val="en-GB" w:eastAsia="en-GB"/>
         </w:rPr>
       </w:pPr>
-      <w:hyperlink w:anchor="_Toc84936783" w:history="1">
+      <w:hyperlink w:anchor="_Toc86917673" w:history="1">
         <w:r>
           <w:rPr>
             <w:rStyle w:val="Hyperlink"/>
@@ -4972,7 +5144,7 @@
             <w:noProof/>
             <w:webHidden/>
           </w:rPr>
-          <w:instrText xml:space="preserve"> PAGEREF _Toc84936783 \h </w:instrText>
+          <w:instrText xml:space="preserve"> PAGEREF _Toc86917673 \h </w:instrText>
         </w:r>
         <w:r>
           <w:rPr>
@@ -5005,6 +5177,156 @@
     </w:p>
     <w:p>
       <w:pPr>
+        <w:pStyle w:val="TableofFigures"/>
+        <w:tabs>
+          <w:tab w:val="right" w:leader="dot" w:pos="8656"/>
+        </w:tabs>
+        <w:rPr>
+          <w:rFonts w:asciiTheme="minorHAnsi" w:eastAsiaTheme="minorEastAsia" w:hAnsiTheme="minorHAnsi"/>
+          <w:noProof/>
+          <w:sz w:val="22"/>
+          <w:lang w:val="en-GB" w:eastAsia="en-GB"/>
+        </w:rPr>
+      </w:pPr>
+      <w:hyperlink w:anchor="_Toc86917674" w:history="1">
+        <w:r>
+          <w:rPr>
+            <w:rStyle w:val="Hyperlink"/>
+            <w:noProof/>
+          </w:rPr>
+          <w:t>Слика 5.1: Видео скалер, блок дизајн</w:t>
+        </w:r>
+        <w:r>
+          <w:rPr>
+            <w:noProof/>
+            <w:webHidden/>
+          </w:rPr>
+          <w:tab/>
+        </w:r>
+        <w:r>
+          <w:rPr>
+            <w:noProof/>
+            <w:webHidden/>
+          </w:rPr>
+          <w:fldChar w:fldCharType="begin"/>
+        </w:r>
+        <w:r>
+          <w:rPr>
+            <w:noProof/>
+            <w:webHidden/>
+          </w:rPr>
+          <w:instrText xml:space="preserve"> PAGEREF _Toc86917674 \h </w:instrText>
+        </w:r>
+        <w:r>
+          <w:rPr>
+            <w:noProof/>
+            <w:webHidden/>
+          </w:rPr>
+        </w:r>
+        <w:r>
+          <w:rPr>
+            <w:noProof/>
+            <w:webHidden/>
+          </w:rPr>
+          <w:fldChar w:fldCharType="separate"/>
+        </w:r>
+        <w:r>
+          <w:rPr>
+            <w:noProof/>
+            <w:webHidden/>
+          </w:rPr>
+          <w:t>15</w:t>
+        </w:r>
+        <w:r>
+          <w:rPr>
+            <w:noProof/>
+            <w:webHidden/>
+          </w:rPr>
+          <w:fldChar w:fldCharType="end"/>
+        </w:r>
+      </w:hyperlink>
+    </w:p>
+    <w:p>
+      <w:pPr>
+        <w:pStyle w:val="TableofFigures"/>
+        <w:tabs>
+          <w:tab w:val="right" w:leader="dot" w:pos="8656"/>
+        </w:tabs>
+        <w:rPr>
+          <w:rFonts w:asciiTheme="minorHAnsi" w:eastAsiaTheme="minorEastAsia" w:hAnsiTheme="minorHAnsi"/>
+          <w:noProof/>
+          <w:sz w:val="22"/>
+          <w:lang w:val="en-GB" w:eastAsia="en-GB"/>
+        </w:rPr>
+      </w:pPr>
+      <w:hyperlink w:anchor="_Toc86917675" w:history="1">
+        <w:r>
+          <w:rPr>
+            <w:rStyle w:val="Hyperlink"/>
+            <w:noProof/>
+          </w:rPr>
+          <w:t>Слика 5.2</w:t>
+        </w:r>
+        <w:r>
+          <w:rPr>
+            <w:rStyle w:val="Hyperlink"/>
+            <w:noProof/>
+            <w:lang w:val="sr-Cyrl-RS"/>
+          </w:rPr>
+          <w:t>: Рачунање редног броја реда слике у баферу</w:t>
+        </w:r>
+        <w:r>
+          <w:rPr>
+            <w:noProof/>
+            <w:webHidden/>
+          </w:rPr>
+          <w:tab/>
+        </w:r>
+        <w:r>
+          <w:rPr>
+            <w:noProof/>
+            <w:webHidden/>
+          </w:rPr>
+          <w:fldChar w:fldCharType="begin"/>
+        </w:r>
+        <w:r>
+          <w:rPr>
+            <w:noProof/>
+            <w:webHidden/>
+          </w:rPr>
+          <w:instrText xml:space="preserve"> PAGEREF _Toc86917675 \h </w:instrText>
+        </w:r>
+        <w:r>
+          <w:rPr>
+            <w:noProof/>
+            <w:webHidden/>
+          </w:rPr>
+        </w:r>
+        <w:r>
+          <w:rPr>
+            <w:noProof/>
+            <w:webHidden/>
+          </w:rPr>
+          <w:fldChar w:fldCharType="separate"/>
+        </w:r>
+        <w:r>
+          <w:rPr>
+            <w:noProof/>
+            <w:webHidden/>
+          </w:rPr>
+          <w:t>16</w:t>
+        </w:r>
+        <w:r>
+          <w:rPr>
+            <w:noProof/>
+            <w:webHidden/>
+          </w:rPr>
+          <w:fldChar w:fldCharType="end"/>
+        </w:r>
+      </w:hyperlink>
+    </w:p>
+    <w:p>
+      <w:pPr>
         <w:jc w:val="left"/>
         <w:rPr>
           <w:sz w:val="28"/>
@@ -5036,7 +5358,7 @@
           <w:lang w:val="sr-Latn-RS"/>
         </w:rPr>
       </w:pPr>
-      <w:bookmarkStart w:id="26" w:name="_Toc84936786"/>
+      <w:bookmarkStart w:id="26" w:name="_Toc86917644"/>
       <w:r>
         <w:rPr>
           <w:lang w:val="sr-Latn-RS"/>
@@ -5132,7 +5454,7 @@
           <w:lang w:val="sr-Cyrl-RS"/>
         </w:rPr>
       </w:pPr>
-      <w:bookmarkStart w:id="27" w:name="_Toc84936787"/>
+      <w:bookmarkStart w:id="27" w:name="_Toc86917645"/>
       <w:r>
         <w:rPr>
           <w:lang w:val="sr-Cyrl-RS"/>
@@ -5359,7 +5681,7 @@
           <w:lang w:val="sr-Cyrl-RS"/>
         </w:rPr>
       </w:pPr>
-      <w:bookmarkStart w:id="28" w:name="_Toc84936788"/>
+      <w:bookmarkStart w:id="28" w:name="_Toc86917646"/>
       <w:r>
         <w:rPr>
           <w:lang w:val="sr-Cyrl-RS"/>
@@ -5861,7 +6183,7 @@
         </w:rPr>
         <w:lastRenderedPageBreak/>
         <w:drawing>
-          <wp:inline distT="0" distB="0" distL="0" distR="0" wp14:anchorId="60650EBA" wp14:editId="1FF2D362">
+          <wp:inline distT="0" distB="0" distL="0" distR="0" wp14:anchorId="3AD3AD66" wp14:editId="65AFF1A1">
             <wp:extent cx="4943475" cy="2895600"/>
             <wp:effectExtent l="0" t="0" r="9525" b="0"/>
             <wp:docPr id="5" name="Picture 5"/>
@@ -5912,7 +6234,7 @@
           <w:sz w:val="24"/>
         </w:rPr>
       </w:pPr>
-      <w:bookmarkStart w:id="30" w:name="_Toc84936770"/>
+      <w:bookmarkStart w:id="30" w:name="_Toc86917660"/>
       <w:proofErr w:type="spellStart"/>
       <w:r>
         <w:rPr>
@@ -6200,7 +6522,7 @@
           <w:lang w:val="en-GB" w:eastAsia="en-GB"/>
         </w:rPr>
         <w:drawing>
-          <wp:inline distT="0" distB="0" distL="0" distR="0" wp14:anchorId="41A419F6" wp14:editId="4F84D785">
+          <wp:inline distT="0" distB="0" distL="0" distR="0" wp14:anchorId="29D59A96" wp14:editId="029831F4">
             <wp:extent cx="5737225" cy="1524000"/>
             <wp:effectExtent l="0" t="0" r="0" b="0"/>
             <wp:docPr id="6" name="Picture 6"/>
@@ -6257,7 +6579,7 @@
           <w:sz w:val="24"/>
         </w:rPr>
       </w:pPr>
-      <w:bookmarkStart w:id="31" w:name="_Toc84936771"/>
+      <w:bookmarkStart w:id="31" w:name="_Toc86917661"/>
       <w:proofErr w:type="spellStart"/>
       <w:r>
         <w:rPr>
@@ -6652,7 +6974,7 @@
           <w:lang w:val="en-GB" w:eastAsia="en-GB"/>
         </w:rPr>
         <w:drawing>
-          <wp:inline distT="0" distB="0" distL="0" distR="0" wp14:anchorId="364CEB66" wp14:editId="3FEF78FA">
+          <wp:inline distT="0" distB="0" distL="0" distR="0" wp14:anchorId="23C11FBB" wp14:editId="42EB045B">
             <wp:extent cx="5729110" cy="1343025"/>
             <wp:effectExtent l="0" t="0" r="0" b="0"/>
             <wp:docPr id="7" name="Picture 7" descr="E:\video_scaler_repo\video_scaler\scaler_v2\doc\stream\user_and_last_is_eof.png"/>
@@ -6711,7 +7033,7 @@
           <w:lang w:val="sr-Cyrl-RS"/>
         </w:rPr>
       </w:pPr>
-      <w:bookmarkStart w:id="32" w:name="_Toc84936772"/>
+      <w:bookmarkStart w:id="32" w:name="_Toc86917662"/>
       <w:proofErr w:type="spellStart"/>
       <w:r>
         <w:rPr>
@@ -7307,7 +7629,7 @@
           <w:lang w:val="en-GB" w:eastAsia="en-GB"/>
         </w:rPr>
         <w:drawing>
-          <wp:inline distT="0" distB="0" distL="0" distR="0" wp14:anchorId="6100EF40" wp14:editId="7BE761AF">
+          <wp:inline distT="0" distB="0" distL="0" distR="0" wp14:anchorId="4D12E31C" wp14:editId="689F9105">
             <wp:extent cx="4593590" cy="3000375"/>
             <wp:effectExtent l="0" t="0" r="0" b="9525"/>
             <wp:docPr id="8" name="Picture 8"/>
@@ -7352,7 +7674,7 @@
           <w:sz w:val="24"/>
         </w:rPr>
       </w:pPr>
-      <w:bookmarkStart w:id="34" w:name="_Toc84936773"/>
+      <w:bookmarkStart w:id="34" w:name="_Toc86917663"/>
       <w:proofErr w:type="spellStart"/>
       <w:r>
         <w:rPr>
@@ -7565,7 +7887,7 @@
           <w:lang w:val="sr-Cyrl-RS"/>
         </w:rPr>
       </w:pPr>
-      <w:bookmarkStart w:id="35" w:name="_Toc84936789"/>
+      <w:bookmarkStart w:id="35" w:name="_Toc86917647"/>
       <w:r>
         <w:rPr>
           <w:lang w:val="sr-Cyrl-RS"/>
@@ -7840,7 +8162,7 @@
           <w:lang w:val="en-GB" w:eastAsia="en-GB"/>
         </w:rPr>
         <w:drawing>
-          <wp:inline distT="0" distB="0" distL="0" distR="0" wp14:anchorId="769B64F1" wp14:editId="427C60D2">
+          <wp:inline distT="0" distB="0" distL="0" distR="0" wp14:anchorId="4C8B6394" wp14:editId="1A77FAC9">
             <wp:extent cx="5048401" cy="2533650"/>
             <wp:effectExtent l="0" t="0" r="0" b="0"/>
             <wp:docPr id="4" name="Picture 4"/>
@@ -7891,7 +8213,7 @@
           <w:vertAlign w:val="superscript"/>
         </w:rPr>
       </w:pPr>
-      <w:bookmarkStart w:id="36" w:name="_Toc84936774"/>
+      <w:bookmarkStart w:id="36" w:name="_Toc86917664"/>
       <w:proofErr w:type="spellStart"/>
       <w:r>
         <w:rPr>
@@ -8860,7 +9182,7 @@
           <w:lang w:val="en-GB" w:eastAsia="en-GB"/>
         </w:rPr>
         <w:drawing>
-          <wp:inline distT="0" distB="0" distL="0" distR="0" wp14:anchorId="389B2817" wp14:editId="335DBEFE">
+          <wp:inline distT="0" distB="0" distL="0" distR="0" wp14:anchorId="07DCB894" wp14:editId="39A1CB26">
             <wp:extent cx="4410075" cy="2152649"/>
             <wp:effectExtent l="0" t="0" r="0" b="635"/>
             <wp:docPr id="9" name="Picture 9"/>
@@ -8917,7 +9239,7 @@
           <w:lang w:val="en-GB"/>
         </w:rPr>
       </w:pPr>
-      <w:bookmarkStart w:id="37" w:name="_Toc84936775"/>
+      <w:bookmarkStart w:id="37" w:name="_Toc86917665"/>
       <w:proofErr w:type="spellStart"/>
       <w:r>
         <w:rPr>
@@ -9410,7 +9732,7 @@
           <w:lang w:val="en-GB" w:eastAsia="en-GB"/>
         </w:rPr>
         <w:drawing>
-          <wp:inline distT="0" distB="0" distL="0" distR="0" wp14:anchorId="2E74D870" wp14:editId="53A00313">
+          <wp:inline distT="0" distB="0" distL="0" distR="0" wp14:anchorId="0EFB524A" wp14:editId="5A90A06C">
             <wp:extent cx="4467225" cy="2162175"/>
             <wp:effectExtent l="0" t="0" r="9525" b="9525"/>
             <wp:docPr id="10" name="Picture 10" descr="E:\video_scaler_repo\video_scaler\scaler_v2\doc\stream\preslikavanje_unazad.png"/>
@@ -9468,7 +9790,7 @@
           <w:lang w:val="sr-Cyrl-RS"/>
         </w:rPr>
       </w:pPr>
-      <w:bookmarkStart w:id="38" w:name="_Toc84936776"/>
+      <w:bookmarkStart w:id="38" w:name="_Toc86917666"/>
       <w:proofErr w:type="spellStart"/>
       <w:r>
         <w:rPr>
@@ -9608,7 +9930,7 @@
           <w:lang w:val="sr-Cyrl-RS"/>
         </w:rPr>
       </w:pPr>
-      <w:bookmarkStart w:id="39" w:name="_Toc84936790"/>
+      <w:bookmarkStart w:id="39" w:name="_Toc86917648"/>
       <w:r>
         <w:rPr>
           <w:lang w:val="sr-Cyrl-RS"/>
@@ -9645,7 +9967,7 @@
       <w:pPr>
         <w:pStyle w:val="Heading3"/>
       </w:pPr>
-      <w:bookmarkStart w:id="40" w:name="_Toc84936791"/>
+      <w:bookmarkStart w:id="40" w:name="_Toc86917649"/>
       <w:r>
         <w:t>о</w:t>
       </w:r>
@@ -9722,7 +10044,7 @@
           <w:lang w:val="en-US"/>
         </w:rPr>
       </w:pPr>
-      <w:bookmarkStart w:id="41" w:name="_Toc84936792"/>
+      <w:bookmarkStart w:id="41" w:name="_Toc86917650"/>
       <w:r>
         <w:t>н</w:t>
       </w:r>
@@ -9747,7 +10069,7 @@
           <w:lang w:val="sr-Cyrl-RS"/>
         </w:rPr>
       </w:pPr>
-      <w:bookmarkStart w:id="42" w:name="_Toc84936777"/>
+      <w:bookmarkStart w:id="42" w:name="_Toc86917667"/>
       <w:r>
         <w:rPr>
           <w:lang w:val="sr-Cyrl-RS"/>
@@ -9938,7 +10260,7 @@
           <w:lang w:val="en-GB" w:eastAsia="en-GB"/>
         </w:rPr>
         <w:drawing>
-          <wp:inline distT="0" distB="0" distL="0" distR="0" wp14:anchorId="3CA2C732" wp14:editId="4BC09418">
+          <wp:inline distT="0" distB="0" distL="0" distR="0" wp14:anchorId="79672A45" wp14:editId="05CD8D82">
             <wp:extent cx="3308985" cy="3019425"/>
             <wp:effectExtent l="0" t="0" r="5715" b="9525"/>
             <wp:docPr id="3" name="Picture 3"/>
@@ -9988,7 +10310,7 @@
           <w:sz w:val="24"/>
         </w:rPr>
       </w:pPr>
-      <w:bookmarkStart w:id="43" w:name="_Toc84936778"/>
+      <w:bookmarkStart w:id="43" w:name="_Toc86917668"/>
       <w:proofErr w:type="spellStart"/>
       <w:r>
         <w:rPr>
@@ -10097,7 +10419,7 @@
           <w:lang w:val="en-GB" w:eastAsia="en-GB"/>
         </w:rPr>
         <w:drawing>
-          <wp:inline distT="0" distB="0" distL="0" distR="0" wp14:anchorId="35FE28C6" wp14:editId="726EF56A">
+          <wp:inline distT="0" distB="0" distL="0" distR="0" wp14:anchorId="39BA7231" wp14:editId="40BBA3F5">
             <wp:extent cx="2848373" cy="2829320"/>
             <wp:effectExtent l="0" t="0" r="9525" b="9525"/>
             <wp:docPr id="11" name="Picture 11"/>
@@ -10148,7 +10470,7 @@
           <w:lang w:val="sr-Cyrl-RS"/>
         </w:rPr>
       </w:pPr>
-      <w:bookmarkStart w:id="44" w:name="_Toc84936779"/>
+      <w:bookmarkStart w:id="44" w:name="_Toc86917669"/>
       <w:proofErr w:type="spellStart"/>
       <w:r>
         <w:rPr>
@@ -10294,7 +10616,7 @@
         </w:rPr>
         <w:lastRenderedPageBreak/>
         <w:drawing>
-          <wp:inline distT="0" distB="0" distL="0" distR="0" wp14:anchorId="25C9DA45" wp14:editId="4BC75F29">
+          <wp:inline distT="0" distB="0" distL="0" distR="0" wp14:anchorId="798DC5E4" wp14:editId="4EEDBE81">
             <wp:extent cx="3095625" cy="2790825"/>
             <wp:effectExtent l="0" t="0" r="9525" b="9525"/>
             <wp:docPr id="13" name="Picture 13"/>
@@ -10344,7 +10666,7 @@
           <w:sz w:val="24"/>
         </w:rPr>
       </w:pPr>
-      <w:bookmarkStart w:id="45" w:name="_Toc84936780"/>
+      <w:bookmarkStart w:id="45" w:name="_Toc86917670"/>
       <w:proofErr w:type="spellStart"/>
       <w:r>
         <w:rPr>
@@ -10443,7 +10765,7 @@
           <w:lang w:val="en-US"/>
         </w:rPr>
       </w:pPr>
-      <w:bookmarkStart w:id="46" w:name="_Toc84936793"/>
+      <w:bookmarkStart w:id="46" w:name="_Toc86917651"/>
       <w:r>
         <w:t>билинеарна</w:t>
       </w:r>
@@ -10459,7 +10781,7 @@
       <w:pPr>
         <w:ind w:left="-90" w:firstLine="720"/>
       </w:pPr>
-      <w:bookmarkStart w:id="47" w:name="_Toc84936781"/>
+      <w:bookmarkStart w:id="47" w:name="_Toc86917671"/>
       <w:r>
         <w:rPr>
           <w:lang w:val="sr-Cyrl-RS"/>
@@ -10732,7 +11054,7 @@
           <w:lang w:val="en-GB" w:eastAsia="en-GB"/>
         </w:rPr>
         <w:drawing>
-          <wp:inline distT="0" distB="0" distL="0" distR="0" wp14:anchorId="3A9A766C" wp14:editId="52BDCE7F">
+          <wp:inline distT="0" distB="0" distL="0" distR="0" wp14:anchorId="11B22C50" wp14:editId="7B5ABD8B">
             <wp:extent cx="3294477" cy="2866390"/>
             <wp:effectExtent l="0" t="0" r="1270" b="0"/>
             <wp:docPr id="12" name="Picture 12"/>
@@ -10783,7 +11105,7 @@
           <w:lang w:val="sr-Cyrl-RS"/>
         </w:rPr>
       </w:pPr>
-      <w:bookmarkStart w:id="48" w:name="_Toc84936782"/>
+      <w:bookmarkStart w:id="48" w:name="_Toc86917672"/>
       <w:proofErr w:type="spellStart"/>
       <w:r>
         <w:rPr>
@@ -11051,7 +11373,7 @@
           <w:lang w:val="sr-Cyrl-RS"/>
         </w:rPr>
       </w:pPr>
-      <w:bookmarkStart w:id="49" w:name="_Toc84936783"/>
+      <w:bookmarkStart w:id="49" w:name="_Toc86917673"/>
       <w:proofErr w:type="spellStart"/>
       <w:r>
         <w:rPr>
@@ -11540,7 +11862,7 @@
           <w:lang w:val="en-US"/>
         </w:rPr>
       </w:pPr>
-      <w:bookmarkStart w:id="50" w:name="_Toc84936794"/>
+      <w:bookmarkStart w:id="50" w:name="_Toc86917652"/>
       <w:r>
         <w:t>бикубична</w:t>
       </w:r>
@@ -11585,7 +11907,7 @@
           <w:lang w:val="sr-Cyrl-RS"/>
         </w:rPr>
       </w:pPr>
-      <w:bookmarkStart w:id="51" w:name="_Toc84936796"/>
+      <w:bookmarkStart w:id="51" w:name="_Toc86917653"/>
       <w:r>
         <w:rPr>
           <w:lang w:val="sr-Cyrl-RS"/>
@@ -11822,7 +12144,7 @@
           <w:lang w:val="sr-Cyrl-RS"/>
         </w:rPr>
       </w:pPr>
-      <w:bookmarkStart w:id="52" w:name="_Toc84936797"/>
+      <w:bookmarkStart w:id="52" w:name="_Toc86917654"/>
       <w:r>
         <w:rPr>
           <w:lang w:val="sr-Cyrl-RS"/>
@@ -11870,7 +12192,7 @@
           <w:lang w:val="en-GB" w:eastAsia="en-GB"/>
         </w:rPr>
         <w:drawing>
-          <wp:inline distT="0" distB="0" distL="0" distR="0" wp14:anchorId="64859AD6" wp14:editId="7491F4E2">
+          <wp:inline distT="0" distB="0" distL="0" distR="0" wp14:anchorId="63267E72" wp14:editId="56CDCC7B">
             <wp:extent cx="3698404" cy="2870200"/>
             <wp:effectExtent l="0" t="0" r="0" b="6350"/>
             <wp:docPr id="15" name="Picture 15"/>
@@ -11921,6 +12243,7 @@
           <w:lang w:val="sr-Cyrl-RS"/>
         </w:rPr>
       </w:pPr>
+      <w:bookmarkStart w:id="53" w:name="_Toc86917674"/>
       <w:proofErr w:type="spellStart"/>
       <w:r>
         <w:rPr>
@@ -12058,6 +12381,7 @@
         </w:rPr>
         <w:t>дизајн</w:t>
       </w:r>
+      <w:bookmarkEnd w:id="53"/>
       <w:proofErr w:type="spellEnd"/>
     </w:p>
     <w:p/>
@@ -12078,6 +12402,7 @@
       <w:pPr>
         <w:pStyle w:val="Heading3"/>
       </w:pPr>
+      <w:bookmarkStart w:id="54" w:name="_Toc86917655"/>
       <w:r>
         <w:lastRenderedPageBreak/>
         <w:t xml:space="preserve">Прилагођење улазног тока података на филтер (енг. </w:t>
@@ -12091,6 +12416,7 @@
       <w:r>
         <w:t>модул)</w:t>
       </w:r>
+      <w:bookmarkEnd w:id="54"/>
     </w:p>
     <w:p/>
     <w:p>
@@ -12104,7 +12430,7 @@
           <w:lang w:val="en-GB" w:eastAsia="en-GB"/>
         </w:rPr>
         <w:drawing>
-          <wp:inline distT="0" distB="0" distL="0" distR="0" wp14:anchorId="5814BC33" wp14:editId="2E84DD8D">
+          <wp:inline distT="0" distB="0" distL="0" distR="0" wp14:anchorId="302A6832" wp14:editId="65EC1403">
             <wp:extent cx="4266310" cy="2784863"/>
             <wp:effectExtent l="0" t="0" r="1270" b="0"/>
             <wp:docPr id="16" name="Picture 16"/>
@@ -12155,6 +12481,7 @@
           <w:lang w:val="sr-Cyrl-RS"/>
         </w:rPr>
       </w:pPr>
+      <w:bookmarkStart w:id="55" w:name="_Toc86917675"/>
       <w:proofErr w:type="spellStart"/>
       <w:r>
         <w:rPr>
@@ -12244,6 +12571,7 @@
         </w:rPr>
         <w:t>: Рачунање редног броја реда слике у баферу</w:t>
       </w:r>
+      <w:bookmarkEnd w:id="55"/>
     </w:p>
     <w:p>
       <w:pPr>
@@ -12375,31 +12703,226 @@
       <w:pPr>
         <w:pStyle w:val="Heading3"/>
       </w:pPr>
+      <w:bookmarkStart w:id="56" w:name="_Toc86917656"/>
       <w:r>
         <w:lastRenderedPageBreak/>
         <w:t>билинеарни филтер</w:t>
       </w:r>
-    </w:p>
-    <w:p>
-      <w:pPr>
-        <w:rPr>
-          <w:lang w:val="sr-Cyrl-RS"/>
-        </w:rPr>
-      </w:pPr>
-    </w:p>
-    <w:p>
-      <w:pPr>
+      <w:bookmarkEnd w:id="56"/>
+    </w:p>
+    <w:p>
+      <w:pPr>
+        <w:rPr>
+          <w:lang w:val="sr-Cyrl-RS"/>
+        </w:rPr>
+      </w:pPr>
+    </w:p>
+    <w:p>
+      <w:pPr>
+        <w:ind w:firstLine="432"/>
+        <w:rPr>
+          <w:lang w:val="sr-Cyrl-RS"/>
+        </w:rPr>
+      </w:pPr>
+      <w:r>
+        <w:rPr>
+          <w:lang w:val="sr-Cyrl-RS"/>
+        </w:rPr>
+        <w:t>Билинеарни филтер је модул који у наведеном дизајну за промјену димензија слике обавља рачунање вриједности интензитета тачака резултујуће</w:t>
+      </w:r>
+      <w:r>
+        <w:t xml:space="preserve"> </w:t>
+      </w:r>
+      <w:r>
+        <w:rPr>
+          <w:lang w:val="sr-Cyrl-RS"/>
+        </w:rPr>
+        <w:t>слике</w:t>
+      </w:r>
+      <w:r>
+        <w:rPr>
+          <w:lang w:val="sr-Cyrl-RS"/>
+        </w:rPr>
+        <w:t xml:space="preserve">. </w:t>
+      </w:r>
+      <w:r>
+        <w:rPr>
+          <w:lang w:val="sr-Cyrl-RS"/>
+        </w:rPr>
+        <w:t>За исправан рад модула потребне су следеће информације:</w:t>
+      </w:r>
+    </w:p>
+    <w:p>
+      <w:pPr>
+        <w:pStyle w:val="ListParagraph"/>
+        <w:numPr>
+          <w:ilvl w:val="0"/>
+          <w:numId w:val="14"/>
+        </w:numPr>
+        <w:rPr>
+          <w:lang w:val="sr-Cyrl-RS"/>
+        </w:rPr>
+      </w:pPr>
+      <w:r>
+        <w:rPr>
+          <w:lang w:val="sr-Cyrl-RS"/>
+        </w:rPr>
+        <w:t>вриједности интензитета двије сусједне тачке улазне слике</w:t>
+      </w:r>
+    </w:p>
+    <w:p>
+      <w:pPr>
+        <w:pStyle w:val="ListParagraph"/>
+        <w:numPr>
+          <w:ilvl w:val="0"/>
+          <w:numId w:val="14"/>
+        </w:numPr>
+        <w:rPr>
+          <w:lang w:val="sr-Cyrl-RS"/>
+        </w:rPr>
+      </w:pPr>
+      <w:r>
+        <w:rPr>
+          <w:lang w:val="sr-Cyrl-RS"/>
+        </w:rPr>
+        <w:t>позиција тачака у улазној слици (ако се филтер користи за вертикалну промјену димензија потребна информација јесте ред слике из којег добијамо тачку са индексом 0, док у случају хоризонталне промјене димензија требамо информацију о колони)</w:t>
+      </w:r>
+    </w:p>
+    <w:p>
+      <w:pPr>
+        <w:pStyle w:val="ListParagraph"/>
+        <w:numPr>
+          <w:ilvl w:val="0"/>
+          <w:numId w:val="14"/>
+        </w:numPr>
+        <w:rPr>
+          <w:lang w:val="sr-Cyrl-RS"/>
+        </w:rPr>
+      </w:pPr>
+      <w:r>
+        <w:rPr>
+          <w:lang w:val="sr-Cyrl-RS"/>
+        </w:rPr>
+        <w:t>информације о димензијама улазног реда или колоне (у зависности да ли се филтер користи за вертикалну или хоризонталну промјну димензије слике) добијају се као параметри</w:t>
+      </w:r>
+      <w:r>
+        <w:t xml:space="preserve">, </w:t>
+      </w:r>
+      <w:r>
+        <w:rPr>
+          <w:lang w:val="sr-Cyrl-RS"/>
+        </w:rPr>
+        <w:t>а на основу њих у модулу се рачуна фактор скалирања</w:t>
+      </w:r>
+    </w:p>
+    <w:p>
+      <w:pPr>
+        <w:pStyle w:val="ListParagraph"/>
+        <w:numPr>
+          <w:ilvl w:val="0"/>
+          <w:numId w:val="14"/>
+        </w:numPr>
+        <w:rPr>
+          <w:lang w:val="sr-Cyrl-RS"/>
+        </w:rPr>
+      </w:pPr>
+      <w:r>
+        <w:rPr>
+          <w:lang w:val="sr-Cyrl-RS"/>
+        </w:rPr>
+        <w:t>максимална димензија излазне слике (потребна да би се поставиле одговарајће ширине података унутар модула)</w:t>
+      </w:r>
+    </w:p>
+    <w:p>
+      <w:pPr>
+        <w:pStyle w:val="ListParagraph"/>
+        <w:numPr>
+          <w:ilvl w:val="0"/>
+          <w:numId w:val="14"/>
+        </w:numPr>
+        <w:rPr>
+          <w:lang w:val="sr-Cyrl-RS"/>
+        </w:rPr>
+      </w:pPr>
+      <w:r>
+        <w:rPr>
+          <w:lang w:val="sr-Cyrl-RS"/>
+        </w:rPr>
+        <w:t>максималан број фаза модула (максималан број</w:t>
+      </w:r>
+      <w:r>
+        <w:rPr>
+          <w:lang w:val="sr-Cyrl-RS"/>
+        </w:rPr>
+        <w:t xml:space="preserve"> излазних пиксела које у једном такту можемо прорачунати на основу тренутних улаза и добити на излазу модула</w:t>
+      </w:r>
+    </w:p>
+    <w:p>
+      <w:pPr>
+        <w:ind w:firstLine="432"/>
+        <w:rPr>
+          <w:i/>
+          <w:lang w:val="sr-Cyrl-RS"/>
+        </w:rPr>
+      </w:pPr>
+      <w:r>
+        <w:rPr>
+          <w:lang w:val="sr-Cyrl-RS"/>
+        </w:rPr>
+        <w:t xml:space="preserve">На излазу </w:t>
+      </w:r>
+      <w:r>
+        <w:rPr>
+          <w:lang w:val="sr-Cyrl-RS"/>
+        </w:rPr>
+        <w:t>имамо</w:t>
+      </w:r>
+      <w:r>
+        <w:rPr>
+          <w:lang w:val="sr-Cyrl-RS"/>
+        </w:rPr>
+        <w:t xml:space="preserve"> вриједности интензитета тачака добијених на основу улазних података примјеном билинеарне интерполације, гјде је максималан број тачака које се могу добити у једном такт циклусу одређен параметром. </w:t>
+      </w:r>
+      <w:r>
+        <w:rPr>
+          <w:lang w:val="sr-Cyrl-RS"/>
+        </w:rPr>
+        <w:t xml:space="preserve">Улазни и излатни портови модула, као и потребни параметри прикани су на </w:t>
+      </w:r>
+      <w:r>
+        <w:rPr>
+          <w:i/>
+          <w:lang w:val="sr-Cyrl-RS"/>
+        </w:rPr>
+        <w:t>Слици 5.3</w:t>
+      </w:r>
+      <w:r>
+        <w:rPr>
+          <w:i/>
+          <w:lang w:val="sr-Cyrl-RS"/>
+        </w:rPr>
+        <w:t>.</w:t>
+      </w:r>
+    </w:p>
+    <w:p>
+      <w:pPr>
+        <w:ind w:firstLine="432"/>
+        <w:rPr>
+          <w:lang w:val="sr-Cyrl-RS"/>
+        </w:rPr>
+      </w:pPr>
+    </w:p>
+    <w:p>
+      <w:pPr>
+        <w:keepNext/>
         <w:jc w:val="center"/>
-        <w:rPr>
-          <w:lang w:val="sr-Cyrl-RS"/>
-        </w:rPr>
       </w:pPr>
       <w:r>
         <w:rPr>
           <w:lang w:val="sr-Cyrl-RS"/>
         </w:rPr>
         <w:pict>
-          <v:shape id="_x0000_i1060" type="#_x0000_t75" style="width:365.25pt;height:174.75pt">
+          <v:shape id="_x0000_i1026" type="#_x0000_t75" style="width:340.5pt;height:162.75pt">
             <v:imagedata r:id="rId26" o:title="bilinear_flt_top"/>
           </v:shape>
         </w:pict>
@@ -12407,35 +12930,162 @@
     </w:p>
     <w:p>
       <w:pPr>
-        <w:rPr>
-          <w:lang w:val="sr-Cyrl-RS"/>
-        </w:rPr>
-      </w:pPr>
-    </w:p>
-    <w:p>
-      <w:pPr>
-        <w:rPr>
-          <w:lang w:val="sr-Cyrl-RS"/>
-        </w:rPr>
-      </w:pPr>
-    </w:p>
-    <w:p>
-      <w:pPr>
+        <w:pStyle w:val="Caption"/>
         <w:jc w:val="center"/>
         <w:rPr>
-          <w:lang w:val="sr-Cyrl-RS"/>
-        </w:rPr>
-      </w:pPr>
+          <w:sz w:val="24"/>
+          <w:lang w:val="sr-Cyrl-RS"/>
+        </w:rPr>
+      </w:pPr>
+      <w:proofErr w:type="spellStart"/>
+      <w:r>
+        <w:rPr>
+          <w:sz w:val="24"/>
+        </w:rPr>
+        <w:t>Слика</w:t>
+      </w:r>
+      <w:proofErr w:type="spellEnd"/>
+      <w:r>
+        <w:rPr>
+          <w:sz w:val="24"/>
+        </w:rPr>
+        <w:t xml:space="preserve"> </w:t>
+      </w:r>
+      <w:r>
+        <w:rPr>
+          <w:sz w:val="24"/>
+        </w:rPr>
+        <w:fldChar w:fldCharType="begin"/>
+      </w:r>
+      <w:r>
+        <w:rPr>
+          <w:sz w:val="24"/>
+        </w:rPr>
+        <w:instrText xml:space="preserve"> STYLEREF 1 \s </w:instrText>
+      </w:r>
+      <w:r>
+        <w:rPr>
+          <w:sz w:val="24"/>
+        </w:rPr>
+        <w:fldChar w:fldCharType="separate"/>
+      </w:r>
+      <w:r>
+        <w:rPr>
+          <w:noProof/>
+          <w:sz w:val="24"/>
+        </w:rPr>
+        <w:t>5</w:t>
+      </w:r>
+      <w:r>
+        <w:rPr>
+          <w:sz w:val="24"/>
+        </w:rPr>
+        <w:fldChar w:fldCharType="end"/>
+      </w:r>
+      <w:r>
+        <w:rPr>
+          <w:sz w:val="24"/>
+        </w:rPr>
+        <w:t>.</w:t>
+      </w:r>
+      <w:r>
+        <w:rPr>
+          <w:sz w:val="24"/>
+        </w:rPr>
+        <w:fldChar w:fldCharType="begin"/>
+      </w:r>
+      <w:r>
+        <w:rPr>
+          <w:sz w:val="24"/>
+        </w:rPr>
+        <w:instrText xml:space="preserve"> SEQ Слика \* ARABIC \s 1 </w:instrText>
+      </w:r>
+      <w:r>
+        <w:rPr>
+          <w:sz w:val="24"/>
+        </w:rPr>
+        <w:fldChar w:fldCharType="separate"/>
+      </w:r>
+      <w:r>
+        <w:rPr>
+          <w:noProof/>
+          <w:sz w:val="24"/>
+        </w:rPr>
+        <w:t>3</w:t>
+      </w:r>
+      <w:r>
+        <w:rPr>
+          <w:sz w:val="24"/>
+        </w:rPr>
+        <w:fldChar w:fldCharType="end"/>
+      </w:r>
+      <w:r>
+        <w:rPr>
+          <w:sz w:val="24"/>
+          <w:lang w:val="sr-Cyrl-RS"/>
+        </w:rPr>
+        <w:t>: Улази, излази и параметри модула који обавља функцију билинеарне интерполације или филтрирања</w:t>
+      </w:r>
+    </w:p>
+    <w:p/>
+    <w:p>
+      <w:pPr>
+        <w:rPr>
+          <w:lang w:val="sr-Cyrl-RS"/>
+        </w:rPr>
+      </w:pPr>
+    </w:p>
+    <w:p>
+      <w:pPr>
+        <w:jc w:val="center"/>
+        <w:rPr>
+          <w:lang w:val="sr-Cyrl-RS"/>
+        </w:rPr>
+      </w:pPr>
+    </w:p>
+    <w:p>
+      <w:pPr>
+        <w:jc w:val="center"/>
+        <w:rPr>
+          <w:lang w:val="sr-Cyrl-RS"/>
+        </w:rPr>
+      </w:pPr>
+    </w:p>
+    <w:p>
+      <w:pPr>
+        <w:jc w:val="center"/>
+        <w:rPr>
+          <w:lang w:val="sr-Cyrl-RS"/>
+        </w:rPr>
+      </w:pPr>
+    </w:p>
+    <w:p>
+      <w:pPr>
+        <w:jc w:val="center"/>
+        <w:rPr>
+          <w:lang w:val="sr-Cyrl-RS"/>
+        </w:rPr>
+      </w:pPr>
+    </w:p>
+    <w:p>
+      <w:pPr>
+        <w:jc w:val="center"/>
+        <w:rPr>
+          <w:lang w:val="sr-Cyrl-RS"/>
+        </w:rPr>
+      </w:pPr>
+      <w:bookmarkStart w:id="57" w:name="_GoBack"/>
       <w:r>
         <w:rPr>
           <w:lang w:val="sr-Cyrl-RS"/>
         </w:rPr>
         <w:pict>
-          <v:shape id="_x0000_i1061" type="#_x0000_t75" style="width:450.75pt;height:288.75pt">
+          <v:shape id="_x0000_i1027" type="#_x0000_t75" style="width:450.75pt;height:288.75pt">
             <v:imagedata r:id="rId27" o:title="bilinear_flt_arch"/>
           </v:shape>
         </w:pict>
       </w:r>
+      <w:bookmarkEnd w:id="57"/>
     </w:p>
     <w:p>
       <w:pPr>
@@ -12444,24 +13094,68 @@
           <w:lang w:val="sr-Cyrl-RS"/>
         </w:rPr>
       </w:pPr>
-      <w:r>
-        <w:rPr>
-          <w:lang w:val="sr-Cyrl-RS"/>
+    </w:p>
+    <w:p>
+      <w:pPr>
+        <w:rPr>
+          <w:lang w:val="sr-Cyrl-RS"/>
+        </w:rPr>
+      </w:pPr>
+      <w:r>
+        <w:rPr>
+          <w:noProof/>
+          <w:lang w:val="en-GB" w:eastAsia="en-GB"/>
         </w:rPr>
         <w:lastRenderedPageBreak/>
-        <w:pict>
-          <v:shape id="_x0000_i1062" type="#_x0000_t75" style="width:451.5pt;height:363pt">
-            <v:imagedata r:id="rId28" o:title="coef_calc_block_sh"/>
-          </v:shape>
-        </w:pict>
-      </w:r>
-    </w:p>
-    <w:p>
-      <w:pPr>
-        <w:rPr>
-          <w:lang w:val="sr-Cyrl-RS"/>
-        </w:rPr>
-      </w:pPr>
+        <w:drawing>
+          <wp:inline distT="0" distB="0" distL="0" distR="0">
+            <wp:extent cx="5731510" cy="4608058"/>
+            <wp:effectExtent l="0" t="0" r="2540" b="2540"/>
+            <wp:docPr id="14" name="Picture 14" descr="coef_calc_block_sh"/>
+            <wp:cNvGraphicFramePr>
+              <a:graphicFrameLocks xmlns:a="http://schemas.openxmlformats.org/drawingml/2006/main" noChangeAspect="1"/>
+            </wp:cNvGraphicFramePr>
+            <a:graphic xmlns:a="http://schemas.openxmlformats.org/drawingml/2006/main">
+              <a:graphicData uri="http://schemas.openxmlformats.org/drawingml/2006/picture">
+                <pic:pic xmlns:pic="http://schemas.openxmlformats.org/drawingml/2006/picture">
+                  <pic:nvPicPr>
+                    <pic:cNvPr id="0" name="Picture 29" descr="coef_calc_block_sh"/>
+                    <pic:cNvPicPr>
+                      <a:picLocks noChangeAspect="1" noChangeArrowheads="1"/>
+                    </pic:cNvPicPr>
+                  </pic:nvPicPr>
+                  <pic:blipFill>
+                    <a:blip r:embed="rId28">
+                      <a:extLst>
+                        <a:ext uri="{28A0092B-C50C-407E-A947-70E740481C1C}">
+                          <a14:useLocalDpi xmlns:a14="http://schemas.microsoft.com/office/drawing/2010/main" val="0"/>
+                        </a:ext>
+                      </a:extLst>
+                    </a:blip>
+                    <a:srcRect/>
+                    <a:stretch>
+                      <a:fillRect/>
+                    </a:stretch>
+                  </pic:blipFill>
+                  <pic:spPr bwMode="auto">
+                    <a:xfrm>
+                      <a:off x="0" y="0"/>
+                      <a:ext cx="5731510" cy="4608058"/>
+                    </a:xfrm>
+                    <a:prstGeom prst="rect">
+                      <a:avLst/>
+                    </a:prstGeom>
+                    <a:noFill/>
+                    <a:ln>
+                      <a:noFill/>
+                    </a:ln>
+                  </pic:spPr>
+                </pic:pic>
+              </a:graphicData>
+            </a:graphic>
+          </wp:inline>
+        </w:drawing>
+      </w:r>
     </w:p>
     <w:p>
       <w:pPr>
@@ -12521,7 +13215,7 @@
         </w:rPr>
         <w:lastRenderedPageBreak/>
         <w:pict>
-          <v:shape id="_x0000_i1063" type="#_x0000_t75" style="width:451.5pt;height:197.25pt">
+          <v:shape id="_x0000_i1029" type="#_x0000_t75" style="width:451.5pt;height:197.25pt">
             <v:imagedata r:id="rId29" o:title="coef_calc_cell"/>
           </v:shape>
         </w:pict>
@@ -12604,7 +13298,7 @@
       <w:r>
         <w:lastRenderedPageBreak/>
         <w:pict>
-          <v:shape id="_x0000_i1071" type="#_x0000_t75" style="width:450.75pt;height:303.75pt">
+          <v:shape id="_x0000_i1030" type="#_x0000_t75" style="width:450.75pt;height:303.75pt">
             <v:imagedata r:id="rId30" o:title="bilinear_flt_v1"/>
           </v:shape>
         </w:pict>
@@ -12681,7 +13375,7 @@
         </w:rPr>
         <w:lastRenderedPageBreak/>
         <w:drawing>
-          <wp:inline distT="0" distB="0" distL="0" distR="0">
+          <wp:inline distT="0" distB="0" distL="0" distR="0" wp14:anchorId="2CC8ACBB" wp14:editId="29973C28">
             <wp:extent cx="5731510" cy="6202286"/>
             <wp:effectExtent l="0" t="0" r="2540" b="8255"/>
             <wp:docPr id="23" name="Picture 23" descr="E:\video_scaler_repo\video_scaler\scaler_v2\doc\bilinear_flt\out_pix_calc_arch.png"/>
@@ -12744,7 +13438,6 @@
           <w:lang w:val="sr-Cyrl-RS"/>
         </w:rPr>
       </w:pPr>
-      <w:bookmarkStart w:id="53" w:name="_GoBack"/>
       <w:r>
         <w:rPr>
           <w:noProof/>
@@ -12752,7 +13445,7 @@
         </w:rPr>
         <w:lastRenderedPageBreak/>
         <w:drawing>
-          <wp:inline distT="0" distB="0" distL="0" distR="0">
+          <wp:inline distT="0" distB="0" distL="0" distR="0" wp14:anchorId="29EB832E" wp14:editId="4B143B79">
             <wp:extent cx="5731510" cy="4456249"/>
             <wp:effectExtent l="0" t="0" r="2540" b="1905"/>
             <wp:docPr id="25" name="Picture 25" descr="E:\video_scaler_repo\video_scaler\scaler_v2\doc\bilinear_flt\pix_calc_cell.png"/>
@@ -12800,7 +13493,6 @@
           </wp:inline>
         </w:drawing>
       </w:r>
-      <w:bookmarkEnd w:id="53"/>
     </w:p>
     <w:p>
       <w:pPr>
@@ -12996,6 +13688,7 @@
       <w:pPr>
         <w:pStyle w:val="Heading3"/>
       </w:pPr>
+      <w:bookmarkStart w:id="58" w:name="_Toc86917657"/>
       <w:r>
         <w:t xml:space="preserve">меморијска ФИФО (енг. </w:t>
       </w:r>
@@ -13022,6 +13715,7 @@
       <w:r>
         <w:t>) банка</w:t>
       </w:r>
+      <w:bookmarkEnd w:id="58"/>
     </w:p>
     <w:p>
       <w:pPr>
@@ -13042,7 +13736,7 @@
           <w:lang w:val="sr-Cyrl-RS"/>
         </w:rPr>
         <w:pict>
-          <v:shape id="_x0000_i1081" type="#_x0000_t75" style="width:451.5pt;height:276pt">
+          <v:shape id="_x0000_i1031" type="#_x0000_t75" style="width:451.5pt;height:276pt">
             <v:imagedata r:id="rId33" o:title="fifo_bank"/>
           </v:shape>
         </w:pict>
@@ -13063,12 +13757,45 @@
           <w:lang w:val="sr-Cyrl-RS"/>
         </w:rPr>
       </w:pPr>
-      <w:r>
-        <w:rPr>
-          <w:lang w:val="sr-Cyrl-RS"/>
-        </w:rPr>
+    </w:p>
+    <w:p>
+      <w:pPr>
+        <w:jc w:val="center"/>
+        <w:rPr>
+          <w:lang w:val="sr-Cyrl-RS"/>
+        </w:rPr>
+      </w:pPr>
+    </w:p>
+    <w:p>
+      <w:pPr>
+        <w:jc w:val="center"/>
+        <w:rPr>
+          <w:lang w:val="sr-Cyrl-RS"/>
+        </w:rPr>
+      </w:pPr>
+    </w:p>
+    <w:p>
+      <w:pPr>
+        <w:jc w:val="center"/>
+        <w:rPr>
+          <w:lang w:val="sr-Cyrl-RS"/>
+        </w:rPr>
+      </w:pPr>
+    </w:p>
+    <w:p>
+      <w:pPr>
+        <w:jc w:val="center"/>
+        <w:rPr>
+          <w:lang w:val="sr-Cyrl-RS"/>
+        </w:rPr>
+      </w:pPr>
+      <w:r>
+        <w:rPr>
+          <w:lang w:val="sr-Cyrl-RS"/>
+        </w:rPr>
+        <w:lastRenderedPageBreak/>
         <w:pict>
-          <v:shape id="_x0000_i1082" type="#_x0000_t75" style="width:450.75pt;height:278.25pt">
+          <v:shape id="_x0000_i1032" type="#_x0000_t75" style="width:450.75pt;height:278.25pt">
             <v:imagedata r:id="rId34" o:title="fifo_bank_arch"/>
           </v:shape>
         </w:pict>
@@ -13087,7 +13814,7 @@
           <w:lang w:val="sr-Cyrl-RS"/>
         </w:rPr>
       </w:pPr>
-      <w:bookmarkStart w:id="54" w:name="_Toc84936798"/>
+      <w:bookmarkStart w:id="59" w:name="_Toc86917658"/>
       <w:r>
         <w:rPr>
           <w:lang w:val="sr-Cyrl-RS"/>
@@ -13095,7 +13822,7 @@
         <w:lastRenderedPageBreak/>
         <w:t>ЗАКЉУЧАК</w:t>
       </w:r>
-      <w:bookmarkEnd w:id="54"/>
+      <w:bookmarkEnd w:id="59"/>
     </w:p>
     <w:p>
       <w:pPr>
@@ -13314,7 +14041,7 @@
           <w:lang w:val="sr-Cyrl-RS"/>
         </w:rPr>
       </w:pPr>
-      <w:bookmarkStart w:id="55" w:name="_Toc84936799"/>
+      <w:bookmarkStart w:id="60" w:name="_Toc86917659"/>
       <w:r>
         <w:rPr>
           <w:lang w:val="sr-Cyrl-RS"/>
@@ -13322,7 +14049,7 @@
         <w:lastRenderedPageBreak/>
         <w:t>ЛИТЕРАТУРА</w:t>
       </w:r>
-      <w:bookmarkEnd w:id="55"/>
+      <w:bookmarkEnd w:id="60"/>
     </w:p>
     <w:p>
       <w:pPr>
@@ -13482,7 +14209,7 @@
       <w:rPr>
         <w:noProof/>
       </w:rPr>
-      <w:t>24</w:t>
+      <w:t>27</w:t>
     </w:r>
     <w:r>
       <w:rPr>
@@ -14273,16 +15000,16 @@
     </w:lvl>
   </w:abstractNum>
   <w:abstractNum w:abstractNumId="7" w15:restartNumberingAfterBreak="0">
-    <w:nsid w:val="5F0C26B4"/>
+    <w:nsid w:val="51903E34"/>
     <w:multiLevelType w:val="hybridMultilevel"/>
-    <w:tmpl w:val="F97E183C"/>
+    <w:tmpl w:val="FE2ED058"/>
     <w:lvl w:ilvl="0" w:tplc="08090001">
       <w:start w:val="1"/>
       <w:numFmt w:val="bullet"/>
       <w:lvlText w:val=""/>
       <w:lvlJc w:val="left"/>
       <w:pPr>
-        <w:ind w:left="1440" w:hanging="360"/>
+        <w:ind w:left="1152" w:hanging="360"/>
       </w:pPr>
       <w:rPr>
         <w:rFonts w:ascii="Symbol" w:hAnsi="Symbol" w:hint="default"/>
@@ -14294,7 +15021,7 @@
       <w:lvlText w:val="o"/>
       <w:lvlJc w:val="left"/>
       <w:pPr>
-        <w:ind w:left="2160" w:hanging="360"/>
+        <w:ind w:left="1872" w:hanging="360"/>
       </w:pPr>
       <w:rPr>
         <w:rFonts w:ascii="Courier New" w:hAnsi="Courier New" w:cs="Courier New" w:hint="default"/>
@@ -14306,7 +15033,7 @@
       <w:lvlText w:val=""/>
       <w:lvlJc w:val="left"/>
       <w:pPr>
-        <w:ind w:left="2880" w:hanging="360"/>
+        <w:ind w:left="2592" w:hanging="360"/>
       </w:pPr>
       <w:rPr>
         <w:rFonts w:ascii="Wingdings" w:hAnsi="Wingdings" w:hint="default"/>
@@ -14318,7 +15045,7 @@
       <w:lvlText w:val=""/>
       <w:lvlJc w:val="left"/>
       <w:pPr>
-        <w:ind w:left="3600" w:hanging="360"/>
+        <w:ind w:left="3312" w:hanging="360"/>
       </w:pPr>
       <w:rPr>
         <w:rFonts w:ascii="Symbol" w:hAnsi="Symbol" w:hint="default"/>
@@ -14330,7 +15057,7 @@
       <w:lvlText w:val="o"/>
       <w:lvlJc w:val="left"/>
       <w:pPr>
-        <w:ind w:left="4320" w:hanging="360"/>
+        <w:ind w:left="4032" w:hanging="360"/>
       </w:pPr>
       <w:rPr>
         <w:rFonts w:ascii="Courier New" w:hAnsi="Courier New" w:cs="Courier New" w:hint="default"/>
@@ -14342,7 +15069,7 @@
       <w:lvlText w:val=""/>
       <w:lvlJc w:val="left"/>
       <w:pPr>
-        <w:ind w:left="5040" w:hanging="360"/>
+        <w:ind w:left="4752" w:hanging="360"/>
       </w:pPr>
       <w:rPr>
         <w:rFonts w:ascii="Wingdings" w:hAnsi="Wingdings" w:hint="default"/>
@@ -14354,7 +15081,7 @@
       <w:lvlText w:val=""/>
       <w:lvlJc w:val="left"/>
       <w:pPr>
-        <w:ind w:left="5760" w:hanging="360"/>
+        <w:ind w:left="5472" w:hanging="360"/>
       </w:pPr>
       <w:rPr>
         <w:rFonts w:ascii="Symbol" w:hAnsi="Symbol" w:hint="default"/>
@@ -14366,7 +15093,7 @@
       <w:lvlText w:val="o"/>
       <w:lvlJc w:val="left"/>
       <w:pPr>
-        <w:ind w:left="6480" w:hanging="360"/>
+        <w:ind w:left="6192" w:hanging="360"/>
       </w:pPr>
       <w:rPr>
         <w:rFonts w:ascii="Courier New" w:hAnsi="Courier New" w:cs="Courier New" w:hint="default"/>
@@ -14378,7 +15105,7 @@
       <w:lvlText w:val=""/>
       <w:lvlJc w:val="left"/>
       <w:pPr>
-        <w:ind w:left="7200" w:hanging="360"/>
+        <w:ind w:left="6912" w:hanging="360"/>
       </w:pPr>
       <w:rPr>
         <w:rFonts w:ascii="Wingdings" w:hAnsi="Wingdings" w:hint="default"/>
@@ -14386,16 +15113,16 @@
     </w:lvl>
   </w:abstractNum>
   <w:abstractNum w:abstractNumId="8" w15:restartNumberingAfterBreak="0">
-    <w:nsid w:val="62C44140"/>
+    <w:nsid w:val="5F0C26B4"/>
     <w:multiLevelType w:val="hybridMultilevel"/>
-    <w:tmpl w:val="FD1E10D0"/>
+    <w:tmpl w:val="F97E183C"/>
     <w:lvl w:ilvl="0" w:tplc="08090001">
       <w:start w:val="1"/>
       <w:numFmt w:val="bullet"/>
       <w:lvlText w:val=""/>
       <w:lvlJc w:val="left"/>
       <w:pPr>
-        <w:ind w:left="720" w:hanging="360"/>
+        <w:ind w:left="1440" w:hanging="360"/>
       </w:pPr>
       <w:rPr>
         <w:rFonts w:ascii="Symbol" w:hAnsi="Symbol" w:hint="default"/>
@@ -14407,7 +15134,7 @@
       <w:lvlText w:val="o"/>
       <w:lvlJc w:val="left"/>
       <w:pPr>
-        <w:ind w:left="1440" w:hanging="360"/>
+        <w:ind w:left="2160" w:hanging="360"/>
       </w:pPr>
       <w:rPr>
         <w:rFonts w:ascii="Courier New" w:hAnsi="Courier New" w:cs="Courier New" w:hint="default"/>
@@ -14419,7 +15146,7 @@
       <w:lvlText w:val=""/>
       <w:lvlJc w:val="left"/>
       <w:pPr>
-        <w:ind w:left="2160" w:hanging="360"/>
+        <w:ind w:left="2880" w:hanging="360"/>
       </w:pPr>
       <w:rPr>
         <w:rFonts w:ascii="Wingdings" w:hAnsi="Wingdings" w:hint="default"/>
@@ -14431,7 +15158,7 @@
       <w:lvlText w:val=""/>
       <w:lvlJc w:val="left"/>
       <w:pPr>
-        <w:ind w:left="2880" w:hanging="360"/>
+        <w:ind w:left="3600" w:hanging="360"/>
       </w:pPr>
       <w:rPr>
         <w:rFonts w:ascii="Symbol" w:hAnsi="Symbol" w:hint="default"/>
@@ -14443,7 +15170,7 @@
       <w:lvlText w:val="o"/>
       <w:lvlJc w:val="left"/>
       <w:pPr>
-        <w:ind w:left="3600" w:hanging="360"/>
+        <w:ind w:left="4320" w:hanging="360"/>
       </w:pPr>
       <w:rPr>
         <w:rFonts w:ascii="Courier New" w:hAnsi="Courier New" w:cs="Courier New" w:hint="default"/>
@@ -14455,7 +15182,7 @@
       <w:lvlText w:val=""/>
       <w:lvlJc w:val="left"/>
       <w:pPr>
-        <w:ind w:left="4320" w:hanging="360"/>
+        <w:ind w:left="5040" w:hanging="360"/>
       </w:pPr>
       <w:rPr>
         <w:rFonts w:ascii="Wingdings" w:hAnsi="Wingdings" w:hint="default"/>
@@ -14467,7 +15194,7 @@
       <w:lvlText w:val=""/>
       <w:lvlJc w:val="left"/>
       <w:pPr>
-        <w:ind w:left="5040" w:hanging="360"/>
+        <w:ind w:left="5760" w:hanging="360"/>
       </w:pPr>
       <w:rPr>
         <w:rFonts w:ascii="Symbol" w:hAnsi="Symbol" w:hint="default"/>
@@ -14479,7 +15206,7 @@
       <w:lvlText w:val="o"/>
       <w:lvlJc w:val="left"/>
       <w:pPr>
-        <w:ind w:left="5760" w:hanging="360"/>
+        <w:ind w:left="6480" w:hanging="360"/>
       </w:pPr>
       <w:rPr>
         <w:rFonts w:ascii="Courier New" w:hAnsi="Courier New" w:cs="Courier New" w:hint="default"/>
@@ -14491,7 +15218,7 @@
       <w:lvlText w:val=""/>
       <w:lvlJc w:val="left"/>
       <w:pPr>
-        <w:ind w:left="6480" w:hanging="360"/>
+        <w:ind w:left="7200" w:hanging="360"/>
       </w:pPr>
       <w:rPr>
         <w:rFonts w:ascii="Wingdings" w:hAnsi="Wingdings" w:hint="default"/>
@@ -14499,95 +15226,9 @@
     </w:lvl>
   </w:abstractNum>
   <w:abstractNum w:abstractNumId="9" w15:restartNumberingAfterBreak="0">
-    <w:nsid w:val="653B530B"/>
+    <w:nsid w:val="62C44140"/>
     <w:multiLevelType w:val="hybridMultilevel"/>
-    <w:tmpl w:val="46105406"/>
-    <w:lvl w:ilvl="0" w:tplc="0409000F">
-      <w:start w:val="1"/>
-      <w:numFmt w:val="decimal"/>
-      <w:lvlText w:val="%1."/>
-      <w:lvlJc w:val="left"/>
-      <w:pPr>
-        <w:ind w:left="720" w:hanging="360"/>
-      </w:pPr>
-    </w:lvl>
-    <w:lvl w:ilvl="1" w:tplc="04090019" w:tentative="1">
-      <w:start w:val="1"/>
-      <w:numFmt w:val="lowerLetter"/>
-      <w:lvlText w:val="%2."/>
-      <w:lvlJc w:val="left"/>
-      <w:pPr>
-        <w:ind w:left="1440" w:hanging="360"/>
-      </w:pPr>
-    </w:lvl>
-    <w:lvl w:ilvl="2" w:tplc="0409001B" w:tentative="1">
-      <w:start w:val="1"/>
-      <w:numFmt w:val="lowerRoman"/>
-      <w:lvlText w:val="%3."/>
-      <w:lvlJc w:val="right"/>
-      <w:pPr>
-        <w:ind w:left="2160" w:hanging="180"/>
-      </w:pPr>
-    </w:lvl>
-    <w:lvl w:ilvl="3" w:tplc="0409000F" w:tentative="1">
-      <w:start w:val="1"/>
-      <w:numFmt w:val="decimal"/>
-      <w:lvlText w:val="%4."/>
-      <w:lvlJc w:val="left"/>
-      <w:pPr>
-        <w:ind w:left="2880" w:hanging="360"/>
-      </w:pPr>
-    </w:lvl>
-    <w:lvl w:ilvl="4" w:tplc="04090019" w:tentative="1">
-      <w:start w:val="1"/>
-      <w:numFmt w:val="lowerLetter"/>
-      <w:lvlText w:val="%5."/>
-      <w:lvlJc w:val="left"/>
-      <w:pPr>
-        <w:ind w:left="3600" w:hanging="360"/>
-      </w:pPr>
-    </w:lvl>
-    <w:lvl w:ilvl="5" w:tplc="0409001B" w:tentative="1">
-      <w:start w:val="1"/>
-      <w:numFmt w:val="lowerRoman"/>
-      <w:lvlText w:val="%6."/>
-      <w:lvlJc w:val="right"/>
-      <w:pPr>
-        <w:ind w:left="4320" w:hanging="180"/>
-      </w:pPr>
-    </w:lvl>
-    <w:lvl w:ilvl="6" w:tplc="0409000F" w:tentative="1">
-      <w:start w:val="1"/>
-      <w:numFmt w:val="decimal"/>
-      <w:lvlText w:val="%7."/>
-      <w:lvlJc w:val="left"/>
-      <w:pPr>
-        <w:ind w:left="5040" w:hanging="360"/>
-      </w:pPr>
-    </w:lvl>
-    <w:lvl w:ilvl="7" w:tplc="04090019" w:tentative="1">
-      <w:start w:val="1"/>
-      <w:numFmt w:val="lowerLetter"/>
-      <w:lvlText w:val="%8."/>
-      <w:lvlJc w:val="left"/>
-      <w:pPr>
-        <w:ind w:left="5760" w:hanging="360"/>
-      </w:pPr>
-    </w:lvl>
-    <w:lvl w:ilvl="8" w:tplc="0409001B" w:tentative="1">
-      <w:start w:val="1"/>
-      <w:numFmt w:val="lowerRoman"/>
-      <w:lvlText w:val="%9."/>
-      <w:lvlJc w:val="right"/>
-      <w:pPr>
-        <w:ind w:left="6480" w:hanging="180"/>
-      </w:pPr>
-    </w:lvl>
-  </w:abstractNum>
-  <w:abstractNum w:abstractNumId="10" w15:restartNumberingAfterBreak="0">
-    <w:nsid w:val="7008409B"/>
-    <w:multiLevelType w:val="hybridMultilevel"/>
-    <w:tmpl w:val="9B9E63B2"/>
+    <w:tmpl w:val="FD1E10D0"/>
     <w:lvl w:ilvl="0" w:tplc="08090001">
       <w:start w:val="1"/>
       <w:numFmt w:val="bullet"/>
@@ -14697,17 +15338,103 @@
       </w:rPr>
     </w:lvl>
   </w:abstractNum>
+  <w:abstractNum w:abstractNumId="10" w15:restartNumberingAfterBreak="0">
+    <w:nsid w:val="653B530B"/>
+    <w:multiLevelType w:val="hybridMultilevel"/>
+    <w:tmpl w:val="46105406"/>
+    <w:lvl w:ilvl="0" w:tplc="0409000F">
+      <w:start w:val="1"/>
+      <w:numFmt w:val="decimal"/>
+      <w:lvlText w:val="%1."/>
+      <w:lvlJc w:val="left"/>
+      <w:pPr>
+        <w:ind w:left="720" w:hanging="360"/>
+      </w:pPr>
+    </w:lvl>
+    <w:lvl w:ilvl="1" w:tplc="04090019" w:tentative="1">
+      <w:start w:val="1"/>
+      <w:numFmt w:val="lowerLetter"/>
+      <w:lvlText w:val="%2."/>
+      <w:lvlJc w:val="left"/>
+      <w:pPr>
+        <w:ind w:left="1440" w:hanging="360"/>
+      </w:pPr>
+    </w:lvl>
+    <w:lvl w:ilvl="2" w:tplc="0409001B" w:tentative="1">
+      <w:start w:val="1"/>
+      <w:numFmt w:val="lowerRoman"/>
+      <w:lvlText w:val="%3."/>
+      <w:lvlJc w:val="right"/>
+      <w:pPr>
+        <w:ind w:left="2160" w:hanging="180"/>
+      </w:pPr>
+    </w:lvl>
+    <w:lvl w:ilvl="3" w:tplc="0409000F" w:tentative="1">
+      <w:start w:val="1"/>
+      <w:numFmt w:val="decimal"/>
+      <w:lvlText w:val="%4."/>
+      <w:lvlJc w:val="left"/>
+      <w:pPr>
+        <w:ind w:left="2880" w:hanging="360"/>
+      </w:pPr>
+    </w:lvl>
+    <w:lvl w:ilvl="4" w:tplc="04090019" w:tentative="1">
+      <w:start w:val="1"/>
+      <w:numFmt w:val="lowerLetter"/>
+      <w:lvlText w:val="%5."/>
+      <w:lvlJc w:val="left"/>
+      <w:pPr>
+        <w:ind w:left="3600" w:hanging="360"/>
+      </w:pPr>
+    </w:lvl>
+    <w:lvl w:ilvl="5" w:tplc="0409001B" w:tentative="1">
+      <w:start w:val="1"/>
+      <w:numFmt w:val="lowerRoman"/>
+      <w:lvlText w:val="%6."/>
+      <w:lvlJc w:val="right"/>
+      <w:pPr>
+        <w:ind w:left="4320" w:hanging="180"/>
+      </w:pPr>
+    </w:lvl>
+    <w:lvl w:ilvl="6" w:tplc="0409000F" w:tentative="1">
+      <w:start w:val="1"/>
+      <w:numFmt w:val="decimal"/>
+      <w:lvlText w:val="%7."/>
+      <w:lvlJc w:val="left"/>
+      <w:pPr>
+        <w:ind w:left="5040" w:hanging="360"/>
+      </w:pPr>
+    </w:lvl>
+    <w:lvl w:ilvl="7" w:tplc="04090019" w:tentative="1">
+      <w:start w:val="1"/>
+      <w:numFmt w:val="lowerLetter"/>
+      <w:lvlText w:val="%8."/>
+      <w:lvlJc w:val="left"/>
+      <w:pPr>
+        <w:ind w:left="5760" w:hanging="360"/>
+      </w:pPr>
+    </w:lvl>
+    <w:lvl w:ilvl="8" w:tplc="0409001B" w:tentative="1">
+      <w:start w:val="1"/>
+      <w:numFmt w:val="lowerRoman"/>
+      <w:lvlText w:val="%9."/>
+      <w:lvlJc w:val="right"/>
+      <w:pPr>
+        <w:ind w:left="6480" w:hanging="180"/>
+      </w:pPr>
+    </w:lvl>
+  </w:abstractNum>
   <w:abstractNum w:abstractNumId="11" w15:restartNumberingAfterBreak="0">
-    <w:nsid w:val="75D0728E"/>
+    <w:nsid w:val="7008409B"/>
     <w:multiLevelType w:val="hybridMultilevel"/>
-    <w:tmpl w:val="15EEA380"/>
+    <w:tmpl w:val="9B9E63B2"/>
     <w:lvl w:ilvl="0" w:tplc="08090001">
       <w:start w:val="1"/>
       <w:numFmt w:val="bullet"/>
       <w:lvlText w:val=""/>
       <w:lvlJc w:val="left"/>
       <w:pPr>
-        <w:ind w:left="1080" w:hanging="360"/>
+        <w:ind w:left="720" w:hanging="360"/>
       </w:pPr>
       <w:rPr>
         <w:rFonts w:ascii="Symbol" w:hAnsi="Symbol" w:hint="default"/>
@@ -14719,7 +15446,7 @@
       <w:lvlText w:val="o"/>
       <w:lvlJc w:val="left"/>
       <w:pPr>
-        <w:ind w:left="1800" w:hanging="360"/>
+        <w:ind w:left="1440" w:hanging="360"/>
       </w:pPr>
       <w:rPr>
         <w:rFonts w:ascii="Courier New" w:hAnsi="Courier New" w:cs="Courier New" w:hint="default"/>
@@ -14731,7 +15458,7 @@
       <w:lvlText w:val=""/>
       <w:lvlJc w:val="left"/>
       <w:pPr>
-        <w:ind w:left="2520" w:hanging="360"/>
+        <w:ind w:left="2160" w:hanging="360"/>
       </w:pPr>
       <w:rPr>
         <w:rFonts w:ascii="Wingdings" w:hAnsi="Wingdings" w:hint="default"/>
@@ -14743,7 +15470,7 @@
       <w:lvlText w:val=""/>
       <w:lvlJc w:val="left"/>
       <w:pPr>
-        <w:ind w:left="3240" w:hanging="360"/>
+        <w:ind w:left="2880" w:hanging="360"/>
       </w:pPr>
       <w:rPr>
         <w:rFonts w:ascii="Symbol" w:hAnsi="Symbol" w:hint="default"/>
@@ -14755,7 +15482,7 @@
       <w:lvlText w:val="o"/>
       <w:lvlJc w:val="left"/>
       <w:pPr>
-        <w:ind w:left="3960" w:hanging="360"/>
+        <w:ind w:left="3600" w:hanging="360"/>
       </w:pPr>
       <w:rPr>
         <w:rFonts w:ascii="Courier New" w:hAnsi="Courier New" w:cs="Courier New" w:hint="default"/>
@@ -14767,7 +15494,7 @@
       <w:lvlText w:val=""/>
       <w:lvlJc w:val="left"/>
       <w:pPr>
-        <w:ind w:left="4680" w:hanging="360"/>
+        <w:ind w:left="4320" w:hanging="360"/>
       </w:pPr>
       <w:rPr>
         <w:rFonts w:ascii="Wingdings" w:hAnsi="Wingdings" w:hint="default"/>
@@ -14779,7 +15506,7 @@
       <w:lvlText w:val=""/>
       <w:lvlJc w:val="left"/>
       <w:pPr>
-        <w:ind w:left="5400" w:hanging="360"/>
+        <w:ind w:left="5040" w:hanging="360"/>
       </w:pPr>
       <w:rPr>
         <w:rFonts w:ascii="Symbol" w:hAnsi="Symbol" w:hint="default"/>
@@ -14791,7 +15518,7 @@
       <w:lvlText w:val="o"/>
       <w:lvlJc w:val="left"/>
       <w:pPr>
-        <w:ind w:left="6120" w:hanging="360"/>
+        <w:ind w:left="5760" w:hanging="360"/>
       </w:pPr>
       <w:rPr>
         <w:rFonts w:ascii="Courier New" w:hAnsi="Courier New" w:cs="Courier New" w:hint="default"/>
@@ -14803,7 +15530,7 @@
       <w:lvlText w:val=""/>
       <w:lvlJc w:val="left"/>
       <w:pPr>
-        <w:ind w:left="6840" w:hanging="360"/>
+        <w:ind w:left="6480" w:hanging="360"/>
       </w:pPr>
       <w:rPr>
         <w:rFonts w:ascii="Wingdings" w:hAnsi="Wingdings" w:hint="default"/>
@@ -14811,16 +15538,16 @@
     </w:lvl>
   </w:abstractNum>
   <w:abstractNum w:abstractNumId="12" w15:restartNumberingAfterBreak="0">
-    <w:nsid w:val="7B967245"/>
+    <w:nsid w:val="75D0728E"/>
     <w:multiLevelType w:val="hybridMultilevel"/>
-    <w:tmpl w:val="39B896D4"/>
+    <w:tmpl w:val="15EEA380"/>
     <w:lvl w:ilvl="0" w:tplc="08090001">
       <w:start w:val="1"/>
       <w:numFmt w:val="bullet"/>
       <w:lvlText w:val=""/>
       <w:lvlJc w:val="left"/>
       <w:pPr>
-        <w:ind w:left="720" w:hanging="360"/>
+        <w:ind w:left="1080" w:hanging="360"/>
       </w:pPr>
       <w:rPr>
         <w:rFonts w:ascii="Symbol" w:hAnsi="Symbol" w:hint="default"/>
@@ -14832,7 +15559,7 @@
       <w:lvlText w:val="o"/>
       <w:lvlJc w:val="left"/>
       <w:pPr>
-        <w:ind w:left="1440" w:hanging="360"/>
+        <w:ind w:left="1800" w:hanging="360"/>
       </w:pPr>
       <w:rPr>
         <w:rFonts w:ascii="Courier New" w:hAnsi="Courier New" w:cs="Courier New" w:hint="default"/>
@@ -14844,7 +15571,7 @@
       <w:lvlText w:val=""/>
       <w:lvlJc w:val="left"/>
       <w:pPr>
-        <w:ind w:left="2160" w:hanging="360"/>
+        <w:ind w:left="2520" w:hanging="360"/>
       </w:pPr>
       <w:rPr>
         <w:rFonts w:ascii="Wingdings" w:hAnsi="Wingdings" w:hint="default"/>
@@ -14856,7 +15583,7 @@
       <w:lvlText w:val=""/>
       <w:lvlJc w:val="left"/>
       <w:pPr>
-        <w:ind w:left="2880" w:hanging="360"/>
+        <w:ind w:left="3240" w:hanging="360"/>
       </w:pPr>
       <w:rPr>
         <w:rFonts w:ascii="Symbol" w:hAnsi="Symbol" w:hint="default"/>
@@ -14868,7 +15595,7 @@
       <w:lvlText w:val="o"/>
       <w:lvlJc w:val="left"/>
       <w:pPr>
-        <w:ind w:left="3600" w:hanging="360"/>
+        <w:ind w:left="3960" w:hanging="360"/>
       </w:pPr>
       <w:rPr>
         <w:rFonts w:ascii="Courier New" w:hAnsi="Courier New" w:cs="Courier New" w:hint="default"/>
@@ -14880,7 +15607,7 @@
       <w:lvlText w:val=""/>
       <w:lvlJc w:val="left"/>
       <w:pPr>
-        <w:ind w:left="4320" w:hanging="360"/>
+        <w:ind w:left="4680" w:hanging="360"/>
       </w:pPr>
       <w:rPr>
         <w:rFonts w:ascii="Wingdings" w:hAnsi="Wingdings" w:hint="default"/>
@@ -14892,7 +15619,7 @@
       <w:lvlText w:val=""/>
       <w:lvlJc w:val="left"/>
       <w:pPr>
-        <w:ind w:left="5040" w:hanging="360"/>
+        <w:ind w:left="5400" w:hanging="360"/>
       </w:pPr>
       <w:rPr>
         <w:rFonts w:ascii="Symbol" w:hAnsi="Symbol" w:hint="default"/>
@@ -14904,7 +15631,7 @@
       <w:lvlText w:val="o"/>
       <w:lvlJc w:val="left"/>
       <w:pPr>
-        <w:ind w:left="5760" w:hanging="360"/>
+        <w:ind w:left="6120" w:hanging="360"/>
       </w:pPr>
       <w:rPr>
         <w:rFonts w:ascii="Courier New" w:hAnsi="Courier New" w:cs="Courier New" w:hint="default"/>
@@ -14916,6 +15643,119 @@
       <w:lvlText w:val=""/>
       <w:lvlJc w:val="left"/>
       <w:pPr>
+        <w:ind w:left="6840" w:hanging="360"/>
+      </w:pPr>
+      <w:rPr>
+        <w:rFonts w:ascii="Wingdings" w:hAnsi="Wingdings" w:hint="default"/>
+      </w:rPr>
+    </w:lvl>
+  </w:abstractNum>
+  <w:abstractNum w:abstractNumId="13" w15:restartNumberingAfterBreak="0">
+    <w:nsid w:val="7B967245"/>
+    <w:multiLevelType w:val="hybridMultilevel"/>
+    <w:tmpl w:val="39B896D4"/>
+    <w:lvl w:ilvl="0" w:tplc="08090001">
+      <w:start w:val="1"/>
+      <w:numFmt w:val="bullet"/>
+      <w:lvlText w:val=""/>
+      <w:lvlJc w:val="left"/>
+      <w:pPr>
+        <w:ind w:left="720" w:hanging="360"/>
+      </w:pPr>
+      <w:rPr>
+        <w:rFonts w:ascii="Symbol" w:hAnsi="Symbol" w:hint="default"/>
+      </w:rPr>
+    </w:lvl>
+    <w:lvl w:ilvl="1" w:tplc="08090003" w:tentative="1">
+      <w:start w:val="1"/>
+      <w:numFmt w:val="bullet"/>
+      <w:lvlText w:val="o"/>
+      <w:lvlJc w:val="left"/>
+      <w:pPr>
+        <w:ind w:left="1440" w:hanging="360"/>
+      </w:pPr>
+      <w:rPr>
+        <w:rFonts w:ascii="Courier New" w:hAnsi="Courier New" w:cs="Courier New" w:hint="default"/>
+      </w:rPr>
+    </w:lvl>
+    <w:lvl w:ilvl="2" w:tplc="08090005" w:tentative="1">
+      <w:start w:val="1"/>
+      <w:numFmt w:val="bullet"/>
+      <w:lvlText w:val=""/>
+      <w:lvlJc w:val="left"/>
+      <w:pPr>
+        <w:ind w:left="2160" w:hanging="360"/>
+      </w:pPr>
+      <w:rPr>
+        <w:rFonts w:ascii="Wingdings" w:hAnsi="Wingdings" w:hint="default"/>
+      </w:rPr>
+    </w:lvl>
+    <w:lvl w:ilvl="3" w:tplc="08090001" w:tentative="1">
+      <w:start w:val="1"/>
+      <w:numFmt w:val="bullet"/>
+      <w:lvlText w:val=""/>
+      <w:lvlJc w:val="left"/>
+      <w:pPr>
+        <w:ind w:left="2880" w:hanging="360"/>
+      </w:pPr>
+      <w:rPr>
+        <w:rFonts w:ascii="Symbol" w:hAnsi="Symbol" w:hint="default"/>
+      </w:rPr>
+    </w:lvl>
+    <w:lvl w:ilvl="4" w:tplc="08090003" w:tentative="1">
+      <w:start w:val="1"/>
+      <w:numFmt w:val="bullet"/>
+      <w:lvlText w:val="o"/>
+      <w:lvlJc w:val="left"/>
+      <w:pPr>
+        <w:ind w:left="3600" w:hanging="360"/>
+      </w:pPr>
+      <w:rPr>
+        <w:rFonts w:ascii="Courier New" w:hAnsi="Courier New" w:cs="Courier New" w:hint="default"/>
+      </w:rPr>
+    </w:lvl>
+    <w:lvl w:ilvl="5" w:tplc="08090005" w:tentative="1">
+      <w:start w:val="1"/>
+      <w:numFmt w:val="bullet"/>
+      <w:lvlText w:val=""/>
+      <w:lvlJc w:val="left"/>
+      <w:pPr>
+        <w:ind w:left="4320" w:hanging="360"/>
+      </w:pPr>
+      <w:rPr>
+        <w:rFonts w:ascii="Wingdings" w:hAnsi="Wingdings" w:hint="default"/>
+      </w:rPr>
+    </w:lvl>
+    <w:lvl w:ilvl="6" w:tplc="08090001" w:tentative="1">
+      <w:start w:val="1"/>
+      <w:numFmt w:val="bullet"/>
+      <w:lvlText w:val=""/>
+      <w:lvlJc w:val="left"/>
+      <w:pPr>
+        <w:ind w:left="5040" w:hanging="360"/>
+      </w:pPr>
+      <w:rPr>
+        <w:rFonts w:ascii="Symbol" w:hAnsi="Symbol" w:hint="default"/>
+      </w:rPr>
+    </w:lvl>
+    <w:lvl w:ilvl="7" w:tplc="08090003" w:tentative="1">
+      <w:start w:val="1"/>
+      <w:numFmt w:val="bullet"/>
+      <w:lvlText w:val="o"/>
+      <w:lvlJc w:val="left"/>
+      <w:pPr>
+        <w:ind w:left="5760" w:hanging="360"/>
+      </w:pPr>
+      <w:rPr>
+        <w:rFonts w:ascii="Courier New" w:hAnsi="Courier New" w:cs="Courier New" w:hint="default"/>
+      </w:rPr>
+    </w:lvl>
+    <w:lvl w:ilvl="8" w:tplc="08090005" w:tentative="1">
+      <w:start w:val="1"/>
+      <w:numFmt w:val="bullet"/>
+      <w:lvlText w:val=""/>
+      <w:lvlJc w:val="left"/>
+      <w:pPr>
         <w:ind w:left="6480" w:hanging="360"/>
       </w:pPr>
       <w:rPr>
@@ -14927,7 +15767,7 @@
     <w:abstractNumId w:val="0"/>
   </w:num>
   <w:num w:numId="2">
-    <w:abstractNumId w:val="9"/>
+    <w:abstractNumId w:val="10"/>
   </w:num>
   <w:num w:numId="3">
     <w:abstractNumId w:val="1"/>
@@ -14936,7 +15776,7 @@
     <w:abstractNumId w:val="5"/>
   </w:num>
   <w:num w:numId="5">
-    <w:abstractNumId w:val="7"/>
+    <w:abstractNumId w:val="8"/>
   </w:num>
   <w:num w:numId="6">
     <w:abstractNumId w:val="2"/>
@@ -14945,22 +15785,25 @@
     <w:abstractNumId w:val="4"/>
   </w:num>
   <w:num w:numId="8">
-    <w:abstractNumId w:val="12"/>
+    <w:abstractNumId w:val="13"/>
   </w:num>
   <w:num w:numId="9">
     <w:abstractNumId w:val="3"/>
   </w:num>
   <w:num w:numId="10">
-    <w:abstractNumId w:val="11"/>
+    <w:abstractNumId w:val="12"/>
   </w:num>
   <w:num w:numId="11">
     <w:abstractNumId w:val="6"/>
   </w:num>
   <w:num w:numId="12">
-    <w:abstractNumId w:val="8"/>
+    <w:abstractNumId w:val="9"/>
   </w:num>
   <w:num w:numId="13">
-    <w:abstractNumId w:val="10"/>
+    <w:abstractNumId w:val="11"/>
+  </w:num>
+  <w:num w:numId="14">
+    <w:abstractNumId w:val="7"/>
   </w:num>
 </w:numbering>
 </file>
@@ -16220,7 +17063,7 @@
 </file>
 
 <file path=customXml/itemProps1.xml><?xml version="1.0" encoding="utf-8"?>
-<ds:datastoreItem xmlns:ds="http://schemas.openxmlformats.org/officeDocument/2006/customXml" ds:itemID="{5098D467-B41A-4BA0-8C6F-56C0D6815757}">
+<ds:datastoreItem xmlns:ds="http://schemas.openxmlformats.org/officeDocument/2006/customXml" ds:itemID="{1CC65753-EE16-4E02-BF6A-ADD6A4529C7F}">
   <ds:schemaRefs>
     <ds:schemaRef ds:uri="http://schemas.openxmlformats.org/officeDocument/2006/bibliography"/>
   </ds:schemaRefs>

</xml_diff>